<commit_message>
docs: update recent deployment report
</commit_message>
<xml_diff>
--- a/docs/reports/recent_frontend_backend_modelscope_report_20260612.docx
+++ b/docs/reports/recent_frontend_backend_modelscope_report_20260612.docx
@@ -36,7 +36,7 @@
         </w:p>
       </w:sdtContent>
     </w:sdt>
-    <w:bookmarkStart w:id="63" w:name="手语学习宇宙近期前后端更新与-modelscope-部署报告"/>
+    <w:bookmarkStart w:id="65" w:name="手语学习宇宙近期前后端更新与-modelscope-部署报告"/>
     <w:p>
       <w:pPr>
         <w:pStyle w:val="Heading1"/>
@@ -154,7 +154,7 @@
         <w:br/>
       </w:r>
       <w:r>
-        <w:t xml:space="preserve">前端挑战页已经接入摄像头采集、Web Holistic 预加载、浏览器端关键点提取、自动评分、低分建议、采样参数控制和结果诊断展示。默认采集参数已调整为</w:t>
+        <w:t xml:space="preserve">前端挑战页已经接入摄像头采集、Web Holistic 预加载、浏览器端关键点提取、自动评分、低分建议、采样参数控制、结果诊断展示和 Web Holistic 失败重试。默认采集参数已调整为</w:t>
       </w:r>
       <w:r>
         <w:t xml:space="preserve"> </w:t>
@@ -289,7 +289,7 @@
         <w:br/>
       </w:r>
       <w:r>
-        <w:t xml:space="preserve">已保留一个完整 Docker 空间用于验证服务端 Holistic worker，同时新增一个 lite Docker 空间用于浏览器 Web Holistic 路线。当前推荐线上演示使用 lite 空间：前端只上传关键点，后端只做模板 DTW/semantic prototype scoring，不再在服务器运行 MediaPipe Holistic。</w:t>
+        <w:t xml:space="preserve">已保留一个完整 Docker 空间用于验证服务端 Holistic worker，同时新增一个 lite Docker 空间用于浏览器 Web Holistic 路线。当前推荐线上演示使用 lite 空间，且前端默认评分 API 已指向该 lite 空间：前端只上传关键点，后端只做模板 DTW/semantic prototype scoring，不再在服务器运行 MediaPipe Holistic。</w:t>
       </w:r>
     </w:p>
     <w:p>
@@ -322,6 +322,42 @@
       </w:r>
       <w:r>
         <w:t xml:space="preserve">。</w:t>
+      </w:r>
+    </w:p>
+    <w:p>
+      <w:pPr>
+        <w:numPr>
+          <w:ilvl w:val="0"/>
+          <w:numId w:val="1002"/>
+        </w:numPr>
+        <w:pStyle w:val="Compact"/>
+      </w:pPr>
+      <w:r>
+        <w:t xml:space="preserve">GitHub Pages 前端默认评分 API 已设置为</w:t>
+      </w:r>
+      <w:r>
+        <w:t xml:space="preserve"> </w:t>
+      </w:r>
+      <w:r>
+        <w:rPr>
+          <w:rStyle w:val="VerbatimChar"/>
+        </w:rPr>
+        <w:t xml:space="preserve">https://scottwyc-sign-language-universe-lite.ms.show</w:t>
+      </w:r>
+      <w:r>
+        <w:t xml:space="preserve">，普通用户不再需要手动填写。</w:t>
+      </w:r>
+    </w:p>
+    <w:p>
+      <w:pPr>
+        <w:numPr>
+          <w:ilvl w:val="0"/>
+          <w:numId w:val="1002"/>
+        </w:numPr>
+        <w:pStyle w:val="Compact"/>
+      </w:pPr>
+      <w:r>
+        <w:t xml:space="preserve">Web Holistic 加载失败时，页面会显示“重新加载 Web Holistic”按钮，允许用户在当前页面生命周期内手动重试。</w:t>
       </w:r>
     </w:p>
     <w:p>
@@ -1069,28 +1105,172 @@
           </w:p>
         </w:tc>
       </w:tr>
+      <w:tr>
+        <w:tc>
+          <w:tcPr/>
+          <w:p>
+            <w:pPr>
+              <w:pStyle w:val="Compact"/>
+              <w:jc w:val="right"/>
+            </w:pPr>
+            <w:r>
+              <w:t xml:space="preserve">#21</w:t>
+            </w:r>
+          </w:p>
+        </w:tc>
+        <w:tc>
+          <w:tcPr/>
+          <w:p>
+            <w:pPr>
+              <w:pStyle w:val="Compact"/>
+              <w:jc w:val="left"/>
+            </w:pPr>
+            <w:r>
+              <w:rPr>
+                <w:rStyle w:val="VerbatimChar"/>
+              </w:rPr>
+              <w:t xml:space="preserve">14c0831</w:t>
+            </w:r>
+          </w:p>
+        </w:tc>
+        <w:tc>
+          <w:tcPr/>
+          <w:p>
+            <w:pPr>
+              <w:pStyle w:val="Compact"/>
+              <w:jc w:val="left"/>
+            </w:pPr>
+            <w:r>
+              <w:t xml:space="preserve">新增近期前后端更新与 ModelScope 部署报告</w:t>
+            </w:r>
+          </w:p>
+        </w:tc>
+        <w:tc>
+          <w:tcPr/>
+          <w:p>
+            <w:pPr>
+              <w:pStyle w:val="Compact"/>
+              <w:jc w:val="left"/>
+            </w:pPr>
+            <w:r>
+              <w:t xml:space="preserve">形成 Markdown 与 Word 版阶段报告</w:t>
+            </w:r>
+          </w:p>
+        </w:tc>
+      </w:tr>
+      <w:tr>
+        <w:tc>
+          <w:tcPr/>
+          <w:p>
+            <w:pPr>
+              <w:pStyle w:val="Compact"/>
+              <w:jc w:val="right"/>
+            </w:pPr>
+            <w:r>
+              <w:t xml:space="preserve">#22</w:t>
+            </w:r>
+          </w:p>
+        </w:tc>
+        <w:tc>
+          <w:tcPr/>
+          <w:p>
+            <w:pPr>
+              <w:pStyle w:val="Compact"/>
+              <w:jc w:val="left"/>
+            </w:pPr>
+            <w:r>
+              <w:rPr>
+                <w:rStyle w:val="VerbatimChar"/>
+              </w:rPr>
+              <w:t xml:space="preserve">e872472</w:t>
+            </w:r>
+          </w:p>
+        </w:tc>
+        <w:tc>
+          <w:tcPr/>
+          <w:p>
+            <w:pPr>
+              <w:pStyle w:val="Compact"/>
+              <w:jc w:val="left"/>
+            </w:pPr>
+            <w:r>
+              <w:t xml:space="preserve">默认连接 ModelScope lite 评分 API</w:t>
+            </w:r>
+          </w:p>
+        </w:tc>
+        <w:tc>
+          <w:tcPr/>
+          <w:p>
+            <w:pPr>
+              <w:pStyle w:val="Compact"/>
+              <w:jc w:val="left"/>
+            </w:pPr>
+            <w:r>
+              <w:t xml:space="preserve">前端默认 API 指向 lite 空间，保留手动覆盖能力</w:t>
+            </w:r>
+          </w:p>
+        </w:tc>
+      </w:tr>
+      <w:tr>
+        <w:tc>
+          <w:tcPr/>
+          <w:p>
+            <w:pPr>
+              <w:pStyle w:val="Compact"/>
+              <w:jc w:val="right"/>
+            </w:pPr>
+            <w:r>
+              <w:t xml:space="preserve">#23</w:t>
+            </w:r>
+          </w:p>
+        </w:tc>
+        <w:tc>
+          <w:tcPr/>
+          <w:p>
+            <w:pPr>
+              <w:pStyle w:val="Compact"/>
+              <w:jc w:val="left"/>
+            </w:pPr>
+            <w:r>
+              <w:rPr>
+                <w:rStyle w:val="VerbatimChar"/>
+              </w:rPr>
+              <w:t xml:space="preserve">b758340</w:t>
+            </w:r>
+          </w:p>
+        </w:tc>
+        <w:tc>
+          <w:tcPr/>
+          <w:p>
+            <w:pPr>
+              <w:pStyle w:val="Compact"/>
+              <w:jc w:val="left"/>
+            </w:pPr>
+            <w:r>
+              <w:t xml:space="preserve">增加 Web Holistic 失败重试按钮</w:t>
+            </w:r>
+          </w:p>
+        </w:tc>
+        <w:tc>
+          <w:tcPr/>
+          <w:p>
+            <w:pPr>
+              <w:pStyle w:val="Compact"/>
+              <w:jc w:val="left"/>
+            </w:pPr>
+            <w:r>
+              <w:t xml:space="preserve">Web Holistic offline 时显示重试按钮，清理失败状态后重新加载</w:t>
+            </w:r>
+          </w:p>
+        </w:tc>
+      </w:tr>
     </w:tbl>
     <w:p>
       <w:pPr>
         <w:pStyle w:val="BodyText"/>
       </w:pPr>
       <w:r>
-        <w:t xml:space="preserve">当前</w:t>
-      </w:r>
-      <w:r>
-        <w:t xml:space="preserve"> </w:t>
-      </w:r>
-      <w:r>
-        <w:rPr>
-          <w:rStyle w:val="VerbatimChar"/>
-        </w:rPr>
-        <w:t xml:space="preserve">main</w:t>
-      </w:r>
-      <w:r>
-        <w:t xml:space="preserve"> </w:t>
-      </w:r>
-      <w:r>
-        <w:t xml:space="preserve">最新提交：</w:t>
+        <w:t xml:space="preserve">截至本报告本次更新覆盖的最新实现提交：</w:t>
       </w:r>
     </w:p>
     <w:p>
@@ -1101,7 +1281,7 @@
         <w:rPr>
           <w:rStyle w:val="VerbatimChar"/>
         </w:rPr>
-        <w:t xml:space="preserve">939bff3 Merge pull request #20 from sign-language-universe/chore/scoring-default-capture-params</w:t>
+        <w:t xml:space="preserve">b758340 Merge pull request #23 from sign-language-universe/feat/web-holistic-retry</w:t>
       </w:r>
     </w:p>
     <w:bookmarkEnd w:id="24"/>
@@ -1148,25 +1328,34 @@
         <w:rPr>
           <w:rStyle w:val="VerbatimChar"/>
         </w:rPr>
-        <w:t xml:space="preserve">  | 1. 页面访问后预加载 @mediapipe/holistic</w:t>
-      </w:r>
-      <w:r>
-        <w:br/>
-      </w:r>
-      <w:r>
-        <w:rPr>
-          <w:rStyle w:val="VerbatimChar"/>
-        </w:rPr>
-        <w:t xml:space="preserve">  | 2. 用户点击开始，浏览器摄像头采集</w:t>
-      </w:r>
-      <w:r>
-        <w:br/>
-      </w:r>
-      <w:r>
-        <w:rPr>
-          <w:rStyle w:val="VerbatimChar"/>
-        </w:rPr>
-        <w:t xml:space="preserve">  | 3. 浏览器本机提取 Holistic landmarks</w:t>
+        <w:t xml:space="preserve">  | 1. 默认连接 ModelScope lite API</w:t>
+      </w:r>
+      <w:r>
+        <w:br/>
+      </w:r>
+      <w:r>
+        <w:rPr>
+          <w:rStyle w:val="VerbatimChar"/>
+        </w:rPr>
+        <w:t xml:space="preserve">  | 2. 页面访问后预加载 @mediapipe/holistic</w:t>
+      </w:r>
+      <w:r>
+        <w:br/>
+      </w:r>
+      <w:r>
+        <w:rPr>
+          <w:rStyle w:val="VerbatimChar"/>
+        </w:rPr>
+        <w:t xml:space="preserve">  | 3. 用户点击开始，浏览器摄像头采集</w:t>
+      </w:r>
+      <w:r>
+        <w:br/>
+      </w:r>
+      <w:r>
+        <w:rPr>
+          <w:rStyle w:val="VerbatimChar"/>
+        </w:rPr>
+        <w:t xml:space="preserve">  | 4. 浏览器本机提取 Holistic landmarks</w:t>
       </w:r>
       <w:r>
         <w:br/>
@@ -1469,8 +1658,42 @@
         <w:t xml:space="preserve">：保留为服务端 Holistic worker 验证和回退方案，不作为当前推荐主路径。</w:t>
       </w:r>
     </w:p>
+    <w:p>
+      <w:pPr>
+        <w:numPr>
+          <w:ilvl w:val="0"/>
+          <w:numId w:val="1003"/>
+        </w:numPr>
+        <w:pStyle w:val="Compact"/>
+      </w:pPr>
+      <w:r>
+        <w:rPr>
+          <w:bCs/>
+          <w:b/>
+        </w:rPr>
+        <w:t xml:space="preserve">默认连接策略</w:t>
+      </w:r>
+      <w:r>
+        <w:t xml:space="preserve">：普通用户直接打开 GitHub Pages 即可连接 lite API；开发者仍可通过输入框或</w:t>
+      </w:r>
+      <w:r>
+        <w:t xml:space="preserve"> </w:t>
+      </w:r>
+      <w:r>
+        <w:rPr>
+          <w:rStyle w:val="VerbatimChar"/>
+        </w:rPr>
+        <w:t xml:space="preserve">?api=</w:t>
+      </w:r>
+      <w:r>
+        <w:t xml:space="preserve"> </w:t>
+      </w:r>
+      <w:r>
+        <w:t xml:space="preserve">参数切换后端。</w:t>
+      </w:r>
+    </w:p>
     <w:bookmarkEnd w:id="25"/>
-    <w:bookmarkStart w:id="32" w:name="前端更新详情"/>
+    <w:bookmarkStart w:id="33" w:name="前端更新详情"/>
     <w:p>
       <w:pPr>
         <w:pStyle w:val="Heading2"/>
@@ -1629,6 +1852,45 @@
         <w:pStyle w:val="Compact"/>
       </w:pPr>
       <w:r>
+        <w:t xml:space="preserve">Web Holistic 进入不可用状态时，显示“重新加载 Web Holistic”按钮。</w:t>
+      </w:r>
+    </w:p>
+    <w:p>
+      <w:pPr>
+        <w:numPr>
+          <w:ilvl w:val="0"/>
+          <w:numId w:val="1004"/>
+        </w:numPr>
+        <w:pStyle w:val="Compact"/>
+      </w:pPr>
+      <w:r>
+        <w:t xml:space="preserve">用户点击重试按钮后，前端会清理失败状态、移除失败残留的</w:t>
+      </w:r>
+      <w:r>
+        <w:t xml:space="preserve"> </w:t>
+      </w:r>
+      <w:r>
+        <w:rPr>
+          <w:rStyle w:val="VerbatimChar"/>
+        </w:rPr>
+        <w:t xml:space="preserve">&lt;script&gt;</w:t>
+      </w:r>
+      <w:r>
+        <w:t xml:space="preserve"> </w:t>
+      </w:r>
+      <w:r>
+        <w:t xml:space="preserve">标签，并重新加载和预热 Holistic。</w:t>
+      </w:r>
+    </w:p>
+    <w:p>
+      <w:pPr>
+        <w:numPr>
+          <w:ilvl w:val="0"/>
+          <w:numId w:val="1004"/>
+        </w:numPr>
+        <w:pStyle w:val="Compact"/>
+      </w:pPr>
+      <w:r>
         <w:rPr>
           <w:rStyle w:val="VerbatimChar"/>
         </w:rPr>
@@ -1746,13 +2008,13 @@
       </w:r>
     </w:p>
     <w:bookmarkEnd w:id="26"/>
-    <w:bookmarkStart w:id="27" w:name="浏览器端关键点提取与上传"/>
+    <w:bookmarkStart w:id="27" w:name="默认连接-modelscope-lite-评分-api"/>
     <w:p>
       <w:pPr>
         <w:pStyle w:val="Heading3"/>
       </w:pPr>
       <w:r>
-        <w:t xml:space="preserve">4.2 浏览器端关键点提取与上传</w:t>
+        <w:t xml:space="preserve">4.2 默认连接 ModelScope lite 评分 API</w:t>
       </w:r>
     </w:p>
     <w:p>
@@ -1760,6 +2022,34 @@
         <w:pStyle w:val="FirstParagraph"/>
       </w:pPr>
       <w:r>
+        <w:t xml:space="preserve">文件：</w:t>
+      </w:r>
+    </w:p>
+    <w:p>
+      <w:pPr>
+        <w:pStyle w:val="SourceCode"/>
+      </w:pPr>
+      <w:r>
+        <w:rPr>
+          <w:rStyle w:val="VerbatimChar"/>
+        </w:rPr>
+        <w:t xml:space="preserve">apps/web/js/scoring.js</w:t>
+      </w:r>
+      <w:r>
+        <w:br/>
+      </w:r>
+      <w:r>
+        <w:rPr>
+          <w:rStyle w:val="VerbatimChar"/>
+        </w:rPr>
+        <w:t xml:space="preserve">apps/web/README.md</w:t>
+      </w:r>
+    </w:p>
+    <w:p>
+      <w:pPr>
+        <w:pStyle w:val="FirstParagraph"/>
+      </w:pPr>
+      <w:r>
         <w:t xml:space="preserve">已实现：</w:t>
       </w:r>
     </w:p>
@@ -1772,6 +2062,150 @@
         <w:pStyle w:val="Compact"/>
       </w:pPr>
       <w:r>
+        <w:t xml:space="preserve">前端默认评分 API：</w:t>
+      </w:r>
+    </w:p>
+    <w:p>
+      <w:pPr>
+        <w:pStyle w:val="SourceCode"/>
+      </w:pPr>
+      <w:r>
+        <w:rPr>
+          <w:rStyle w:val="VerbatimChar"/>
+        </w:rPr>
+        <w:t xml:space="preserve">https://scottwyc-sign-language-universe-lite.ms.show</w:t>
+      </w:r>
+    </w:p>
+    <w:p>
+      <w:pPr>
+        <w:numPr>
+          <w:ilvl w:val="0"/>
+          <w:numId w:val="1009"/>
+        </w:numPr>
+        <w:pStyle w:val="Compact"/>
+      </w:pPr>
+      <w:r>
+        <w:t xml:space="preserve">新用户首次访问时，评分 API 输入框会自动填入 lite API。</w:t>
+      </w:r>
+    </w:p>
+    <w:p>
+      <w:pPr>
+        <w:numPr>
+          <w:ilvl w:val="0"/>
+          <w:numId w:val="1009"/>
+        </w:numPr>
+        <w:pStyle w:val="Compact"/>
+      </w:pPr>
+      <w:r>
+        <w:t xml:space="preserve">用户不需要再手动添加评分 API 地址。</w:t>
+      </w:r>
+    </w:p>
+    <w:p>
+      <w:pPr>
+        <w:numPr>
+          <w:ilvl w:val="0"/>
+          <w:numId w:val="1009"/>
+        </w:numPr>
+        <w:pStyle w:val="Compact"/>
+      </w:pPr>
+      <w:r>
+        <w:t xml:space="preserve">仍保留覆盖能力，优先级如下：</w:t>
+      </w:r>
+    </w:p>
+    <w:p>
+      <w:pPr>
+        <w:pStyle w:val="SourceCode"/>
+      </w:pPr>
+      <w:r>
+        <w:rPr>
+          <w:rStyle w:val="VerbatimChar"/>
+        </w:rPr>
+        <w:t xml:space="preserve">URL ?api=... 参数 &gt; 浏览器 localStorage 中的自定义非空地址 &gt; 默认 lite API</w:t>
+      </w:r>
+    </w:p>
+    <w:p>
+      <w:pPr>
+        <w:pStyle w:val="FirstParagraph"/>
+      </w:pPr>
+      <w:r>
+        <w:t xml:space="preserve">设计原因：</w:t>
+      </w:r>
+    </w:p>
+    <w:p>
+      <w:pPr>
+        <w:numPr>
+          <w:ilvl w:val="0"/>
+          <w:numId w:val="1010"/>
+        </w:numPr>
+        <w:pStyle w:val="Compact"/>
+      </w:pPr>
+      <w:r>
+        <w:t xml:space="preserve">当前推荐路线是 Web Holistic + lite 后端。</w:t>
+      </w:r>
+    </w:p>
+    <w:p>
+      <w:pPr>
+        <w:numPr>
+          <w:ilvl w:val="0"/>
+          <w:numId w:val="1010"/>
+        </w:numPr>
+        <w:pStyle w:val="Compact"/>
+      </w:pPr>
+      <w:r>
+        <w:t xml:space="preserve">lite 后端启动快、依赖少，不运行服务端 MediaPipe。</w:t>
+      </w:r>
+    </w:p>
+    <w:p>
+      <w:pPr>
+        <w:numPr>
+          <w:ilvl w:val="0"/>
+          <w:numId w:val="1010"/>
+        </w:numPr>
+        <w:pStyle w:val="Compact"/>
+      </w:pPr>
+      <w:r>
+        <w:t xml:space="preserve">对普通用户来说，默认接入可以减少配置门槛。</w:t>
+      </w:r>
+    </w:p>
+    <w:p>
+      <w:pPr>
+        <w:numPr>
+          <w:ilvl w:val="0"/>
+          <w:numId w:val="1010"/>
+        </w:numPr>
+        <w:pStyle w:val="Compact"/>
+      </w:pPr>
+      <w:r>
+        <w:t xml:space="preserve">对开发者来说，输入框和 URL 参数仍可切换到本地 API、full API 或其他测试 API。</w:t>
+      </w:r>
+    </w:p>
+    <w:bookmarkEnd w:id="27"/>
+    <w:bookmarkStart w:id="28" w:name="浏览器端关键点提取与上传"/>
+    <w:p>
+      <w:pPr>
+        <w:pStyle w:val="Heading3"/>
+      </w:pPr>
+      <w:r>
+        <w:t xml:space="preserve">4.3 浏览器端关键点提取与上传</w:t>
+      </w:r>
+    </w:p>
+    <w:p>
+      <w:pPr>
+        <w:pStyle w:val="FirstParagraph"/>
+      </w:pPr>
+      <w:r>
+        <w:t xml:space="preserve">已实现：</w:t>
+      </w:r>
+    </w:p>
+    <w:p>
+      <w:pPr>
+        <w:numPr>
+          <w:ilvl w:val="0"/>
+          <w:numId w:val="1011"/>
+        </w:numPr>
+        <w:pStyle w:val="Compact"/>
+      </w:pPr>
+      <w:r>
         <w:t xml:space="preserve">前端优先使用</w:t>
       </w:r>
       <w:r>
@@ -1794,7 +2228,7 @@
       <w:pPr>
         <w:numPr>
           <w:ilvl w:val="0"/>
-          <w:numId w:val="1008"/>
+          <w:numId w:val="1011"/>
         </w:numPr>
         <w:pStyle w:val="Compact"/>
       </w:pPr>
@@ -1818,230 +2252,12 @@
       <w:pPr>
         <w:numPr>
           <w:ilvl w:val="0"/>
-          <w:numId w:val="1008"/>
+          <w:numId w:val="1011"/>
         </w:numPr>
         <w:pStyle w:val="Compact"/>
       </w:pPr>
       <w:r>
         <w:t xml:space="preserve">上传内容包括：</w:t>
-      </w:r>
-    </w:p>
-    <w:p>
-      <w:pPr>
-        <w:numPr>
-          <w:ilvl w:val="1"/>
-          <w:numId w:val="1009"/>
-        </w:numPr>
-        <w:pStyle w:val="Compact"/>
-      </w:pPr>
-      <w:r>
-        <w:t xml:space="preserve">pose landmarks</w:t>
-      </w:r>
-    </w:p>
-    <w:p>
-      <w:pPr>
-        <w:numPr>
-          <w:ilvl w:val="1"/>
-          <w:numId w:val="1009"/>
-        </w:numPr>
-        <w:pStyle w:val="Compact"/>
-      </w:pPr>
-      <w:r>
-        <w:t xml:space="preserve">left hand landmarks</w:t>
-      </w:r>
-    </w:p>
-    <w:p>
-      <w:pPr>
-        <w:numPr>
-          <w:ilvl w:val="1"/>
-          <w:numId w:val="1009"/>
-        </w:numPr>
-        <w:pStyle w:val="Compact"/>
-      </w:pPr>
-      <w:r>
-        <w:t xml:space="preserve">right hand landmarks</w:t>
-      </w:r>
-    </w:p>
-    <w:p>
-      <w:pPr>
-        <w:numPr>
-          <w:ilvl w:val="1"/>
-          <w:numId w:val="1009"/>
-        </w:numPr>
-        <w:pStyle w:val="Compact"/>
-      </w:pPr>
-      <w:r>
-        <w:t xml:space="preserve">face core landmarks</w:t>
-      </w:r>
-    </w:p>
-    <w:p>
-      <w:pPr>
-        <w:numPr>
-          <w:ilvl w:val="0"/>
-          <w:numId w:val="1008"/>
-        </w:numPr>
-        <w:pStyle w:val="Compact"/>
-      </w:pPr>
-      <w:r>
-        <w:t xml:space="preserve">不上传完整 face 478 点，只上传面部核心点，以降低 JSON 体积。</w:t>
-      </w:r>
-    </w:p>
-    <w:p>
-      <w:pPr>
-        <w:numPr>
-          <w:ilvl w:val="0"/>
-          <w:numId w:val="1008"/>
-        </w:numPr>
-        <w:pStyle w:val="Compact"/>
-      </w:pPr>
-      <w:r>
-        <w:t xml:space="preserve">每个点使用紧凑数组结构，包含</w:t>
-      </w:r>
-      <w:r>
-        <w:t xml:space="preserve"> </w:t>
-      </w:r>
-      <w:r>
-        <w:rPr>
-          <w:rStyle w:val="VerbatimChar"/>
-        </w:rPr>
-        <w:t xml:space="preserve">x/y/z</w:t>
-      </w:r>
-      <w:r>
-        <w:t xml:space="preserve">，以及可选</w:t>
-      </w:r>
-      <w:r>
-        <w:t xml:space="preserve"> </w:t>
-      </w:r>
-      <w:r>
-        <w:rPr>
-          <w:rStyle w:val="VerbatimChar"/>
-        </w:rPr>
-        <w:t xml:space="preserve">visibility/presence</w:t>
-      </w:r>
-      <w:r>
-        <w:t xml:space="preserve">。</w:t>
-      </w:r>
-    </w:p>
-    <w:p>
-      <w:pPr>
-        <w:pStyle w:val="FirstParagraph"/>
-      </w:pPr>
-      <w:r>
-        <w:t xml:space="preserve">降级路径：</w:t>
-      </w:r>
-    </w:p>
-    <w:p>
-      <w:pPr>
-        <w:numPr>
-          <w:ilvl w:val="0"/>
-          <w:numId w:val="1010"/>
-        </w:numPr>
-        <w:pStyle w:val="Compact"/>
-      </w:pPr>
-      <w:r>
-        <w:t xml:space="preserve">如果 Web Holistic 加载失败或处理失败，前端可回退为压缩 JPEG 帧路径。</w:t>
-      </w:r>
-    </w:p>
-    <w:p>
-      <w:pPr>
-        <w:numPr>
-          <w:ilvl w:val="0"/>
-          <w:numId w:val="1010"/>
-        </w:numPr>
-        <w:pStyle w:val="Compact"/>
-      </w:pPr>
-      <w:r>
-        <w:t xml:space="preserve">如果评分 API 不可用，前端仍返回明确标注的本地预览分，保证演示流程不中断。</w:t>
-      </w:r>
-    </w:p>
-    <w:bookmarkEnd w:id="27"/>
-    <w:bookmarkStart w:id="28" w:name="录制与自动评分流程"/>
-    <w:p>
-      <w:pPr>
-        <w:pStyle w:val="Heading3"/>
-      </w:pPr>
-      <w:r>
-        <w:t xml:space="preserve">4.3 录制与自动评分流程</w:t>
-      </w:r>
-    </w:p>
-    <w:p>
-      <w:pPr>
-        <w:pStyle w:val="FirstParagraph"/>
-      </w:pPr>
-      <w:r>
-        <w:t xml:space="preserve">已实现：</w:t>
-      </w:r>
-    </w:p>
-    <w:p>
-      <w:pPr>
-        <w:numPr>
-          <w:ilvl w:val="0"/>
-          <w:numId w:val="1011"/>
-        </w:numPr>
-        <w:pStyle w:val="Compact"/>
-      </w:pPr>
-      <w:r>
-        <w:t xml:space="preserve">用户点击“开始”。</w:t>
-      </w:r>
-    </w:p>
-    <w:p>
-      <w:pPr>
-        <w:numPr>
-          <w:ilvl w:val="0"/>
-          <w:numId w:val="1011"/>
-        </w:numPr>
-        <w:pStyle w:val="Compact"/>
-      </w:pPr>
-      <w:r>
-        <w:t xml:space="preserve">页面进行倒计时。</w:t>
-      </w:r>
-    </w:p>
-    <w:p>
-      <w:pPr>
-        <w:numPr>
-          <w:ilvl w:val="0"/>
-          <w:numId w:val="1011"/>
-        </w:numPr>
-        <w:pStyle w:val="Compact"/>
-      </w:pPr>
-      <w:r>
-        <w:t xml:space="preserve">按当前用户参数采集帧。</w:t>
-      </w:r>
-    </w:p>
-    <w:p>
-      <w:pPr>
-        <w:numPr>
-          <w:ilvl w:val="0"/>
-          <w:numId w:val="1011"/>
-        </w:numPr>
-        <w:pStyle w:val="Compact"/>
-      </w:pPr>
-      <w:r>
-        <w:t xml:space="preserve">录制到达设定时长后立即关闭摄像头。</w:t>
-      </w:r>
-    </w:p>
-    <w:p>
-      <w:pPr>
-        <w:numPr>
-          <w:ilvl w:val="0"/>
-          <w:numId w:val="1011"/>
-        </w:numPr>
-        <w:pStyle w:val="Compact"/>
-      </w:pPr>
-      <w:r>
-        <w:t xml:space="preserve">录制完成后自动进入评分，不再要求用户手动点击“打分”。</w:t>
-      </w:r>
-    </w:p>
-    <w:p>
-      <w:pPr>
-        <w:numPr>
-          <w:ilvl w:val="0"/>
-          <w:numId w:val="1011"/>
-        </w:numPr>
-        <w:pStyle w:val="Compact"/>
-      </w:pPr>
-      <w:r>
-        <w:t xml:space="preserve">评分期间展示：</w:t>
       </w:r>
     </w:p>
     <w:p>
@@ -2053,13 +2269,7 @@
         <w:pStyle w:val="Compact"/>
       </w:pPr>
       <w:r>
-        <w:t xml:space="preserve">“</w:t>
-      </w:r>
-      <w:r>
-        <w:t xml:space="preserve">正在等待评分：x.xs</w:t>
-      </w:r>
-      <w:r>
-        <w:t xml:space="preserve">”</w:t>
+        <w:t xml:space="preserve">pose landmarks</w:t>
       </w:r>
     </w:p>
     <w:p>
@@ -2071,9 +2281,233 @@
         <w:pStyle w:val="Compact"/>
       </w:pPr>
       <w:r>
+        <w:t xml:space="preserve">left hand landmarks</w:t>
+      </w:r>
+    </w:p>
+    <w:p>
+      <w:pPr>
+        <w:numPr>
+          <w:ilvl w:val="1"/>
+          <w:numId w:val="1012"/>
+        </w:numPr>
+        <w:pStyle w:val="Compact"/>
+      </w:pPr>
+      <w:r>
+        <w:t xml:space="preserve">right hand landmarks</w:t>
+      </w:r>
+    </w:p>
+    <w:p>
+      <w:pPr>
+        <w:numPr>
+          <w:ilvl w:val="1"/>
+          <w:numId w:val="1012"/>
+        </w:numPr>
+        <w:pStyle w:val="Compact"/>
+      </w:pPr>
+      <w:r>
+        <w:t xml:space="preserve">face core landmarks</w:t>
+      </w:r>
+    </w:p>
+    <w:p>
+      <w:pPr>
+        <w:numPr>
+          <w:ilvl w:val="0"/>
+          <w:numId w:val="1011"/>
+        </w:numPr>
+        <w:pStyle w:val="Compact"/>
+      </w:pPr>
+      <w:r>
+        <w:t xml:space="preserve">不上传完整 face 478 点，只上传面部核心点，以降低 JSON 体积。</w:t>
+      </w:r>
+    </w:p>
+    <w:p>
+      <w:pPr>
+        <w:numPr>
+          <w:ilvl w:val="0"/>
+          <w:numId w:val="1011"/>
+        </w:numPr>
+        <w:pStyle w:val="Compact"/>
+      </w:pPr>
+      <w:r>
+        <w:t xml:space="preserve">每个点使用紧凑数组结构，包含</w:t>
+      </w:r>
+      <w:r>
+        <w:t xml:space="preserve"> </w:t>
+      </w:r>
+      <w:r>
+        <w:rPr>
+          <w:rStyle w:val="VerbatimChar"/>
+        </w:rPr>
+        <w:t xml:space="preserve">x/y/z</w:t>
+      </w:r>
+      <w:r>
+        <w:t xml:space="preserve">，以及可选</w:t>
+      </w:r>
+      <w:r>
+        <w:t xml:space="preserve"> </w:t>
+      </w:r>
+      <w:r>
+        <w:rPr>
+          <w:rStyle w:val="VerbatimChar"/>
+        </w:rPr>
+        <w:t xml:space="preserve">visibility/presence</w:t>
+      </w:r>
+      <w:r>
+        <w:t xml:space="preserve">。</w:t>
+      </w:r>
+    </w:p>
+    <w:p>
+      <w:pPr>
+        <w:pStyle w:val="FirstParagraph"/>
+      </w:pPr>
+      <w:r>
+        <w:t xml:space="preserve">降级路径：</w:t>
+      </w:r>
+    </w:p>
+    <w:p>
+      <w:pPr>
+        <w:numPr>
+          <w:ilvl w:val="0"/>
+          <w:numId w:val="1013"/>
+        </w:numPr>
+        <w:pStyle w:val="Compact"/>
+      </w:pPr>
+      <w:r>
+        <w:t xml:space="preserve">如果 Web Holistic 加载失败或处理失败，前端可回退为压缩 JPEG 帧路径。</w:t>
+      </w:r>
+    </w:p>
+    <w:p>
+      <w:pPr>
+        <w:numPr>
+          <w:ilvl w:val="0"/>
+          <w:numId w:val="1013"/>
+        </w:numPr>
+        <w:pStyle w:val="Compact"/>
+      </w:pPr>
+      <w:r>
+        <w:t xml:space="preserve">如果评分 API 不可用，前端仍返回明确标注的本地预览分，保证演示流程不中断。</w:t>
+      </w:r>
+    </w:p>
+    <w:bookmarkEnd w:id="28"/>
+    <w:bookmarkStart w:id="29" w:name="录制与自动评分流程"/>
+    <w:p>
+      <w:pPr>
+        <w:pStyle w:val="Heading3"/>
+      </w:pPr>
+      <w:r>
+        <w:t xml:space="preserve">4.4 录制与自动评分流程</w:t>
+      </w:r>
+    </w:p>
+    <w:p>
+      <w:pPr>
+        <w:pStyle w:val="FirstParagraph"/>
+      </w:pPr>
+      <w:r>
+        <w:t xml:space="preserve">已实现：</w:t>
+      </w:r>
+    </w:p>
+    <w:p>
+      <w:pPr>
+        <w:numPr>
+          <w:ilvl w:val="0"/>
+          <w:numId w:val="1014"/>
+        </w:numPr>
+        <w:pStyle w:val="Compact"/>
+      </w:pPr>
+      <w:r>
+        <w:t xml:space="preserve">用户点击“开始”。</w:t>
+      </w:r>
+    </w:p>
+    <w:p>
+      <w:pPr>
+        <w:numPr>
+          <w:ilvl w:val="0"/>
+          <w:numId w:val="1014"/>
+        </w:numPr>
+        <w:pStyle w:val="Compact"/>
+      </w:pPr>
+      <w:r>
+        <w:t xml:space="preserve">页面进行倒计时。</w:t>
+      </w:r>
+    </w:p>
+    <w:p>
+      <w:pPr>
+        <w:numPr>
+          <w:ilvl w:val="0"/>
+          <w:numId w:val="1014"/>
+        </w:numPr>
+        <w:pStyle w:val="Compact"/>
+      </w:pPr>
+      <w:r>
+        <w:t xml:space="preserve">按当前用户参数采集帧。</w:t>
+      </w:r>
+    </w:p>
+    <w:p>
+      <w:pPr>
+        <w:numPr>
+          <w:ilvl w:val="0"/>
+          <w:numId w:val="1014"/>
+        </w:numPr>
+        <w:pStyle w:val="Compact"/>
+      </w:pPr>
+      <w:r>
+        <w:t xml:space="preserve">录制到达设定时长后立即关闭摄像头。</w:t>
+      </w:r>
+    </w:p>
+    <w:p>
+      <w:pPr>
+        <w:numPr>
+          <w:ilvl w:val="0"/>
+          <w:numId w:val="1014"/>
+        </w:numPr>
+        <w:pStyle w:val="Compact"/>
+      </w:pPr>
+      <w:r>
+        <w:t xml:space="preserve">录制完成后自动进入评分，不再要求用户手动点击“打分”。</w:t>
+      </w:r>
+    </w:p>
+    <w:p>
+      <w:pPr>
+        <w:numPr>
+          <w:ilvl w:val="0"/>
+          <w:numId w:val="1014"/>
+        </w:numPr>
+        <w:pStyle w:val="Compact"/>
+      </w:pPr>
+      <w:r>
+        <w:t xml:space="preserve">评分期间展示：</w:t>
+      </w:r>
+    </w:p>
+    <w:p>
+      <w:pPr>
+        <w:numPr>
+          <w:ilvl w:val="1"/>
+          <w:numId w:val="1015"/>
+        </w:numPr>
+        <w:pStyle w:val="Compact"/>
+      </w:pPr>
+      <w:r>
         <w:t xml:space="preserve">“</w:t>
       </w:r>
       <w:r>
+        <w:t xml:space="preserve">正在等待评分：x.xs</w:t>
+      </w:r>
+      <w:r>
+        <w:t xml:space="preserve">”</w:t>
+      </w:r>
+    </w:p>
+    <w:p>
+      <w:pPr>
+        <w:numPr>
+          <w:ilvl w:val="1"/>
+          <w:numId w:val="1015"/>
+        </w:numPr>
+        <w:pStyle w:val="Compact"/>
+      </w:pPr>
+      <w:r>
+        <w:t xml:space="preserve">“</w:t>
+      </w:r>
+      <w:r>
         <w:t xml:space="preserve">等待服务器返回评分结果</w:t>
       </w:r>
       <w:r>
@@ -2084,7 +2518,7 @@
       <w:pPr>
         <w:numPr>
           <w:ilvl w:val="0"/>
-          <w:numId w:val="1011"/>
+          <w:numId w:val="1014"/>
         </w:numPr>
         <w:pStyle w:val="Compact"/>
       </w:pPr>
@@ -2104,7 +2538,7 @@
       <w:pPr>
         <w:numPr>
           <w:ilvl w:val="0"/>
-          <w:numId w:val="1013"/>
+          <w:numId w:val="1016"/>
         </w:numPr>
         <w:pStyle w:val="Compact"/>
       </w:pPr>
@@ -2116,7 +2550,7 @@
       <w:pPr>
         <w:numPr>
           <w:ilvl w:val="0"/>
-          <w:numId w:val="1013"/>
+          <w:numId w:val="1016"/>
         </w:numPr>
         <w:pStyle w:val="Compact"/>
       </w:pPr>
@@ -2124,14 +2558,14 @@
         <w:t xml:space="preserve">用户必须手动点击“打分”才能进入评分。</w:t>
       </w:r>
     </w:p>
-    <w:bookmarkEnd w:id="28"/>
-    <w:bookmarkStart w:id="29" w:name="采样帧数逻辑调整"/>
+    <w:bookmarkEnd w:id="29"/>
+    <w:bookmarkStart w:id="30" w:name="采样帧数逻辑调整"/>
     <w:p>
       <w:pPr>
         <w:pStyle w:val="Heading3"/>
       </w:pPr>
       <w:r>
-        <w:t xml:space="preserve">4.4 采样帧数逻辑调整</w:t>
+        <w:t xml:space="preserve">4.5 采样帧数逻辑调整</w:t>
       </w:r>
     </w:p>
     <w:p>
@@ -2146,7 +2580,7 @@
       <w:pPr>
         <w:numPr>
           <w:ilvl w:val="0"/>
-          <w:numId w:val="1014"/>
+          <w:numId w:val="1017"/>
         </w:numPr>
         <w:pStyle w:val="Compact"/>
       </w:pPr>
@@ -2173,7 +2607,7 @@
       <w:pPr>
         <w:numPr>
           <w:ilvl w:val="0"/>
-          <w:numId w:val="1014"/>
+          <w:numId w:val="1017"/>
         </w:numPr>
         <w:pStyle w:val="Compact"/>
       </w:pPr>
@@ -2185,7 +2619,7 @@
       <w:pPr>
         <w:numPr>
           <w:ilvl w:val="0"/>
-          <w:numId w:val="1014"/>
+          <w:numId w:val="1017"/>
         </w:numPr>
         <w:pStyle w:val="Compact"/>
       </w:pPr>
@@ -2197,7 +2631,7 @@
       <w:pPr>
         <w:numPr>
           <w:ilvl w:val="0"/>
-          <w:numId w:val="1014"/>
+          <w:numId w:val="1017"/>
         </w:numPr>
         <w:pStyle w:val="Compact"/>
       </w:pPr>
@@ -2293,7 +2727,7 @@
       <w:pPr>
         <w:numPr>
           <w:ilvl w:val="0"/>
-          <w:numId w:val="1015"/>
+          <w:numId w:val="1018"/>
         </w:numPr>
         <w:pStyle w:val="Compact"/>
       </w:pPr>
@@ -2320,7 +2754,7 @@
       <w:pPr>
         <w:numPr>
           <w:ilvl w:val="0"/>
-          <w:numId w:val="1015"/>
+          <w:numId w:val="1018"/>
         </w:numPr>
         <w:pStyle w:val="Compact"/>
       </w:pPr>
@@ -2328,14 +2762,14 @@
         <w:t xml:space="preserve">低于建议帧数时仍允许录制，但提示评分稳定性可能下降。</w:t>
       </w:r>
     </w:p>
-    <w:bookmarkEnd w:id="29"/>
-    <w:bookmarkStart w:id="30" w:name="低分建议"/>
+    <w:bookmarkEnd w:id="30"/>
+    <w:bookmarkStart w:id="31" w:name="低分建议"/>
     <w:p>
       <w:pPr>
         <w:pStyle w:val="Heading3"/>
       </w:pPr>
       <w:r>
-        <w:t xml:space="preserve">4.5 低分建议</w:t>
+        <w:t xml:space="preserve">4.6 低分建议</w:t>
       </w:r>
     </w:p>
     <w:p>
@@ -2369,7 +2803,7 @@
       <w:pPr>
         <w:numPr>
           <w:ilvl w:val="0"/>
-          <w:numId w:val="1016"/>
+          <w:numId w:val="1019"/>
         </w:numPr>
         <w:pStyle w:val="Compact"/>
       </w:pPr>
@@ -2381,7 +2815,7 @@
       <w:pPr>
         <w:numPr>
           <w:ilvl w:val="0"/>
-          <w:numId w:val="1016"/>
+          <w:numId w:val="1019"/>
         </w:numPr>
         <w:pStyle w:val="Compact"/>
       </w:pPr>
@@ -2393,7 +2827,7 @@
       <w:pPr>
         <w:numPr>
           <w:ilvl w:val="0"/>
-          <w:numId w:val="1016"/>
+          <w:numId w:val="1019"/>
         </w:numPr>
         <w:pStyle w:val="Compact"/>
       </w:pPr>
@@ -2405,7 +2839,7 @@
       <w:pPr>
         <w:numPr>
           <w:ilvl w:val="0"/>
-          <w:numId w:val="1016"/>
+          <w:numId w:val="1019"/>
         </w:numPr>
         <w:pStyle w:val="Compact"/>
       </w:pPr>
@@ -2425,7 +2859,7 @@
       <w:pPr>
         <w:numPr>
           <w:ilvl w:val="0"/>
-          <w:numId w:val="1017"/>
+          <w:numId w:val="1020"/>
         </w:numPr>
         <w:pStyle w:val="Compact"/>
       </w:pPr>
@@ -2437,7 +2871,7 @@
       <w:pPr>
         <w:numPr>
           <w:ilvl w:val="0"/>
-          <w:numId w:val="1017"/>
+          <w:numId w:val="1020"/>
         </w:numPr>
         <w:pStyle w:val="Compact"/>
       </w:pPr>
@@ -2449,7 +2883,7 @@
       <w:pPr>
         <w:numPr>
           <w:ilvl w:val="0"/>
-          <w:numId w:val="1017"/>
+          <w:numId w:val="1020"/>
         </w:numPr>
         <w:pStyle w:val="Compact"/>
       </w:pPr>
@@ -2461,7 +2895,7 @@
       <w:pPr>
         <w:numPr>
           <w:ilvl w:val="0"/>
-          <w:numId w:val="1017"/>
+          <w:numId w:val="1020"/>
         </w:numPr>
         <w:pStyle w:val="Compact"/>
       </w:pPr>
@@ -2473,7 +2907,7 @@
       <w:pPr>
         <w:numPr>
           <w:ilvl w:val="0"/>
-          <w:numId w:val="1017"/>
+          <w:numId w:val="1020"/>
         </w:numPr>
         <w:pStyle w:val="Compact"/>
       </w:pPr>
@@ -2485,7 +2919,7 @@
       <w:pPr>
         <w:numPr>
           <w:ilvl w:val="0"/>
-          <w:numId w:val="1017"/>
+          <w:numId w:val="1020"/>
         </w:numPr>
         <w:pStyle w:val="Compact"/>
       </w:pPr>
@@ -2501,14 +2935,14 @@
         <w:t xml:space="preserve">低分结果页会优先展示这类可执行建议，而不是只显示“模板评分完成”一类系统状态。</w:t>
       </w:r>
     </w:p>
-    <w:bookmarkEnd w:id="30"/>
-    <w:bookmarkStart w:id="31" w:name="录制结束画面发白优化"/>
+    <w:bookmarkEnd w:id="31"/>
+    <w:bookmarkStart w:id="32" w:name="录制结束画面发白优化"/>
     <w:p>
       <w:pPr>
         <w:pStyle w:val="Heading3"/>
       </w:pPr>
       <w:r>
-        <w:t xml:space="preserve">4.6 录制结束画面发白优化</w:t>
+        <w:t xml:space="preserve">4.7 录制结束画面发白优化</w:t>
       </w:r>
     </w:p>
     <w:p>
@@ -2523,7 +2957,7 @@
       <w:pPr>
         <w:numPr>
           <w:ilvl w:val="0"/>
-          <w:numId w:val="1018"/>
+          <w:numId w:val="1021"/>
         </w:numPr>
         <w:pStyle w:val="Compact"/>
       </w:pPr>
@@ -2535,7 +2969,7 @@
       <w:pPr>
         <w:numPr>
           <w:ilvl w:val="0"/>
-          <w:numId w:val="1018"/>
+          <w:numId w:val="1021"/>
         </w:numPr>
         <w:pStyle w:val="Compact"/>
       </w:pPr>
@@ -2555,7 +2989,7 @@
       <w:pPr>
         <w:numPr>
           <w:ilvl w:val="0"/>
-          <w:numId w:val="1019"/>
+          <w:numId w:val="1022"/>
         </w:numPr>
         <w:pStyle w:val="Compact"/>
       </w:pPr>
@@ -2567,7 +3001,7 @@
       <w:pPr>
         <w:numPr>
           <w:ilvl w:val="0"/>
-          <w:numId w:val="1019"/>
+          <w:numId w:val="1022"/>
         </w:numPr>
         <w:pStyle w:val="Compact"/>
       </w:pPr>
@@ -2579,7 +3013,7 @@
       <w:pPr>
         <w:numPr>
           <w:ilvl w:val="0"/>
-          <w:numId w:val="1019"/>
+          <w:numId w:val="1022"/>
         </w:numPr>
         <w:pStyle w:val="Compact"/>
       </w:pPr>
@@ -2627,7 +3061,7 @@
       <w:pPr>
         <w:numPr>
           <w:ilvl w:val="0"/>
-          <w:numId w:val="1020"/>
+          <w:numId w:val="1023"/>
         </w:numPr>
         <w:pStyle w:val="Compact"/>
       </w:pPr>
@@ -2639,7 +3073,7 @@
       <w:pPr>
         <w:numPr>
           <w:ilvl w:val="0"/>
-          <w:numId w:val="1020"/>
+          <w:numId w:val="1023"/>
         </w:numPr>
         <w:pStyle w:val="Compact"/>
       </w:pPr>
@@ -2647,9 +3081,9 @@
         <w:t xml:space="preserve">减少摄像头停止时的白屏闪烁。</w:t>
       </w:r>
     </w:p>
-    <w:bookmarkEnd w:id="31"/>
     <w:bookmarkEnd w:id="32"/>
-    <w:bookmarkStart w:id="36" w:name="后端更新详情"/>
+    <w:bookmarkEnd w:id="33"/>
+    <w:bookmarkStart w:id="37" w:name="后端更新详情"/>
     <w:p>
       <w:pPr>
         <w:pStyle w:val="Heading2"/>
@@ -2658,7 +3092,7 @@
         <w:t xml:space="preserve">5. 后端更新详情</w:t>
       </w:r>
     </w:p>
-    <w:bookmarkStart w:id="33" w:name="fastapi-统一评分入口"/>
+    <w:bookmarkStart w:id="34" w:name="fastapi-统一评分入口"/>
     <w:p>
       <w:pPr>
         <w:pStyle w:val="Heading3"/>
@@ -2790,7 +3224,7 @@
       <w:pPr>
         <w:numPr>
           <w:ilvl w:val="0"/>
-          <w:numId w:val="1021"/>
+          <w:numId w:val="1024"/>
         </w:numPr>
         <w:pStyle w:val="Compact"/>
       </w:pPr>
@@ -2817,7 +3251,7 @@
       <w:pPr>
         <w:numPr>
           <w:ilvl w:val="0"/>
-          <w:numId w:val="1021"/>
+          <w:numId w:val="1024"/>
         </w:numPr>
         <w:pStyle w:val="Compact"/>
       </w:pPr>
@@ -2844,7 +3278,7 @@
       <w:pPr>
         <w:numPr>
           <w:ilvl w:val="0"/>
-          <w:numId w:val="1021"/>
+          <w:numId w:val="1024"/>
         </w:numPr>
         <w:pStyle w:val="Compact"/>
       </w:pPr>
@@ -2856,7 +3290,7 @@
       <w:pPr>
         <w:numPr>
           <w:ilvl w:val="0"/>
-          <w:numId w:val="1021"/>
+          <w:numId w:val="1024"/>
         </w:numPr>
         <w:pStyle w:val="Compact"/>
       </w:pPr>
@@ -2880,7 +3314,7 @@
       <w:pPr>
         <w:numPr>
           <w:ilvl w:val="0"/>
-          <w:numId w:val="1021"/>
+          <w:numId w:val="1024"/>
         </w:numPr>
         <w:pStyle w:val="Compact"/>
       </w:pPr>
@@ -2904,7 +3338,7 @@
       <w:pPr>
         <w:numPr>
           <w:ilvl w:val="0"/>
-          <w:numId w:val="1021"/>
+          <w:numId w:val="1024"/>
         </w:numPr>
         <w:pStyle w:val="Compact"/>
       </w:pPr>
@@ -2951,8 +3385,8 @@
         <w:t xml:space="preserve">。</w:t>
       </w:r>
     </w:p>
-    <w:bookmarkEnd w:id="33"/>
-    <w:bookmarkStart w:id="34" w:name="旧算法接入"/>
+    <w:bookmarkEnd w:id="34"/>
+    <w:bookmarkStart w:id="35" w:name="旧算法接入"/>
     <w:p>
       <w:pPr>
         <w:pStyle w:val="Heading3"/>
@@ -3011,7 +3445,7 @@
       <w:pPr>
         <w:numPr>
           <w:ilvl w:val="0"/>
-          <w:numId w:val="1022"/>
+          <w:numId w:val="1025"/>
         </w:numPr>
         <w:pStyle w:val="Compact"/>
       </w:pPr>
@@ -3034,7 +3468,7 @@
       <w:pPr>
         <w:numPr>
           <w:ilvl w:val="0"/>
-          <w:numId w:val="1023"/>
+          <w:numId w:val="1026"/>
         </w:numPr>
         <w:pStyle w:val="Compact"/>
       </w:pPr>
@@ -3057,7 +3491,7 @@
       <w:pPr>
         <w:numPr>
           <w:ilvl w:val="0"/>
-          <w:numId w:val="1024"/>
+          <w:numId w:val="1027"/>
         </w:numPr>
         <w:pStyle w:val="Compact"/>
       </w:pPr>
@@ -3089,7 +3523,7 @@
       <w:pPr>
         <w:numPr>
           <w:ilvl w:val="0"/>
-          <w:numId w:val="1025"/>
+          <w:numId w:val="1028"/>
         </w:numPr>
         <w:pStyle w:val="Compact"/>
       </w:pPr>
@@ -3117,8 +3551,8 @@
         <w:t xml:space="preserve">browser_local_fallback</w:t>
       </w:r>
     </w:p>
-    <w:bookmarkEnd w:id="34"/>
-    <w:bookmarkStart w:id="35" w:name="模板与语义权重"/>
+    <w:bookmarkEnd w:id="35"/>
+    <w:bookmarkStart w:id="36" w:name="模板与语义权重"/>
     <w:p>
       <w:pPr>
         <w:pStyle w:val="Heading3"/>
@@ -3205,7 +3639,7 @@
       <w:pPr>
         <w:numPr>
           <w:ilvl w:val="0"/>
-          <w:numId w:val="1026"/>
+          <w:numId w:val="1029"/>
         </w:numPr>
         <w:pStyle w:val="Compact"/>
       </w:pPr>
@@ -3217,7 +3651,7 @@
       <w:pPr>
         <w:numPr>
           <w:ilvl w:val="0"/>
-          <w:numId w:val="1026"/>
+          <w:numId w:val="1029"/>
         </w:numPr>
         <w:pStyle w:val="Compact"/>
       </w:pPr>
@@ -3229,7 +3663,7 @@
       <w:pPr>
         <w:numPr>
           <w:ilvl w:val="0"/>
-          <w:numId w:val="1026"/>
+          <w:numId w:val="1029"/>
         </w:numPr>
         <w:pStyle w:val="Compact"/>
       </w:pPr>
@@ -3237,9 +3671,9 @@
         <w:t xml:space="preserve">真实用户视频、隐私数据和大型生成缓存不应进入公开仓库。</w:t>
       </w:r>
     </w:p>
-    <w:bookmarkEnd w:id="35"/>
     <w:bookmarkEnd w:id="36"/>
-    <w:bookmarkStart w:id="40" w:name="modelscope-部署详情"/>
+    <w:bookmarkEnd w:id="37"/>
+    <w:bookmarkStart w:id="41" w:name="modelscope-部署详情"/>
     <w:p>
       <w:pPr>
         <w:pStyle w:val="Heading2"/>
@@ -3248,7 +3682,7 @@
         <w:t xml:space="preserve">6. ModelScope 部署详情</w:t>
       </w:r>
     </w:p>
-    <w:bookmarkStart w:id="37" w:name="full-docker-创空间"/>
+    <w:bookmarkStart w:id="38" w:name="full-docker-创空间"/>
     <w:p>
       <w:pPr>
         <w:pStyle w:val="Heading3"/>
@@ -3307,7 +3741,7 @@
       <w:pPr>
         <w:numPr>
           <w:ilvl w:val="0"/>
-          <w:numId w:val="1027"/>
+          <w:numId w:val="1030"/>
         </w:numPr>
         <w:pStyle w:val="Compact"/>
       </w:pPr>
@@ -3319,7 +3753,7 @@
       <w:pPr>
         <w:numPr>
           <w:ilvl w:val="0"/>
-          <w:numId w:val="1027"/>
+          <w:numId w:val="1030"/>
         </w:numPr>
         <w:pStyle w:val="Compact"/>
       </w:pPr>
@@ -3331,7 +3765,7 @@
       <w:pPr>
         <w:numPr>
           <w:ilvl w:val="0"/>
-          <w:numId w:val="1027"/>
+          <w:numId w:val="1030"/>
         </w:numPr>
         <w:pStyle w:val="Compact"/>
       </w:pPr>
@@ -3343,7 +3777,7 @@
       <w:pPr>
         <w:numPr>
           <w:ilvl w:val="0"/>
-          <w:numId w:val="1027"/>
+          <w:numId w:val="1030"/>
         </w:numPr>
         <w:pStyle w:val="Compact"/>
       </w:pPr>
@@ -3363,7 +3797,7 @@
       <w:pPr>
         <w:numPr>
           <w:ilvl w:val="0"/>
-          <w:numId w:val="1028"/>
+          <w:numId w:val="1031"/>
         </w:numPr>
         <w:pStyle w:val="Compact"/>
       </w:pPr>
@@ -3381,7 +3815,7 @@
       <w:pPr>
         <w:numPr>
           <w:ilvl w:val="0"/>
-          <w:numId w:val="1028"/>
+          <w:numId w:val="1031"/>
         </w:numPr>
         <w:pStyle w:val="Compact"/>
       </w:pPr>
@@ -3399,7 +3833,7 @@
       <w:pPr>
         <w:numPr>
           <w:ilvl w:val="0"/>
-          <w:numId w:val="1028"/>
+          <w:numId w:val="1031"/>
         </w:numPr>
         <w:pStyle w:val="Compact"/>
       </w:pPr>
@@ -3738,7 +4172,7 @@
       <w:pPr>
         <w:numPr>
           <w:ilvl w:val="0"/>
-          <w:numId w:val="1029"/>
+          <w:numId w:val="1032"/>
         </w:numPr>
         <w:pStyle w:val="Compact"/>
       </w:pPr>
@@ -3750,7 +4184,7 @@
       <w:pPr>
         <w:numPr>
           <w:ilvl w:val="0"/>
-          <w:numId w:val="1029"/>
+          <w:numId w:val="1032"/>
         </w:numPr>
         <w:pStyle w:val="Compact"/>
       </w:pPr>
@@ -3762,7 +4196,7 @@
       <w:pPr>
         <w:numPr>
           <w:ilvl w:val="0"/>
-          <w:numId w:val="1029"/>
+          <w:numId w:val="1032"/>
         </w:numPr>
         <w:pStyle w:val="Compact"/>
       </w:pPr>
@@ -3774,7 +4208,7 @@
       <w:pPr>
         <w:numPr>
           <w:ilvl w:val="0"/>
-          <w:numId w:val="1029"/>
+          <w:numId w:val="1032"/>
         </w:numPr>
         <w:pStyle w:val="Compact"/>
       </w:pPr>
@@ -3782,8 +4216,8 @@
         <w:t xml:space="preserve">full 路线仍受 ModelScope 免费 CPU 容器、MediaPipe 初始化和冷启动影响，实际评分可能较慢。</w:t>
       </w:r>
     </w:p>
-    <w:bookmarkEnd w:id="37"/>
-    <w:bookmarkStart w:id="38" w:name="lite-docker-创空间"/>
+    <w:bookmarkEnd w:id="38"/>
+    <w:bookmarkStart w:id="39" w:name="lite-docker-创空间"/>
     <w:p>
       <w:pPr>
         <w:pStyle w:val="Heading3"/>
@@ -3842,7 +4276,7 @@
       <w:pPr>
         <w:numPr>
           <w:ilvl w:val="0"/>
-          <w:numId w:val="1030"/>
+          <w:numId w:val="1033"/>
         </w:numPr>
         <w:pStyle w:val="Compact"/>
       </w:pPr>
@@ -3854,7 +4288,7 @@
       <w:pPr>
         <w:numPr>
           <w:ilvl w:val="0"/>
-          <w:numId w:val="1030"/>
+          <w:numId w:val="1033"/>
         </w:numPr>
         <w:pStyle w:val="Compact"/>
       </w:pPr>
@@ -3866,7 +4300,7 @@
       <w:pPr>
         <w:numPr>
           <w:ilvl w:val="0"/>
-          <w:numId w:val="1030"/>
+          <w:numId w:val="1033"/>
         </w:numPr>
         <w:pStyle w:val="Compact"/>
       </w:pPr>
@@ -3878,7 +4312,7 @@
       <w:pPr>
         <w:numPr>
           <w:ilvl w:val="0"/>
-          <w:numId w:val="1030"/>
+          <w:numId w:val="1033"/>
         </w:numPr>
         <w:pStyle w:val="Compact"/>
       </w:pPr>
@@ -3898,7 +4332,7 @@
       <w:pPr>
         <w:numPr>
           <w:ilvl w:val="0"/>
-          <w:numId w:val="1031"/>
+          <w:numId w:val="1034"/>
         </w:numPr>
         <w:pStyle w:val="Compact"/>
       </w:pPr>
@@ -3916,7 +4350,7 @@
       <w:pPr>
         <w:numPr>
           <w:ilvl w:val="0"/>
-          <w:numId w:val="1031"/>
+          <w:numId w:val="1034"/>
         </w:numPr>
         <w:pStyle w:val="Compact"/>
       </w:pPr>
@@ -3934,7 +4368,7 @@
       <w:pPr>
         <w:numPr>
           <w:ilvl w:val="0"/>
-          <w:numId w:val="1031"/>
+          <w:numId w:val="1034"/>
         </w:numPr>
         <w:pStyle w:val="Compact"/>
       </w:pPr>
@@ -4342,8 +4776,8 @@
         <w:t xml:space="preserve">你好、谢谢、爸爸、学习、文化</w:t>
       </w:r>
     </w:p>
-    <w:bookmarkEnd w:id="38"/>
-    <w:bookmarkStart w:id="39" w:name="full-与-lite-对比"/>
+    <w:bookmarkEnd w:id="39"/>
+    <w:bookmarkStart w:id="40" w:name="full-与-lite-对比"/>
     <w:p>
       <w:pPr>
         <w:pStyle w:val="Heading3"/>
@@ -4773,9 +5207,9 @@
         <w:t xml:space="preserve">GitHub Pages 前端 + Web Holistic + ModelScope lite API</w:t>
       </w:r>
     </w:p>
-    <w:bookmarkEnd w:id="39"/>
     <w:bookmarkEnd w:id="40"/>
-    <w:bookmarkStart w:id="44" w:name="github-pages-与-cicd"/>
+    <w:bookmarkEnd w:id="41"/>
+    <w:bookmarkStart w:id="45" w:name="github-pages-与-cicd"/>
     <w:p>
       <w:pPr>
         <w:pStyle w:val="Heading2"/>
@@ -4784,7 +5218,7 @@
         <w:t xml:space="preserve">7. GitHub Pages 与 CI/CD</w:t>
       </w:r>
     </w:p>
-    <w:bookmarkStart w:id="41" w:name="前端部署-workflow"/>
+    <w:bookmarkStart w:id="42" w:name="前端部署-workflow"/>
     <w:p>
       <w:pPr>
         <w:pStyle w:val="Heading3"/>
@@ -4824,7 +5258,7 @@
       <w:pPr>
         <w:numPr>
           <w:ilvl w:val="0"/>
-          <w:numId w:val="1032"/>
+          <w:numId w:val="1035"/>
         </w:numPr>
         <w:pStyle w:val="Compact"/>
       </w:pPr>
@@ -4845,7 +5279,7 @@
       <w:pPr>
         <w:numPr>
           <w:ilvl w:val="0"/>
-          <w:numId w:val="1032"/>
+          <w:numId w:val="1035"/>
         </w:numPr>
         <w:pStyle w:val="Compact"/>
       </w:pPr>
@@ -4911,8 +5345,8 @@
         <w:t xml:space="preserve">https://sign-language-universe.github.io/sign-language-universe/</w:t>
       </w:r>
     </w:p>
-    <w:bookmarkEnd w:id="41"/>
-    <w:bookmarkStart w:id="42" w:name="ci-workflow"/>
+    <w:bookmarkEnd w:id="42"/>
+    <w:bookmarkStart w:id="43" w:name="ci-workflow"/>
     <w:p>
       <w:pPr>
         <w:pStyle w:val="Heading3"/>
@@ -4952,7 +5386,7 @@
       <w:pPr>
         <w:numPr>
           <w:ilvl w:val="0"/>
-          <w:numId w:val="1033"/>
+          <w:numId w:val="1036"/>
         </w:numPr>
         <w:pStyle w:val="Compact"/>
       </w:pPr>
@@ -4964,7 +5398,7 @@
       <w:pPr>
         <w:numPr>
           <w:ilvl w:val="0"/>
-          <w:numId w:val="1033"/>
+          <w:numId w:val="1036"/>
         </w:numPr>
         <w:pStyle w:val="Compact"/>
       </w:pPr>
@@ -5005,7 +5439,7 @@
       <w:pPr>
         <w:numPr>
           <w:ilvl w:val="0"/>
-          <w:numId w:val="1034"/>
+          <w:numId w:val="1037"/>
         </w:numPr>
         <w:pStyle w:val="Compact"/>
       </w:pPr>
@@ -5024,8 +5458,8 @@
         <w:t xml:space="preserve">apps/web/index.html</w:t>
       </w:r>
     </w:p>
-    <w:bookmarkEnd w:id="42"/>
-    <w:bookmarkStart w:id="43" w:name="最近部署验证"/>
+    <w:bookmarkEnd w:id="43"/>
+    <w:bookmarkStart w:id="44" w:name="最近部署验证"/>
     <w:p>
       <w:pPr>
         <w:pStyle w:val="Heading3"/>
@@ -5039,14 +5473,14 @@
         <w:pStyle w:val="FirstParagraph"/>
       </w:pPr>
       <w:r>
-        <w:t xml:space="preserve">PR #20 合并后：</w:t>
-      </w:r>
-    </w:p>
-    <w:p>
-      <w:pPr>
-        <w:numPr>
-          <w:ilvl w:val="0"/>
-          <w:numId w:val="1035"/>
+        <w:t xml:space="preserve">PR #23 合并后：</w:t>
+      </w:r>
+    </w:p>
+    <w:p>
+      <w:pPr>
+        <w:numPr>
+          <w:ilvl w:val="0"/>
+          <w:numId w:val="1038"/>
         </w:numPr>
         <w:pStyle w:val="Compact"/>
       </w:pPr>
@@ -5058,7 +5492,7 @@
       <w:pPr>
         <w:numPr>
           <w:ilvl w:val="0"/>
-          <w:numId w:val="1035"/>
+          <w:numId w:val="1038"/>
         </w:numPr>
         <w:pStyle w:val="Compact"/>
       </w:pPr>
@@ -5070,7 +5504,7 @@
       <w:pPr>
         <w:numPr>
           <w:ilvl w:val="0"/>
-          <w:numId w:val="1035"/>
+          <w:numId w:val="1038"/>
         </w:numPr>
         <w:pStyle w:val="Compact"/>
       </w:pPr>
@@ -5117,7 +5551,7 @@
       <w:pPr>
         <w:numPr>
           <w:ilvl w:val="0"/>
-          <w:numId w:val="1036"/>
+          <w:numId w:val="1039"/>
         </w:numPr>
         <w:pStyle w:val="Compact"/>
       </w:pPr>
@@ -5168,10 +5602,75 @@
         </w:rPr>
         <w:t xml:space="preserve">DEFAULT_FRAME_WIDTH = 480</w:t>
       </w:r>
-    </w:p>
-    <w:bookmarkEnd w:id="43"/>
+      <w:r>
+        <w:br/>
+      </w:r>
+      <w:r>
+        <w:rPr>
+          <w:rStyle w:val="VerbatimChar"/>
+        </w:rPr>
+        <w:t xml:space="preserve">DEFAULT_SCORING_API_BASE = https://scottwyc-sign-language-universe-lite.ms.show</w:t>
+      </w:r>
+      <w:r>
+        <w:br/>
+      </w:r>
+      <w:r>
+        <w:rPr>
+          <w:rStyle w:val="VerbatimChar"/>
+        </w:rPr>
+        <w:t xml:space="preserve">retryBrowserHolistic</w:t>
+      </w:r>
+    </w:p>
+    <w:p>
+      <w:pPr>
+        <w:numPr>
+          <w:ilvl w:val="0"/>
+          <w:numId w:val="1040"/>
+        </w:numPr>
+        <w:pStyle w:val="Compact"/>
+      </w:pPr>
+      <w:r>
+        <w:t xml:space="preserve">线上</w:t>
+      </w:r>
+      <w:r>
+        <w:t xml:space="preserve"> </w:t>
+      </w:r>
+      <w:r>
+        <w:rPr>
+          <w:rStyle w:val="VerbatimChar"/>
+        </w:rPr>
+        <w:t xml:space="preserve">index.html</w:t>
+      </w:r>
+      <w:r>
+        <w:t xml:space="preserve"> </w:t>
+      </w:r>
+      <w:r>
+        <w:t xml:space="preserve">已确认包含：</w:t>
+      </w:r>
+    </w:p>
+    <w:p>
+      <w:pPr>
+        <w:pStyle w:val="SourceCode"/>
+      </w:pPr>
+      <w:r>
+        <w:rPr>
+          <w:rStyle w:val="VerbatimChar"/>
+        </w:rPr>
+        <w:t xml:space="preserve">scoring-holistic-retry-btn</w:t>
+      </w:r>
+      <w:r>
+        <w:br/>
+      </w:r>
+      <w:r>
+        <w:rPr>
+          <w:rStyle w:val="VerbatimChar"/>
+        </w:rPr>
+        <w:t xml:space="preserve">重新加载 Web Holistic</w:t>
+      </w:r>
+    </w:p>
     <w:bookmarkEnd w:id="44"/>
-    <w:bookmarkStart w:id="47" w:name="当前推荐使用方式"/>
+    <w:bookmarkEnd w:id="45"/>
+    <w:bookmarkStart w:id="48" w:name="当前推荐使用方式"/>
     <w:p>
       <w:pPr>
         <w:pStyle w:val="Heading2"/>
@@ -5180,7 +5679,7 @@
         <w:t xml:space="preserve">8. 当前推荐使用方式</w:t>
       </w:r>
     </w:p>
-    <w:bookmarkStart w:id="45" w:name="普通用户演示"/>
+    <w:bookmarkStart w:id="46" w:name="普通用户演示"/>
     <w:p>
       <w:pPr>
         <w:pStyle w:val="Heading3"/>
@@ -5220,7 +5719,7 @@
       <w:pPr>
         <w:numPr>
           <w:ilvl w:val="0"/>
-          <w:numId w:val="1037"/>
+          <w:numId w:val="1041"/>
         </w:numPr>
         <w:pStyle w:val="Compact"/>
       </w:pPr>
@@ -5232,12 +5731,56 @@
       <w:pPr>
         <w:numPr>
           <w:ilvl w:val="0"/>
-          <w:numId w:val="1037"/>
-        </w:numPr>
-        <w:pStyle w:val="Compact"/>
-      </w:pPr>
-      <w:r>
-        <w:t xml:space="preserve">API 地址填写：</w:t>
+          <w:numId w:val="1041"/>
+        </w:numPr>
+        <w:pStyle w:val="Compact"/>
+      </w:pPr>
+      <w:r>
+        <w:t xml:space="preserve">页面默认连接 ModelScope lite API，不需要手动填写评分 API 地址。</w:t>
+      </w:r>
+    </w:p>
+    <w:p>
+      <w:pPr>
+        <w:numPr>
+          <w:ilvl w:val="0"/>
+          <w:numId w:val="1041"/>
+        </w:numPr>
+        <w:pStyle w:val="Compact"/>
+      </w:pPr>
+      <w:r>
+        <w:t xml:space="preserve">点击“开始”。</w:t>
+      </w:r>
+    </w:p>
+    <w:p>
+      <w:pPr>
+        <w:numPr>
+          <w:ilvl w:val="0"/>
+          <w:numId w:val="1041"/>
+        </w:numPr>
+        <w:pStyle w:val="Compact"/>
+      </w:pPr>
+      <w:r>
+        <w:t xml:space="preserve">按示范完成手语动作。</w:t>
+      </w:r>
+    </w:p>
+    <w:p>
+      <w:pPr>
+        <w:numPr>
+          <w:ilvl w:val="0"/>
+          <w:numId w:val="1041"/>
+        </w:numPr>
+        <w:pStyle w:val="Compact"/>
+      </w:pPr>
+      <w:r>
+        <w:t xml:space="preserve">录制结束后自动评分。</w:t>
+      </w:r>
+    </w:p>
+    <w:p>
+      <w:pPr>
+        <w:pStyle w:val="FirstParagraph"/>
+      </w:pPr>
+      <w:r>
+        <w:t xml:space="preserve">如果需要切换到其他 API，可以手动填写“评分 API 地址”，也可以使用 URL 参数：</w:t>
       </w:r>
     </w:p>
     <w:p>
@@ -5248,43 +5791,17 @@
         <w:rPr>
           <w:rStyle w:val="VerbatimChar"/>
         </w:rPr>
-        <w:t xml:space="preserve">https://scottwyc-sign-language-universe-lite.ms.show</w:t>
-      </w:r>
-    </w:p>
-    <w:p>
-      <w:pPr>
-        <w:numPr>
-          <w:ilvl w:val="0"/>
-          <w:numId w:val="1038"/>
-        </w:numPr>
-        <w:pStyle w:val="Compact"/>
-      </w:pPr>
-      <w:r>
-        <w:t xml:space="preserve">点击“开始”。</w:t>
-      </w:r>
-    </w:p>
-    <w:p>
-      <w:pPr>
-        <w:numPr>
-          <w:ilvl w:val="0"/>
-          <w:numId w:val="1038"/>
-        </w:numPr>
-        <w:pStyle w:val="Compact"/>
-      </w:pPr>
-      <w:r>
-        <w:t xml:space="preserve">按示范完成手语动作。</w:t>
-      </w:r>
-    </w:p>
-    <w:p>
-      <w:pPr>
-        <w:numPr>
-          <w:ilvl w:val="0"/>
-          <w:numId w:val="1038"/>
-        </w:numPr>
-        <w:pStyle w:val="Compact"/>
-      </w:pPr>
-      <w:r>
-        <w:t xml:space="preserve">录制结束后自动评分。</w:t>
+        <w:t xml:space="preserve">https://sign-language-universe.github.io/sign-language-universe/?api=https://api.example.com</w:t>
+      </w:r>
+    </w:p>
+    <w:bookmarkEnd w:id="46"/>
+    <w:bookmarkStart w:id="47" w:name="开发者本地联调"/>
+    <w:p>
+      <w:pPr>
+        <w:pStyle w:val="Heading3"/>
+      </w:pPr>
+      <w:r>
+        <w:t xml:space="preserve">8.2 开发者本地联调</w:t>
       </w:r>
     </w:p>
     <w:p>
@@ -5292,7 +5809,7 @@
         <w:pStyle w:val="FirstParagraph"/>
       </w:pPr>
       <w:r>
-        <w:t xml:space="preserve">也可以使用 URL 参数：</w:t>
+        <w:t xml:space="preserve">前端静态服务：</w:t>
       </w:r>
     </w:p>
     <w:p>
@@ -5301,19 +5818,255 @@
       </w:pPr>
       <w:r>
         <w:rPr>
-          <w:rStyle w:val="VerbatimChar"/>
-        </w:rPr>
-        <w:t xml:space="preserve">https://sign-language-universe.github.io/sign-language-universe/?api=https://scottwyc-sign-language-universe-lite.ms.show</w:t>
-      </w:r>
-    </w:p>
-    <w:bookmarkEnd w:id="45"/>
-    <w:bookmarkStart w:id="46" w:name="开发者本地联调"/>
+          <w:rStyle w:val="BuiltInTok"/>
+        </w:rPr>
+        <w:t xml:space="preserve">cd</w:t>
+      </w:r>
+      <w:r>
+        <w:rPr>
+          <w:rStyle w:val="NormalTok"/>
+        </w:rPr>
+        <w:t xml:space="preserve"> /data/WYC/sign-language-universe</w:t>
+      </w:r>
+      <w:r>
+        <w:br/>
+      </w:r>
+      <w:r>
+        <w:rPr>
+          <w:rStyle w:val="ExtensionTok"/>
+        </w:rPr>
+        <w:t xml:space="preserve">/home/wuyangcheng/myenv/bin/python</w:t>
+      </w:r>
+      <w:r>
+        <w:rPr>
+          <w:rStyle w:val="NormalTok"/>
+        </w:rPr>
+        <w:t xml:space="preserve"> </w:t>
+      </w:r>
+      <w:r>
+        <w:rPr>
+          <w:rStyle w:val="AttributeTok"/>
+        </w:rPr>
+        <w:t xml:space="preserve">-m</w:t>
+      </w:r>
+      <w:r>
+        <w:rPr>
+          <w:rStyle w:val="NormalTok"/>
+        </w:rPr>
+        <w:t xml:space="preserve"> http.server 5173 </w:t>
+      </w:r>
+      <w:r>
+        <w:rPr>
+          <w:rStyle w:val="AttributeTok"/>
+        </w:rPr>
+        <w:t xml:space="preserve">--directory</w:t>
+      </w:r>
+      <w:r>
+        <w:rPr>
+          <w:rStyle w:val="NormalTok"/>
+        </w:rPr>
+        <w:t xml:space="preserve"> apps/web</w:t>
+      </w:r>
+    </w:p>
+    <w:p>
+      <w:pPr>
+        <w:pStyle w:val="FirstParagraph"/>
+      </w:pPr>
+      <w:r>
+        <w:t xml:space="preserve">本地后端：</w:t>
+      </w:r>
+    </w:p>
+    <w:p>
+      <w:pPr>
+        <w:pStyle w:val="SourceCode"/>
+      </w:pPr>
+      <w:r>
+        <w:rPr>
+          <w:rStyle w:val="BuiltInTok"/>
+        </w:rPr>
+        <w:t xml:space="preserve">cd</w:t>
+      </w:r>
+      <w:r>
+        <w:rPr>
+          <w:rStyle w:val="NormalTok"/>
+        </w:rPr>
+        <w:t xml:space="preserve"> /data/WYC/sign-language-universe</w:t>
+      </w:r>
+      <w:r>
+        <w:br/>
+      </w:r>
+      <w:r>
+        <w:rPr>
+          <w:rStyle w:val="ExtensionTok"/>
+        </w:rPr>
+        <w:t xml:space="preserve">pip</w:t>
+      </w:r>
+      <w:r>
+        <w:rPr>
+          <w:rStyle w:val="NormalTok"/>
+        </w:rPr>
+        <w:t xml:space="preserve"> install </w:t>
+      </w:r>
+      <w:r>
+        <w:rPr>
+          <w:rStyle w:val="AttributeTok"/>
+        </w:rPr>
+        <w:t xml:space="preserve">-r</w:t>
+      </w:r>
+      <w:r>
+        <w:rPr>
+          <w:rStyle w:val="NormalTok"/>
+        </w:rPr>
+        <w:t xml:space="preserve"> services/scoring-api/requirements.txt</w:t>
+      </w:r>
+      <w:r>
+        <w:br/>
+      </w:r>
+      <w:r>
+        <w:rPr>
+          <w:rStyle w:val="ExtensionTok"/>
+        </w:rPr>
+        <w:t xml:space="preserve">pip</w:t>
+      </w:r>
+      <w:r>
+        <w:rPr>
+          <w:rStyle w:val="NormalTok"/>
+        </w:rPr>
+        <w:t xml:space="preserve"> install </w:t>
+      </w:r>
+      <w:r>
+        <w:rPr>
+          <w:rStyle w:val="AttributeTok"/>
+        </w:rPr>
+        <w:t xml:space="preserve">-e</w:t>
+      </w:r>
+      <w:r>
+        <w:rPr>
+          <w:rStyle w:val="NormalTok"/>
+        </w:rPr>
+        <w:t xml:space="preserve"> packages/scoring-core</w:t>
+      </w:r>
+      <w:r>
+        <w:br/>
+      </w:r>
+      <w:r>
+        <w:rPr>
+          <w:rStyle w:val="ExtensionTok"/>
+        </w:rPr>
+        <w:t xml:space="preserve">uvicorn</w:t>
+      </w:r>
+      <w:r>
+        <w:rPr>
+          <w:rStyle w:val="NormalTok"/>
+        </w:rPr>
+        <w:t xml:space="preserve"> app.main:app </w:t>
+      </w:r>
+      <w:r>
+        <w:rPr>
+          <w:rStyle w:val="AttributeTok"/>
+        </w:rPr>
+        <w:t xml:space="preserve">--app-dir</w:t>
+      </w:r>
+      <w:r>
+        <w:rPr>
+          <w:rStyle w:val="NormalTok"/>
+        </w:rPr>
+        <w:t xml:space="preserve"> services/scoring-api </w:t>
+      </w:r>
+      <w:r>
+        <w:rPr>
+          <w:rStyle w:val="AttributeTok"/>
+        </w:rPr>
+        <w:t xml:space="preserve">--host</w:t>
+      </w:r>
+      <w:r>
+        <w:rPr>
+          <w:rStyle w:val="NormalTok"/>
+        </w:rPr>
+        <w:t xml:space="preserve"> 127.0.0.1 </w:t>
+      </w:r>
+      <w:r>
+        <w:rPr>
+          <w:rStyle w:val="AttributeTok"/>
+        </w:rPr>
+        <w:t xml:space="preserve">--port</w:t>
+      </w:r>
+      <w:r>
+        <w:rPr>
+          <w:rStyle w:val="NormalTok"/>
+        </w:rPr>
+        <w:t xml:space="preserve"> 5080</w:t>
+      </w:r>
+    </w:p>
+    <w:p>
+      <w:pPr>
+        <w:pStyle w:val="FirstParagraph"/>
+      </w:pPr>
+      <w:r>
+        <w:t xml:space="preserve">挑战页填写：</w:t>
+      </w:r>
+    </w:p>
+    <w:p>
+      <w:pPr>
+        <w:pStyle w:val="SourceCode"/>
+      </w:pPr>
+      <w:r>
+        <w:rPr>
+          <w:rStyle w:val="VerbatimChar"/>
+        </w:rPr>
+        <w:t xml:space="preserve">http://127.0.0.1:5080</w:t>
+      </w:r>
+    </w:p>
+    <w:p>
+      <w:pPr>
+        <w:pStyle w:val="FirstParagraph"/>
+      </w:pPr>
+      <w:r>
+        <w:t xml:space="preserve">注意：</w:t>
+      </w:r>
+    </w:p>
+    <w:p>
+      <w:pPr>
+        <w:numPr>
+          <w:ilvl w:val="0"/>
+          <w:numId w:val="1042"/>
+        </w:numPr>
+        <w:pStyle w:val="Compact"/>
+      </w:pPr>
+      <w:r>
+        <w:t xml:space="preserve">GitHub Pages 是 HTTPS，正式线上 API 也必须是 HTTPS。</w:t>
+      </w:r>
+    </w:p>
+    <w:p>
+      <w:pPr>
+        <w:numPr>
+          <w:ilvl w:val="0"/>
+          <w:numId w:val="1042"/>
+        </w:numPr>
+        <w:pStyle w:val="Compact"/>
+      </w:pPr>
+      <w:r>
+        <w:t xml:space="preserve">本地 HTTP API 只适合本机联调。</w:t>
+      </w:r>
+    </w:p>
+    <w:bookmarkEnd w:id="47"/>
+    <w:bookmarkEnd w:id="48"/>
+    <w:bookmarkStart w:id="52" w:name="关键问题解释"/>
+    <w:p>
+      <w:pPr>
+        <w:pStyle w:val="Heading2"/>
+      </w:pPr>
+      <w:r>
+        <w:t xml:space="preserve">9. 关键问题解释</w:t>
+      </w:r>
+    </w:p>
+    <w:bookmarkStart w:id="49" w:name="为什么-web-holistic-比服务端-holistic-快很多"/>
     <w:p>
       <w:pPr>
         <w:pStyle w:val="Heading3"/>
       </w:pPr>
       <w:r>
-        <w:t xml:space="preserve">8.2 开发者本地联调</w:t>
+        <w:t xml:space="preserve">9.1 为什么 Web Holistic 比服务端 Holistic 快很多</w:t>
       </w:r>
     </w:p>
     <w:p>
@@ -5321,7 +6074,296 @@
         <w:pStyle w:val="FirstParagraph"/>
       </w:pPr>
       <w:r>
-        <w:t xml:space="preserve">前端静态服务：</w:t>
+        <w:t xml:space="preserve">Web Holistic 快的主要原因：</w:t>
+      </w:r>
+    </w:p>
+    <w:p>
+      <w:pPr>
+        <w:numPr>
+          <w:ilvl w:val="0"/>
+          <w:numId w:val="1043"/>
+        </w:numPr>
+        <w:pStyle w:val="Compact"/>
+      </w:pPr>
+      <w:r>
+        <w:t xml:space="preserve">浏览器加载的是预编译的 JS/WASM/模型资源。</w:t>
+      </w:r>
+    </w:p>
+    <w:p>
+      <w:pPr>
+        <w:numPr>
+          <w:ilvl w:val="0"/>
+          <w:numId w:val="1043"/>
+        </w:numPr>
+        <w:pStyle w:val="Compact"/>
+      </w:pPr>
+      <w:r>
+        <w:t xml:space="preserve">资源可以被 CDN 和浏览器缓存。</w:t>
+      </w:r>
+    </w:p>
+    <w:p>
+      <w:pPr>
+        <w:numPr>
+          <w:ilvl w:val="0"/>
+          <w:numId w:val="1043"/>
+        </w:numPr>
+        <w:pStyle w:val="Compact"/>
+      </w:pPr>
+      <w:r>
+        <w:t xml:space="preserve">页面打开后即可后台预加载，不等用户点击开始。</w:t>
+      </w:r>
+    </w:p>
+    <w:p>
+      <w:pPr>
+        <w:numPr>
+          <w:ilvl w:val="0"/>
+          <w:numId w:val="1043"/>
+        </w:numPr>
+        <w:pStyle w:val="Compact"/>
+      </w:pPr>
+      <w:r>
+        <w:t xml:space="preserve">不需要启动 Python、OpenCV、MediaPipe Python 包和 worker 子进程。</w:t>
+      </w:r>
+    </w:p>
+    <w:p>
+      <w:pPr>
+        <w:numPr>
+          <w:ilvl w:val="0"/>
+          <w:numId w:val="1043"/>
+        </w:numPr>
+        <w:pStyle w:val="Compact"/>
+      </w:pPr>
+      <w:r>
+        <w:t xml:space="preserve">不需要经历 ModelScope 容器冷启动、存储挂载和服务端进程初始化。</w:t>
+      </w:r>
+    </w:p>
+    <w:p>
+      <w:pPr>
+        <w:pStyle w:val="FirstParagraph"/>
+      </w:pPr>
+      <w:r>
+        <w:t xml:space="preserve">服务端 Holistic 慢的主要原因：</w:t>
+      </w:r>
+    </w:p>
+    <w:p>
+      <w:pPr>
+        <w:numPr>
+          <w:ilvl w:val="0"/>
+          <w:numId w:val="1044"/>
+        </w:numPr>
+        <w:pStyle w:val="Compact"/>
+      </w:pPr>
+      <w:r>
+        <w:t xml:space="preserve">ModelScope 创空间可能有容器冷启动和资源调度。</w:t>
+      </w:r>
+    </w:p>
+    <w:p>
+      <w:pPr>
+        <w:numPr>
+          <w:ilvl w:val="0"/>
+          <w:numId w:val="1044"/>
+        </w:numPr>
+        <w:pStyle w:val="Compact"/>
+      </w:pPr>
+      <w:r>
+        <w:t xml:space="preserve">Python import</w:t>
+      </w:r>
+      <w:r>
+        <w:t xml:space="preserve"> </w:t>
+      </w:r>
+      <w:r>
+        <w:rPr>
+          <w:rStyle w:val="VerbatimChar"/>
+        </w:rPr>
+        <w:t xml:space="preserve">mediapipe/cv2/numpy</w:t>
+      </w:r>
+      <w:r>
+        <w:t xml:space="preserve"> </w:t>
+      </w:r>
+      <w:r>
+        <w:t xml:space="preserve">成本较高。</w:t>
+      </w:r>
+    </w:p>
+    <w:p>
+      <w:pPr>
+        <w:numPr>
+          <w:ilvl w:val="0"/>
+          <w:numId w:val="1044"/>
+        </w:numPr>
+        <w:pStyle w:val="Compact"/>
+      </w:pPr>
+      <w:r>
+        <w:t xml:space="preserve">MediaPipe graph/model 初始化较慢。</w:t>
+      </w:r>
+    </w:p>
+    <w:p>
+      <w:pPr>
+        <w:numPr>
+          <w:ilvl w:val="0"/>
+          <w:numId w:val="1044"/>
+        </w:numPr>
+        <w:pStyle w:val="Compact"/>
+      </w:pPr>
+      <w:r>
+        <w:t xml:space="preserve">worker 启动、健康检查和首次请求都可能触发额外等待。</w:t>
+      </w:r>
+    </w:p>
+    <w:p>
+      <w:pPr>
+        <w:pStyle w:val="FirstParagraph"/>
+      </w:pPr>
+      <w:r>
+        <w:t xml:space="preserve">因此当前路线把“关键点提取”移到浏览器是合理的。</w:t>
+      </w:r>
+    </w:p>
+    <w:bookmarkEnd w:id="49"/>
+    <w:bookmarkStart w:id="50" w:name="是否应该把完整打分算法也移入前端"/>
+    <w:p>
+      <w:pPr>
+        <w:pStyle w:val="Heading3"/>
+      </w:pPr>
+      <w:r>
+        <w:t xml:space="preserve">9.2 是否应该把完整打分算法也移入前端</w:t>
+      </w:r>
+    </w:p>
+    <w:p>
+      <w:pPr>
+        <w:pStyle w:val="FirstParagraph"/>
+      </w:pPr>
+      <w:r>
+        <w:t xml:space="preserve">短期可以做轻量本地评分 fallback，但不建议立即完全替代后端。</w:t>
+      </w:r>
+    </w:p>
+    <w:p>
+      <w:pPr>
+        <w:pStyle w:val="BodyText"/>
+      </w:pPr>
+      <w:r>
+        <w:t xml:space="preserve">适合放前端：</w:t>
+      </w:r>
+    </w:p>
+    <w:p>
+      <w:pPr>
+        <w:numPr>
+          <w:ilvl w:val="0"/>
+          <w:numId w:val="1045"/>
+        </w:numPr>
+        <w:pStyle w:val="Compact"/>
+      </w:pPr>
+      <w:r>
+        <w:t xml:space="preserve">Web Holistic 关键点提取。</w:t>
+      </w:r>
+    </w:p>
+    <w:p>
+      <w:pPr>
+        <w:numPr>
+          <w:ilvl w:val="0"/>
+          <w:numId w:val="1045"/>
+        </w:numPr>
+        <w:pStyle w:val="Compact"/>
+      </w:pPr>
+      <w:r>
+        <w:t xml:space="preserve">快速本地预览分。</w:t>
+      </w:r>
+    </w:p>
+    <w:p>
+      <w:pPr>
+        <w:numPr>
+          <w:ilvl w:val="0"/>
+          <w:numId w:val="1045"/>
+        </w:numPr>
+        <w:pStyle w:val="Compact"/>
+      </w:pPr>
+      <w:r>
+        <w:t xml:space="preserve">少量模板的教学 demo。</w:t>
+      </w:r>
+    </w:p>
+    <w:p>
+      <w:pPr>
+        <w:numPr>
+          <w:ilvl w:val="0"/>
+          <w:numId w:val="1045"/>
+        </w:numPr>
+        <w:pStyle w:val="Compact"/>
+      </w:pPr>
+      <w:r>
+        <w:t xml:space="preserve">离线/弱网演示。</w:t>
+      </w:r>
+    </w:p>
+    <w:p>
+      <w:pPr>
+        <w:pStyle w:val="FirstParagraph"/>
+      </w:pPr>
+      <w:r>
+        <w:t xml:space="preserve">建议留后端：</w:t>
+      </w:r>
+    </w:p>
+    <w:p>
+      <w:pPr>
+        <w:numPr>
+          <w:ilvl w:val="0"/>
+          <w:numId w:val="1046"/>
+        </w:numPr>
+        <w:pStyle w:val="Compact"/>
+      </w:pPr>
+      <w:r>
+        <w:t xml:space="preserve">权威模板版本管理。</w:t>
+      </w:r>
+    </w:p>
+    <w:p>
+      <w:pPr>
+        <w:numPr>
+          <w:ilvl w:val="0"/>
+          <w:numId w:val="1046"/>
+        </w:numPr>
+        <w:pStyle w:val="Compact"/>
+      </w:pPr>
+      <w:r>
+        <w:t xml:space="preserve">算法版本和校准参数。</w:t>
+      </w:r>
+    </w:p>
+    <w:p>
+      <w:pPr>
+        <w:numPr>
+          <w:ilvl w:val="0"/>
+          <w:numId w:val="1046"/>
+        </w:numPr>
+        <w:pStyle w:val="Compact"/>
+      </w:pPr>
+      <w:r>
+        <w:t xml:space="preserve">排行榜、防篡改和正式测评。</w:t>
+      </w:r>
+    </w:p>
+    <w:p>
+      <w:pPr>
+        <w:numPr>
+          <w:ilvl w:val="0"/>
+          <w:numId w:val="1046"/>
+        </w:numPr>
+        <w:pStyle w:val="Compact"/>
+      </w:pPr>
+      <w:r>
+        <w:t xml:space="preserve">用户样本记录和后续人工标注。</w:t>
+      </w:r>
+    </w:p>
+    <w:p>
+      <w:pPr>
+        <w:numPr>
+          <w:ilvl w:val="0"/>
+          <w:numId w:val="1046"/>
+        </w:numPr>
+        <w:pStyle w:val="Compact"/>
+      </w:pPr>
+      <w:r>
+        <w:t xml:space="preserve">更完整的诊断报告。</w:t>
+      </w:r>
+    </w:p>
+    <w:p>
+      <w:pPr>
+        <w:pStyle w:val="FirstParagraph"/>
+      </w:pPr>
+      <w:r>
+        <w:t xml:space="preserve">推荐演进：</w:t>
       </w:r>
     </w:p>
     <w:p>
@@ -5330,54 +6372,162 @@
       </w:pPr>
       <w:r>
         <w:rPr>
-          <w:rStyle w:val="BuiltInTok"/>
-        </w:rPr>
-        <w:t xml:space="preserve">cd</w:t>
-      </w:r>
-      <w:r>
-        <w:rPr>
-          <w:rStyle w:val="NormalTok"/>
-        </w:rPr>
-        <w:t xml:space="preserve"> /data/WYC/sign-language-universe</w:t>
-      </w:r>
-      <w:r>
-        <w:br/>
-      </w:r>
-      <w:r>
-        <w:rPr>
-          <w:rStyle w:val="ExtensionTok"/>
-        </w:rPr>
-        <w:t xml:space="preserve">/home/wuyangcheng/myenv/bin/python</w:t>
-      </w:r>
-      <w:r>
-        <w:rPr>
-          <w:rStyle w:val="NormalTok"/>
-        </w:rPr>
+          <w:rStyle w:val="VerbatimChar"/>
+        </w:rPr>
+        <w:t xml:space="preserve">阶段 1：浏览器提关键点 + 后端权威模板评分</w:t>
+      </w:r>
+      <w:r>
+        <w:br/>
+      </w:r>
+      <w:r>
+        <w:rPr>
+          <w:rStyle w:val="VerbatimChar"/>
+        </w:rPr>
+        <w:t xml:space="preserve">阶段 2：前端增加轻量模板评分 fallback</w:t>
+      </w:r>
+      <w:r>
+        <w:br/>
+      </w:r>
+      <w:r>
+        <w:rPr>
+          <w:rStyle w:val="VerbatimChar"/>
+        </w:rPr>
+        <w:t xml:space="preserve">阶段 3：后端保留权威评分、日志和数据闭环</w:t>
+      </w:r>
+    </w:p>
+    <w:bookmarkEnd w:id="50"/>
+    <w:bookmarkStart w:id="51" w:name="web-holistic-不可用与重试策略"/>
+    <w:p>
+      <w:pPr>
+        <w:pStyle w:val="Heading3"/>
+      </w:pPr>
+      <w:r>
+        <w:t xml:space="preserve">9.3 Web Holistic 不可用与重试策略</w:t>
+      </w:r>
+    </w:p>
+    <w:p>
+      <w:pPr>
+        <w:pStyle w:val="FirstParagraph"/>
+      </w:pPr>
+      <w:r>
+        <w:t xml:space="preserve">当前 Web Holistic 可能不可用的主要情况：</w:t>
+      </w:r>
+    </w:p>
+    <w:p>
+      <w:pPr>
+        <w:numPr>
+          <w:ilvl w:val="0"/>
+          <w:numId w:val="1047"/>
+        </w:numPr>
+        <w:pStyle w:val="Compact"/>
+      </w:pPr>
+      <w:r>
+        <w:rPr>
+          <w:rStyle w:val="VerbatimChar"/>
+        </w:rPr>
+        <w:t xml:space="preserve">cdn.jsdelivr.net</w:t>
+      </w:r>
+      <w:r>
         <w:t xml:space="preserve"> </w:t>
       </w:r>
       <w:r>
-        <w:rPr>
-          <w:rStyle w:val="AttributeTok"/>
-        </w:rPr>
-        <w:t xml:space="preserve">-m</w:t>
-      </w:r>
-      <w:r>
-        <w:rPr>
-          <w:rStyle w:val="NormalTok"/>
-        </w:rPr>
-        <w:t xml:space="preserve"> http.server 5173 </w:t>
-      </w:r>
-      <w:r>
-        <w:rPr>
-          <w:rStyle w:val="AttributeTok"/>
-        </w:rPr>
-        <w:t xml:space="preserve">--directory</w:t>
-      </w:r>
-      <w:r>
-        <w:rPr>
-          <w:rStyle w:val="NormalTok"/>
-        </w:rPr>
-        <w:t xml:space="preserve"> apps/web</w:t>
+        <w:t xml:space="preserve">脚本加载失败或超过</w:t>
+      </w:r>
+      <w:r>
+        <w:t xml:space="preserve"> </w:t>
+      </w:r>
+      <w:r>
+        <w:rPr>
+          <w:rStyle w:val="VerbatimChar"/>
+        </w:rPr>
+        <w:t xml:space="preserve">12s</w:t>
+      </w:r>
+      <w:r>
+        <w:t xml:space="preserve">。</w:t>
+      </w:r>
+    </w:p>
+    <w:p>
+      <w:pPr>
+        <w:numPr>
+          <w:ilvl w:val="0"/>
+          <w:numId w:val="1047"/>
+        </w:numPr>
+        <w:pStyle w:val="Compact"/>
+      </w:pPr>
+      <w:r>
+        <w:t xml:space="preserve">脚本加载后没有正确暴露</w:t>
+      </w:r>
+      <w:r>
+        <w:t xml:space="preserve"> </w:t>
+      </w:r>
+      <w:r>
+        <w:rPr>
+          <w:rStyle w:val="VerbatimChar"/>
+        </w:rPr>
+        <w:t xml:space="preserve">window.Holistic</w:t>
+      </w:r>
+      <w:r>
+        <w:t xml:space="preserve">。</w:t>
+      </w:r>
+    </w:p>
+    <w:p>
+      <w:pPr>
+        <w:numPr>
+          <w:ilvl w:val="0"/>
+          <w:numId w:val="1047"/>
+        </w:numPr>
+        <w:pStyle w:val="Compact"/>
+      </w:pPr>
+      <w:r>
+        <w:t xml:space="preserve">首次预热或摄像头画面预热失败。</w:t>
+      </w:r>
+    </w:p>
+    <w:p>
+      <w:pPr>
+        <w:numPr>
+          <w:ilvl w:val="0"/>
+          <w:numId w:val="1047"/>
+        </w:numPr>
+        <w:pStyle w:val="Compact"/>
+      </w:pPr>
+      <w:r>
+        <w:t xml:space="preserve">单帧处理超过</w:t>
+      </w:r>
+      <w:r>
+        <w:t xml:space="preserve"> </w:t>
+      </w:r>
+      <w:r>
+        <w:rPr>
+          <w:rStyle w:val="VerbatimChar"/>
+        </w:rPr>
+        <w:t xml:space="preserve">3.5s</w:t>
+      </w:r>
+      <w:r>
+        <w:t xml:space="preserve">。</w:t>
+      </w:r>
+    </w:p>
+    <w:p>
+      <w:pPr>
+        <w:numPr>
+          <w:ilvl w:val="0"/>
+          <w:numId w:val="1047"/>
+        </w:numPr>
+        <w:pStyle w:val="Compact"/>
+      </w:pPr>
+      <w:r>
+        <w:t xml:space="preserve">浏览器不支持或限制 WebAssembly/WebGL/MediaPipe 相关能力。</w:t>
+      </w:r>
+    </w:p>
+    <w:p>
+      <w:pPr>
+        <w:numPr>
+          <w:ilvl w:val="0"/>
+          <w:numId w:val="1047"/>
+        </w:numPr>
+        <w:pStyle w:val="Compact"/>
+      </w:pPr>
+      <w:r>
+        <w:t xml:space="preserve">页面后台运行或低性能设备导致执行被明显限速。</w:t>
       </w:r>
     </w:p>
     <w:p>
@@ -5385,536 +6535,104 @@
         <w:pStyle w:val="FirstParagraph"/>
       </w:pPr>
       <w:r>
-        <w:t xml:space="preserve">本地后端：</w:t>
-      </w:r>
-    </w:p>
-    <w:p>
-      <w:pPr>
-        <w:pStyle w:val="SourceCode"/>
-      </w:pPr>
-      <w:r>
-        <w:rPr>
-          <w:rStyle w:val="BuiltInTok"/>
-        </w:rPr>
-        <w:t xml:space="preserve">cd</w:t>
-      </w:r>
-      <w:r>
-        <w:rPr>
-          <w:rStyle w:val="NormalTok"/>
-        </w:rPr>
-        <w:t xml:space="preserve"> /data/WYC/sign-language-universe</w:t>
-      </w:r>
-      <w:r>
-        <w:br/>
-      </w:r>
-      <w:r>
-        <w:rPr>
-          <w:rStyle w:val="ExtensionTok"/>
-        </w:rPr>
-        <w:t xml:space="preserve">pip</w:t>
-      </w:r>
-      <w:r>
-        <w:rPr>
-          <w:rStyle w:val="NormalTok"/>
-        </w:rPr>
-        <w:t xml:space="preserve"> install </w:t>
-      </w:r>
-      <w:r>
-        <w:rPr>
-          <w:rStyle w:val="AttributeTok"/>
-        </w:rPr>
-        <w:t xml:space="preserve">-r</w:t>
-      </w:r>
-      <w:r>
-        <w:rPr>
-          <w:rStyle w:val="NormalTok"/>
-        </w:rPr>
-        <w:t xml:space="preserve"> services/scoring-api/requirements.txt</w:t>
-      </w:r>
-      <w:r>
-        <w:br/>
-      </w:r>
-      <w:r>
-        <w:rPr>
-          <w:rStyle w:val="ExtensionTok"/>
-        </w:rPr>
-        <w:t xml:space="preserve">pip</w:t>
-      </w:r>
-      <w:r>
-        <w:rPr>
-          <w:rStyle w:val="NormalTok"/>
-        </w:rPr>
-        <w:t xml:space="preserve"> install </w:t>
-      </w:r>
-      <w:r>
-        <w:rPr>
-          <w:rStyle w:val="AttributeTok"/>
-        </w:rPr>
-        <w:t xml:space="preserve">-e</w:t>
-      </w:r>
-      <w:r>
-        <w:rPr>
-          <w:rStyle w:val="NormalTok"/>
-        </w:rPr>
-        <w:t xml:space="preserve"> packages/scoring-core</w:t>
-      </w:r>
-      <w:r>
-        <w:br/>
-      </w:r>
-      <w:r>
-        <w:rPr>
-          <w:rStyle w:val="ExtensionTok"/>
-        </w:rPr>
-        <w:t xml:space="preserve">uvicorn</w:t>
-      </w:r>
-      <w:r>
-        <w:rPr>
-          <w:rStyle w:val="NormalTok"/>
-        </w:rPr>
-        <w:t xml:space="preserve"> app.main:app </w:t>
-      </w:r>
-      <w:r>
-        <w:rPr>
-          <w:rStyle w:val="AttributeTok"/>
-        </w:rPr>
-        <w:t xml:space="preserve">--app-dir</w:t>
-      </w:r>
-      <w:r>
-        <w:rPr>
-          <w:rStyle w:val="NormalTok"/>
-        </w:rPr>
-        <w:t xml:space="preserve"> services/scoring-api </w:t>
-      </w:r>
-      <w:r>
-        <w:rPr>
-          <w:rStyle w:val="AttributeTok"/>
-        </w:rPr>
-        <w:t xml:space="preserve">--host</w:t>
-      </w:r>
-      <w:r>
-        <w:rPr>
-          <w:rStyle w:val="NormalTok"/>
-        </w:rPr>
-        <w:t xml:space="preserve"> 127.0.0.1 </w:t>
-      </w:r>
-      <w:r>
-        <w:rPr>
-          <w:rStyle w:val="AttributeTok"/>
-        </w:rPr>
-        <w:t xml:space="preserve">--port</w:t>
-      </w:r>
-      <w:r>
-        <w:rPr>
-          <w:rStyle w:val="NormalTok"/>
-        </w:rPr>
-        <w:t xml:space="preserve"> 5080</w:t>
-      </w:r>
-    </w:p>
-    <w:p>
-      <w:pPr>
-        <w:pStyle w:val="FirstParagraph"/>
-      </w:pPr>
-      <w:r>
-        <w:t xml:space="preserve">挑战页填写：</w:t>
-      </w:r>
-    </w:p>
-    <w:p>
-      <w:pPr>
-        <w:pStyle w:val="SourceCode"/>
-      </w:pPr>
-      <w:r>
-        <w:rPr>
-          <w:rStyle w:val="VerbatimChar"/>
-        </w:rPr>
-        <w:t xml:space="preserve">http://127.0.0.1:5080</w:t>
-      </w:r>
-    </w:p>
-    <w:p>
-      <w:pPr>
-        <w:pStyle w:val="FirstParagraph"/>
-      </w:pPr>
-      <w:r>
-        <w:t xml:space="preserve">注意：</w:t>
-      </w:r>
-    </w:p>
-    <w:p>
-      <w:pPr>
-        <w:numPr>
-          <w:ilvl w:val="0"/>
-          <w:numId w:val="1039"/>
-        </w:numPr>
-        <w:pStyle w:val="Compact"/>
-      </w:pPr>
-      <w:r>
-        <w:t xml:space="preserve">GitHub Pages 是 HTTPS，正式线上 API 也必须是 HTTPS。</w:t>
-      </w:r>
-    </w:p>
-    <w:p>
-      <w:pPr>
-        <w:numPr>
-          <w:ilvl w:val="0"/>
-          <w:numId w:val="1039"/>
-        </w:numPr>
-        <w:pStyle w:val="Compact"/>
-      </w:pPr>
-      <w:r>
-        <w:t xml:space="preserve">本地 HTTP API 只适合本机联调。</w:t>
-      </w:r>
-    </w:p>
-    <w:bookmarkEnd w:id="46"/>
-    <w:bookmarkEnd w:id="47"/>
-    <w:bookmarkStart w:id="50" w:name="关键问题解释"/>
+        <w:t xml:space="preserve">已实现的重试策略：</w:t>
+      </w:r>
+    </w:p>
+    <w:p>
+      <w:pPr>
+        <w:numPr>
+          <w:ilvl w:val="0"/>
+          <w:numId w:val="1048"/>
+        </w:numPr>
+        <w:pStyle w:val="Compact"/>
+      </w:pPr>
+      <w:r>
+        <w:t xml:space="preserve">当 Web Holistic 状态进入 offline 时，显示“重新加载 Web Holistic”按钮。</w:t>
+      </w:r>
+    </w:p>
+    <w:p>
+      <w:pPr>
+        <w:numPr>
+          <w:ilvl w:val="0"/>
+          <w:numId w:val="1048"/>
+        </w:numPr>
+        <w:pStyle w:val="Compact"/>
+      </w:pPr>
+      <w:r>
+        <w:t xml:space="preserve">用户点击后，前端会清理</w:t>
+      </w:r>
+      <w:r>
+        <w:t xml:space="preserve"> </w:t>
+      </w:r>
+      <w:r>
+        <w:rPr>
+          <w:rStyle w:val="VerbatimChar"/>
+        </w:rPr>
+        <w:t xml:space="preserve">browserHolisticUnavailable</w:t>
+      </w:r>
+      <w:r>
+        <w:t xml:space="preserve">、loading promise、pending frame 等状态。</w:t>
+      </w:r>
+    </w:p>
+    <w:p>
+      <w:pPr>
+        <w:numPr>
+          <w:ilvl w:val="0"/>
+          <w:numId w:val="1048"/>
+        </w:numPr>
+        <w:pStyle w:val="Compact"/>
+      </w:pPr>
+      <w:r>
+        <w:t xml:space="preserve">如果失败的</w:t>
+      </w:r>
+      <w:r>
+        <w:t xml:space="preserve"> </w:t>
+      </w:r>
+      <w:r>
+        <w:rPr>
+          <w:rStyle w:val="VerbatimChar"/>
+        </w:rPr>
+        <w:t xml:space="preserve">&lt;script&gt;</w:t>
+      </w:r>
+      <w:r>
+        <w:t xml:space="preserve"> </w:t>
+      </w:r>
+      <w:r>
+        <w:t xml:space="preserve">标签残留在页面中，重试前会移除该标签，避免“假重试”。</w:t>
+      </w:r>
+    </w:p>
+    <w:p>
+      <w:pPr>
+        <w:numPr>
+          <w:ilvl w:val="0"/>
+          <w:numId w:val="1048"/>
+        </w:numPr>
+        <w:pStyle w:val="Compact"/>
+      </w:pPr>
+      <w:r>
+        <w:t xml:space="preserve">重试成功后恢复 Web Holistic landmark 上传路线。</w:t>
+      </w:r>
+    </w:p>
+    <w:p>
+      <w:pPr>
+        <w:numPr>
+          <w:ilvl w:val="0"/>
+          <w:numId w:val="1048"/>
+        </w:numPr>
+        <w:pStyle w:val="Compact"/>
+      </w:pPr>
+      <w:r>
+        <w:t xml:space="preserve">重试仍失败时，前端继续保留压缩帧或本地 fallback 评分路径。</w:t>
+      </w:r>
+    </w:p>
+    <w:bookmarkEnd w:id="51"/>
+    <w:bookmarkEnd w:id="52"/>
+    <w:bookmarkStart w:id="53" w:name="当前限制"/>
     <w:p>
       <w:pPr>
         <w:pStyle w:val="Heading2"/>
       </w:pPr>
       <w:r>
-        <w:t xml:space="preserve">9. 关键问题解释</w:t>
-      </w:r>
-    </w:p>
-    <w:bookmarkStart w:id="48" w:name="为什么-web-holistic-比服务端-holistic-快很多"/>
-    <w:p>
-      <w:pPr>
-        <w:pStyle w:val="Heading3"/>
-      </w:pPr>
-      <w:r>
-        <w:t xml:space="preserve">9.1 为什么 Web Holistic 比服务端 Holistic 快很多</w:t>
-      </w:r>
-    </w:p>
-    <w:p>
-      <w:pPr>
-        <w:pStyle w:val="FirstParagraph"/>
-      </w:pPr>
-      <w:r>
-        <w:t xml:space="preserve">Web Holistic 快的主要原因：</w:t>
-      </w:r>
-    </w:p>
-    <w:p>
-      <w:pPr>
-        <w:numPr>
-          <w:ilvl w:val="0"/>
-          <w:numId w:val="1040"/>
-        </w:numPr>
-        <w:pStyle w:val="Compact"/>
-      </w:pPr>
-      <w:r>
-        <w:t xml:space="preserve">浏览器加载的是预编译的 JS/WASM/模型资源。</w:t>
-      </w:r>
-    </w:p>
-    <w:p>
-      <w:pPr>
-        <w:numPr>
-          <w:ilvl w:val="0"/>
-          <w:numId w:val="1040"/>
-        </w:numPr>
-        <w:pStyle w:val="Compact"/>
-      </w:pPr>
-      <w:r>
-        <w:t xml:space="preserve">资源可以被 CDN 和浏览器缓存。</w:t>
-      </w:r>
-    </w:p>
-    <w:p>
-      <w:pPr>
-        <w:numPr>
-          <w:ilvl w:val="0"/>
-          <w:numId w:val="1040"/>
-        </w:numPr>
-        <w:pStyle w:val="Compact"/>
-      </w:pPr>
-      <w:r>
-        <w:t xml:space="preserve">页面打开后即可后台预加载，不等用户点击开始。</w:t>
-      </w:r>
-    </w:p>
-    <w:p>
-      <w:pPr>
-        <w:numPr>
-          <w:ilvl w:val="0"/>
-          <w:numId w:val="1040"/>
-        </w:numPr>
-        <w:pStyle w:val="Compact"/>
-      </w:pPr>
-      <w:r>
-        <w:t xml:space="preserve">不需要启动 Python、OpenCV、MediaPipe Python 包和 worker 子进程。</w:t>
-      </w:r>
-    </w:p>
-    <w:p>
-      <w:pPr>
-        <w:numPr>
-          <w:ilvl w:val="0"/>
-          <w:numId w:val="1040"/>
-        </w:numPr>
-        <w:pStyle w:val="Compact"/>
-      </w:pPr>
-      <w:r>
-        <w:t xml:space="preserve">不需要经历 ModelScope 容器冷启动、存储挂载和服务端进程初始化。</w:t>
-      </w:r>
-    </w:p>
-    <w:p>
-      <w:pPr>
-        <w:pStyle w:val="FirstParagraph"/>
-      </w:pPr>
-      <w:r>
-        <w:t xml:space="preserve">服务端 Holistic 慢的主要原因：</w:t>
-      </w:r>
-    </w:p>
-    <w:p>
-      <w:pPr>
-        <w:numPr>
-          <w:ilvl w:val="0"/>
-          <w:numId w:val="1041"/>
-        </w:numPr>
-        <w:pStyle w:val="Compact"/>
-      </w:pPr>
-      <w:r>
-        <w:t xml:space="preserve">ModelScope 创空间可能有容器冷启动和资源调度。</w:t>
-      </w:r>
-    </w:p>
-    <w:p>
-      <w:pPr>
-        <w:numPr>
-          <w:ilvl w:val="0"/>
-          <w:numId w:val="1041"/>
-        </w:numPr>
-        <w:pStyle w:val="Compact"/>
-      </w:pPr>
-      <w:r>
-        <w:t xml:space="preserve">Python import</w:t>
-      </w:r>
-      <w:r>
-        <w:t xml:space="preserve"> </w:t>
-      </w:r>
-      <w:r>
-        <w:rPr>
-          <w:rStyle w:val="VerbatimChar"/>
-        </w:rPr>
-        <w:t xml:space="preserve">mediapipe/cv2/numpy</w:t>
-      </w:r>
-      <w:r>
-        <w:t xml:space="preserve"> </w:t>
-      </w:r>
-      <w:r>
-        <w:t xml:space="preserve">成本较高。</w:t>
-      </w:r>
-    </w:p>
-    <w:p>
-      <w:pPr>
-        <w:numPr>
-          <w:ilvl w:val="0"/>
-          <w:numId w:val="1041"/>
-        </w:numPr>
-        <w:pStyle w:val="Compact"/>
-      </w:pPr>
-      <w:r>
-        <w:t xml:space="preserve">MediaPipe graph/model 初始化较慢。</w:t>
-      </w:r>
-    </w:p>
-    <w:p>
-      <w:pPr>
-        <w:numPr>
-          <w:ilvl w:val="0"/>
-          <w:numId w:val="1041"/>
-        </w:numPr>
-        <w:pStyle w:val="Compact"/>
-      </w:pPr>
-      <w:r>
-        <w:t xml:space="preserve">worker 启动、健康检查和首次请求都可能触发额外等待。</w:t>
-      </w:r>
-    </w:p>
-    <w:p>
-      <w:pPr>
-        <w:pStyle w:val="FirstParagraph"/>
-      </w:pPr>
-      <w:r>
-        <w:t xml:space="preserve">因此当前路线把“关键点提取”移到浏览器是合理的。</w:t>
-      </w:r>
-    </w:p>
-    <w:bookmarkEnd w:id="48"/>
-    <w:bookmarkStart w:id="49" w:name="是否应该把完整打分算法也移入前端"/>
-    <w:p>
-      <w:pPr>
-        <w:pStyle w:val="Heading3"/>
-      </w:pPr>
-      <w:r>
-        <w:t xml:space="preserve">9.2 是否应该把完整打分算法也移入前端</w:t>
-      </w:r>
-    </w:p>
-    <w:p>
-      <w:pPr>
-        <w:pStyle w:val="FirstParagraph"/>
-      </w:pPr>
-      <w:r>
-        <w:t xml:space="preserve">短期可以做轻量本地评分 fallback，但不建议立即完全替代后端。</w:t>
-      </w:r>
-    </w:p>
-    <w:p>
-      <w:pPr>
-        <w:pStyle w:val="BodyText"/>
-      </w:pPr>
-      <w:r>
-        <w:t xml:space="preserve">适合放前端：</w:t>
-      </w:r>
-    </w:p>
-    <w:p>
-      <w:pPr>
-        <w:numPr>
-          <w:ilvl w:val="0"/>
-          <w:numId w:val="1042"/>
-        </w:numPr>
-        <w:pStyle w:val="Compact"/>
-      </w:pPr>
-      <w:r>
-        <w:t xml:space="preserve">Web Holistic 关键点提取。</w:t>
-      </w:r>
-    </w:p>
-    <w:p>
-      <w:pPr>
-        <w:numPr>
-          <w:ilvl w:val="0"/>
-          <w:numId w:val="1042"/>
-        </w:numPr>
-        <w:pStyle w:val="Compact"/>
-      </w:pPr>
-      <w:r>
-        <w:t xml:space="preserve">快速本地预览分。</w:t>
-      </w:r>
-    </w:p>
-    <w:p>
-      <w:pPr>
-        <w:numPr>
-          <w:ilvl w:val="0"/>
-          <w:numId w:val="1042"/>
-        </w:numPr>
-        <w:pStyle w:val="Compact"/>
-      </w:pPr>
-      <w:r>
-        <w:t xml:space="preserve">少量模板的教学 demo。</w:t>
-      </w:r>
-    </w:p>
-    <w:p>
-      <w:pPr>
-        <w:numPr>
-          <w:ilvl w:val="0"/>
-          <w:numId w:val="1042"/>
-        </w:numPr>
-        <w:pStyle w:val="Compact"/>
-      </w:pPr>
-      <w:r>
-        <w:t xml:space="preserve">离线/弱网演示。</w:t>
-      </w:r>
-    </w:p>
-    <w:p>
-      <w:pPr>
-        <w:pStyle w:val="FirstParagraph"/>
-      </w:pPr>
-      <w:r>
-        <w:t xml:space="preserve">建议留后端：</w:t>
-      </w:r>
-    </w:p>
-    <w:p>
-      <w:pPr>
-        <w:numPr>
-          <w:ilvl w:val="0"/>
-          <w:numId w:val="1043"/>
-        </w:numPr>
-        <w:pStyle w:val="Compact"/>
-      </w:pPr>
-      <w:r>
-        <w:t xml:space="preserve">权威模板版本管理。</w:t>
-      </w:r>
-    </w:p>
-    <w:p>
-      <w:pPr>
-        <w:numPr>
-          <w:ilvl w:val="0"/>
-          <w:numId w:val="1043"/>
-        </w:numPr>
-        <w:pStyle w:val="Compact"/>
-      </w:pPr>
-      <w:r>
-        <w:t xml:space="preserve">算法版本和校准参数。</w:t>
-      </w:r>
-    </w:p>
-    <w:p>
-      <w:pPr>
-        <w:numPr>
-          <w:ilvl w:val="0"/>
-          <w:numId w:val="1043"/>
-        </w:numPr>
-        <w:pStyle w:val="Compact"/>
-      </w:pPr>
-      <w:r>
-        <w:t xml:space="preserve">排行榜、防篡改和正式测评。</w:t>
-      </w:r>
-    </w:p>
-    <w:p>
-      <w:pPr>
-        <w:numPr>
-          <w:ilvl w:val="0"/>
-          <w:numId w:val="1043"/>
-        </w:numPr>
-        <w:pStyle w:val="Compact"/>
-      </w:pPr>
-      <w:r>
-        <w:t xml:space="preserve">用户样本记录和后续人工标注。</w:t>
-      </w:r>
-    </w:p>
-    <w:p>
-      <w:pPr>
-        <w:numPr>
-          <w:ilvl w:val="0"/>
-          <w:numId w:val="1043"/>
-        </w:numPr>
-        <w:pStyle w:val="Compact"/>
-      </w:pPr>
-      <w:r>
-        <w:t xml:space="preserve">更完整的诊断报告。</w:t>
-      </w:r>
-    </w:p>
-    <w:p>
-      <w:pPr>
-        <w:pStyle w:val="FirstParagraph"/>
-      </w:pPr>
-      <w:r>
-        <w:t xml:space="preserve">推荐演进：</w:t>
-      </w:r>
-    </w:p>
-    <w:p>
-      <w:pPr>
-        <w:pStyle w:val="SourceCode"/>
-      </w:pPr>
-      <w:r>
-        <w:rPr>
-          <w:rStyle w:val="VerbatimChar"/>
-        </w:rPr>
-        <w:t xml:space="preserve">阶段 1：浏览器提关键点 + 后端权威模板评分</w:t>
-      </w:r>
-      <w:r>
-        <w:br/>
-      </w:r>
-      <w:r>
-        <w:rPr>
-          <w:rStyle w:val="VerbatimChar"/>
-        </w:rPr>
-        <w:t xml:space="preserve">阶段 2：前端增加轻量模板评分 fallback</w:t>
-      </w:r>
-      <w:r>
-        <w:br/>
-      </w:r>
-      <w:r>
-        <w:rPr>
-          <w:rStyle w:val="VerbatimChar"/>
-        </w:rPr>
-        <w:t xml:space="preserve">阶段 3：后端保留权威评分、日志和数据闭环</w:t>
-      </w:r>
-    </w:p>
-    <w:bookmarkEnd w:id="49"/>
-    <w:bookmarkEnd w:id="50"/>
-    <w:bookmarkStart w:id="51" w:name="当前限制"/>
-    <w:p>
-      <w:pPr>
-        <w:pStyle w:val="Heading2"/>
-      </w:pPr>
-      <w:r>
         <w:t xml:space="preserve">10. 当前限制</w:t>
       </w:r>
     </w:p>
@@ -5922,7 +6640,7 @@
       <w:pPr>
         <w:numPr>
           <w:ilvl w:val="0"/>
-          <w:numId w:val="1044"/>
+          <w:numId w:val="1049"/>
         </w:numPr>
       </w:pPr>
       <w:r>
@@ -5943,7 +6661,7 @@
       <w:pPr>
         <w:numPr>
           <w:ilvl w:val="0"/>
-          <w:numId w:val="1044"/>
+          <w:numId w:val="1049"/>
         </w:numPr>
       </w:pPr>
       <w:r>
@@ -5964,7 +6682,7 @@
       <w:pPr>
         <w:numPr>
           <w:ilvl w:val="0"/>
-          <w:numId w:val="1044"/>
+          <w:numId w:val="1049"/>
         </w:numPr>
       </w:pPr>
       <w:r>
@@ -5978,14 +6696,14 @@
         <w:br/>
       </w:r>
       <w:r>
-        <w:t xml:space="preserve">首次加载依赖 CDN。国内网络环境下可能偶发慢或失败，但浏览器缓存会改善二次加载。</w:t>
-      </w:r>
-    </w:p>
-    <w:p>
-      <w:pPr>
-        <w:numPr>
-          <w:ilvl w:val="0"/>
-          <w:numId w:val="1044"/>
+        <w:t xml:space="preserve">首次加载依赖 CDN。国内网络环境下可能偶发慢或失败，但浏览器缓存会改善二次加载；当前页面已提供手动重试按钮。</w:t>
+      </w:r>
+    </w:p>
+    <w:p>
+      <w:pPr>
+        <w:numPr>
+          <w:ilvl w:val="0"/>
+          <w:numId w:val="1049"/>
         </w:numPr>
       </w:pPr>
       <w:r>
@@ -6006,7 +6724,7 @@
       <w:pPr>
         <w:numPr>
           <w:ilvl w:val="0"/>
-          <w:numId w:val="1044"/>
+          <w:numId w:val="1049"/>
         </w:numPr>
       </w:pPr>
       <w:r>
@@ -6027,7 +6745,7 @@
       <w:pPr>
         <w:numPr>
           <w:ilvl w:val="0"/>
-          <w:numId w:val="1044"/>
+          <w:numId w:val="1049"/>
         </w:numPr>
       </w:pPr>
       <w:r>
@@ -6044,8 +6762,8 @@
         <w:t xml:space="preserve">full 空间保留用于验证，不是当前推荐主路径。</w:t>
       </w:r>
     </w:p>
-    <w:bookmarkEnd w:id="51"/>
-    <w:bookmarkStart w:id="55" w:name="下一步建议"/>
+    <w:bookmarkEnd w:id="53"/>
+    <w:bookmarkStart w:id="57" w:name="下一步建议"/>
     <w:p>
       <w:pPr>
         <w:pStyle w:val="Heading2"/>
@@ -6054,7 +6772,7 @@
         <w:t xml:space="preserve">11. 下一步建议</w:t>
       </w:r>
     </w:p>
-    <w:bookmarkStart w:id="52" w:name="短期"/>
+    <w:bookmarkStart w:id="54" w:name="短期"/>
     <w:p>
       <w:pPr>
         <w:pStyle w:val="Heading3"/>
@@ -6067,19 +6785,7 @@
       <w:pPr>
         <w:numPr>
           <w:ilvl w:val="0"/>
-          <w:numId w:val="1045"/>
-        </w:numPr>
-        <w:pStyle w:val="Compact"/>
-      </w:pPr>
-      <w:r>
-        <w:t xml:space="preserve">在前端默认 API 地址或引导中优先推荐 lite API。</w:t>
-      </w:r>
-    </w:p>
-    <w:p>
-      <w:pPr>
-        <w:numPr>
-          <w:ilvl w:val="0"/>
-          <w:numId w:val="1045"/>
+          <w:numId w:val="1050"/>
         </w:numPr>
         <w:pStyle w:val="Compact"/>
       </w:pPr>
@@ -6091,7 +6797,7 @@
       <w:pPr>
         <w:numPr>
           <w:ilvl w:val="1"/>
-          <w:numId w:val="1046"/>
+          <w:numId w:val="1051"/>
         </w:numPr>
         <w:pStyle w:val="Compact"/>
       </w:pPr>
@@ -6103,7 +6809,7 @@
       <w:pPr>
         <w:numPr>
           <w:ilvl w:val="1"/>
-          <w:numId w:val="1046"/>
+          <w:numId w:val="1051"/>
         </w:numPr>
         <w:pStyle w:val="Compact"/>
       </w:pPr>
@@ -6115,7 +6821,7 @@
       <w:pPr>
         <w:numPr>
           <w:ilvl w:val="1"/>
-          <w:numId w:val="1046"/>
+          <w:numId w:val="1051"/>
         </w:numPr>
         <w:pStyle w:val="Compact"/>
       </w:pPr>
@@ -6127,19 +6833,19 @@
       <w:pPr>
         <w:numPr>
           <w:ilvl w:val="0"/>
-          <w:numId w:val="1045"/>
-        </w:numPr>
-        <w:pStyle w:val="Compact"/>
-      </w:pPr>
-      <w:r>
-        <w:t xml:space="preserve">对 Web Holistic 加载失败增加更友好的重试按钮。</w:t>
-      </w:r>
-    </w:p>
-    <w:p>
-      <w:pPr>
-        <w:numPr>
-          <w:ilvl w:val="0"/>
-          <w:numId w:val="1045"/>
+          <w:numId w:val="1050"/>
+        </w:numPr>
+        <w:pStyle w:val="Compact"/>
+      </w:pPr>
+      <w:r>
+        <w:t xml:space="preserve">在 Web Holistic 重试失败后，进一步提示可能原因，例如 CDN 网络、浏览器兼容或设备性能。</w:t>
+      </w:r>
+    </w:p>
+    <w:p>
+      <w:pPr>
+        <w:numPr>
+          <w:ilvl w:val="0"/>
+          <w:numId w:val="1050"/>
         </w:numPr>
         <w:pStyle w:val="Compact"/>
       </w:pPr>
@@ -6147,8 +6853,8 @@
         <w:t xml:space="preserve">把当前 10 个模板词条与前端挑战词表做明确映射，避免用户选择无模板词后误解评分结果。</w:t>
       </w:r>
     </w:p>
-    <w:bookmarkEnd w:id="52"/>
-    <w:bookmarkStart w:id="53" w:name="中期"/>
+    <w:bookmarkEnd w:id="54"/>
+    <w:bookmarkStart w:id="55" w:name="中期"/>
     <w:p>
       <w:pPr>
         <w:pStyle w:val="Heading3"/>
@@ -6161,7 +6867,7 @@
       <w:pPr>
         <w:numPr>
           <w:ilvl w:val="0"/>
-          <w:numId w:val="1047"/>
+          <w:numId w:val="1052"/>
         </w:numPr>
         <w:pStyle w:val="Compact"/>
       </w:pPr>
@@ -6188,7 +6894,7 @@
       <w:pPr>
         <w:numPr>
           <w:ilvl w:val="1"/>
-          <w:numId w:val="1048"/>
+          <w:numId w:val="1053"/>
         </w:numPr>
         <w:pStyle w:val="Compact"/>
       </w:pPr>
@@ -6203,7 +6909,7 @@
       <w:pPr>
         <w:numPr>
           <w:ilvl w:val="1"/>
-          <w:numId w:val="1048"/>
+          <w:numId w:val="1053"/>
         </w:numPr>
         <w:pStyle w:val="Compact"/>
       </w:pPr>
@@ -6215,7 +6921,7 @@
       <w:pPr>
         <w:numPr>
           <w:ilvl w:val="1"/>
-          <w:numId w:val="1048"/>
+          <w:numId w:val="1053"/>
         </w:numPr>
         <w:pStyle w:val="Compact"/>
       </w:pPr>
@@ -6227,7 +6933,7 @@
       <w:pPr>
         <w:numPr>
           <w:ilvl w:val="1"/>
-          <w:numId w:val="1048"/>
+          <w:numId w:val="1053"/>
         </w:numPr>
         <w:pStyle w:val="Compact"/>
       </w:pPr>
@@ -6239,7 +6945,7 @@
       <w:pPr>
         <w:numPr>
           <w:ilvl w:val="1"/>
-          <w:numId w:val="1048"/>
+          <w:numId w:val="1053"/>
         </w:numPr>
         <w:pStyle w:val="Compact"/>
       </w:pPr>
@@ -6251,7 +6957,7 @@
       <w:pPr>
         <w:numPr>
           <w:ilvl w:val="0"/>
-          <w:numId w:val="1047"/>
+          <w:numId w:val="1052"/>
         </w:numPr>
         <w:pStyle w:val="Compact"/>
       </w:pPr>
@@ -6263,7 +6969,7 @@
       <w:pPr>
         <w:numPr>
           <w:ilvl w:val="0"/>
-          <w:numId w:val="1047"/>
+          <w:numId w:val="1052"/>
         </w:numPr>
         <w:pStyle w:val="Compact"/>
       </w:pPr>
@@ -6275,7 +6981,7 @@
       <w:pPr>
         <w:numPr>
           <w:ilvl w:val="0"/>
-          <w:numId w:val="1047"/>
+          <w:numId w:val="1052"/>
         </w:numPr>
         <w:pStyle w:val="Compact"/>
       </w:pPr>
@@ -6283,8 +6989,8 @@
         <w:t xml:space="preserve">建立标准动作模板版本号，报告中显示当前模板版本。</w:t>
       </w:r>
     </w:p>
-    <w:bookmarkEnd w:id="53"/>
-    <w:bookmarkStart w:id="54" w:name="长期"/>
+    <w:bookmarkEnd w:id="55"/>
+    <w:bookmarkStart w:id="56" w:name="长期"/>
     <w:p>
       <w:pPr>
         <w:pStyle w:val="Heading3"/>
@@ -6297,7 +7003,7 @@
       <w:pPr>
         <w:numPr>
           <w:ilvl w:val="0"/>
-          <w:numId w:val="1049"/>
+          <w:numId w:val="1054"/>
         </w:numPr>
         <w:pStyle w:val="Compact"/>
       </w:pPr>
@@ -6309,7 +7015,7 @@
       <w:pPr>
         <w:numPr>
           <w:ilvl w:val="0"/>
-          <w:numId w:val="1049"/>
+          <w:numId w:val="1054"/>
         </w:numPr>
         <w:pStyle w:val="Compact"/>
       </w:pPr>
@@ -6321,7 +7027,7 @@
       <w:pPr>
         <w:numPr>
           <w:ilvl w:val="0"/>
-          <w:numId w:val="1049"/>
+          <w:numId w:val="1054"/>
         </w:numPr>
         <w:pStyle w:val="Compact"/>
       </w:pPr>
@@ -6333,7 +7039,7 @@
       <w:pPr>
         <w:numPr>
           <w:ilvl w:val="0"/>
-          <w:numId w:val="1049"/>
+          <w:numId w:val="1054"/>
         </w:numPr>
         <w:pStyle w:val="Compact"/>
       </w:pPr>
@@ -6341,9 +7047,9 @@
         <w:t xml:space="preserve">如果后续有正式测评/排行榜需求，保留后端权威评分与日志审计。</w:t>
       </w:r>
     </w:p>
-    <w:bookmarkEnd w:id="54"/>
-    <w:bookmarkEnd w:id="55"/>
-    <w:bookmarkStart w:id="62" w:name="附录常用验证命令"/>
+    <w:bookmarkEnd w:id="56"/>
+    <w:bookmarkEnd w:id="57"/>
+    <w:bookmarkStart w:id="64" w:name="附录常用验证命令"/>
     <w:p>
       <w:pPr>
         <w:pStyle w:val="Heading2"/>
@@ -6352,7 +7058,7 @@
         <w:t xml:space="preserve">12. 附录：常用验证命令</w:t>
       </w:r>
     </w:p>
-    <w:bookmarkStart w:id="56" w:name="github-pages"/>
+    <w:bookmarkStart w:id="58" w:name="github-pages"/>
     <w:p>
       <w:pPr>
         <w:pStyle w:val="Heading3"/>
@@ -6435,8 +7141,8 @@
         <w:t xml:space="preserve">'scoring-capture-fps|scoring-frame-width'</w:t>
       </w:r>
     </w:p>
-    <w:bookmarkEnd w:id="56"/>
-    <w:bookmarkStart w:id="57" w:name="full-api-health"/>
+    <w:bookmarkEnd w:id="58"/>
+    <w:bookmarkStart w:id="59" w:name="full-api-health"/>
     <w:p>
       <w:pPr>
         <w:pStyle w:val="Heading3"/>
@@ -6474,8 +7180,8 @@
         <w:t xml:space="preserve"> https://scottwyc-sign-language-universe.ms.show/api/scoring/health</w:t>
       </w:r>
     </w:p>
-    <w:bookmarkEnd w:id="57"/>
-    <w:bookmarkStart w:id="58" w:name="lite-api-health"/>
+    <w:bookmarkEnd w:id="59"/>
+    <w:bookmarkStart w:id="60" w:name="lite-api-health"/>
     <w:p>
       <w:pPr>
         <w:pStyle w:val="Heading3"/>
@@ -6513,8 +7219,8 @@
         <w:t xml:space="preserve"> https://scottwyc-sign-language-universe-lite.ms.show/api/scoring/health</w:t>
       </w:r>
     </w:p>
-    <w:bookmarkEnd w:id="58"/>
-    <w:bookmarkStart w:id="59" w:name="lite-api-templates"/>
+    <w:bookmarkEnd w:id="60"/>
+    <w:bookmarkStart w:id="61" w:name="lite-api-templates"/>
     <w:p>
       <w:pPr>
         <w:pStyle w:val="Heading3"/>
@@ -6552,8 +7258,8 @@
         <w:t xml:space="preserve"> https://scottwyc-sign-language-universe-lite.ms.show/api/scoring/templates</w:t>
       </w:r>
     </w:p>
-    <w:bookmarkEnd w:id="59"/>
-    <w:bookmarkStart w:id="60" w:name="github-actions"/>
+    <w:bookmarkEnd w:id="61"/>
+    <w:bookmarkStart w:id="62" w:name="github-actions"/>
     <w:p>
       <w:pPr>
         <w:pStyle w:val="Heading3"/>
@@ -6591,8 +7297,8 @@
         <w:t xml:space="preserve"> 5</w:t>
       </w:r>
     </w:p>
-    <w:bookmarkEnd w:id="60"/>
-    <w:bookmarkStart w:id="61" w:name="modelscope-日志"/>
+    <w:bookmarkEnd w:id="62"/>
+    <w:bookmarkStart w:id="63" w:name="modelscope-日志"/>
     <w:p>
       <w:pPr>
         <w:pStyle w:val="Heading3"/>
@@ -6922,9 +7628,9 @@
         <w:t xml:space="preserve">，当前 CLI 路径下该参数不可用。</w:t>
       </w:r>
     </w:p>
-    <w:bookmarkEnd w:id="61"/>
-    <w:bookmarkEnd w:id="62"/>
     <w:bookmarkEnd w:id="63"/>
+    <w:bookmarkEnd w:id="64"/>
+    <w:bookmarkEnd w:id="65"/>
     <w:sectPr/>
   </w:body>
 </w:document>
@@ -7186,91 +7892,6 @@
     <w:lvl w:ilvl="8">
       <w:numFmt w:val="bullet"/>
       <w:lvlText w:val="•"/>
-      <w:lvlJc w:val="left"/>
-      <w:pPr>
-        <w:ind w:left="6480" w:hanging="480"/>
-      </w:pPr>
-    </w:lvl>
-  </w:abstractNum>
-  <w:abstractNum w:abstractNumId="99413">
-    <w:nsid w:val="A99413"/>
-    <w:multiLevelType w:val="multilevel"/>
-    <w:lvl w:ilvl="0">
-      <w:start w:val="3"/>
-      <w:numFmt w:val="decimal"/>
-      <w:lvlText w:val="%1."/>
-      <w:lvlJc w:val="left"/>
-      <w:pPr>
-        <w:ind w:left="720" w:hanging="480"/>
-      </w:pPr>
-    </w:lvl>
-    <w:lvl w:ilvl="1">
-      <w:start w:val="3"/>
-      <w:numFmt w:val="decimal"/>
-      <w:lvlText w:val="%2."/>
-      <w:lvlJc w:val="left"/>
-      <w:pPr>
-        <w:ind w:left="1440" w:hanging="480"/>
-      </w:pPr>
-    </w:lvl>
-    <w:lvl w:ilvl="2">
-      <w:start w:val="3"/>
-      <w:numFmt w:val="decimal"/>
-      <w:lvlText w:val="%3."/>
-      <w:lvlJc w:val="left"/>
-      <w:pPr>
-        <w:ind w:left="2160" w:hanging="480"/>
-      </w:pPr>
-    </w:lvl>
-    <w:lvl w:ilvl="3">
-      <w:start w:val="3"/>
-      <w:numFmt w:val="decimal"/>
-      <w:lvlText w:val="%4."/>
-      <w:lvlJc w:val="left"/>
-      <w:pPr>
-        <w:ind w:left="2880" w:hanging="480"/>
-      </w:pPr>
-    </w:lvl>
-    <w:lvl w:ilvl="4">
-      <w:start w:val="3"/>
-      <w:numFmt w:val="decimal"/>
-      <w:lvlText w:val="%5."/>
-      <w:lvlJc w:val="left"/>
-      <w:pPr>
-        <w:ind w:left="3600" w:hanging="480"/>
-      </w:pPr>
-    </w:lvl>
-    <w:lvl w:ilvl="5">
-      <w:start w:val="3"/>
-      <w:numFmt w:val="decimal"/>
-      <w:lvlText w:val="%6."/>
-      <w:lvlJc w:val="left"/>
-      <w:pPr>
-        <w:ind w:left="4320" w:hanging="480"/>
-      </w:pPr>
-    </w:lvl>
-    <w:lvl w:ilvl="6">
-      <w:start w:val="3"/>
-      <w:numFmt w:val="decimal"/>
-      <w:lvlText w:val="%7."/>
-      <w:lvlJc w:val="left"/>
-      <w:pPr>
-        <w:ind w:left="5040" w:hanging="480"/>
-      </w:pPr>
-    </w:lvl>
-    <w:lvl w:ilvl="7">
-      <w:start w:val="3"/>
-      <w:numFmt w:val="decimal"/>
-      <w:lvlText w:val="%8."/>
-      <w:lvlJc w:val="left"/>
-      <w:pPr>
-        <w:ind w:left="5760" w:hanging="480"/>
-      </w:pPr>
-    </w:lvl>
-    <w:lvl w:ilvl="8">
-      <w:start w:val="3"/>
-      <w:numFmt w:val="decimal"/>
-      <w:lvlText w:val="%9."/>
       <w:lvlJc w:val="left"/>
       <w:pPr>
         <w:ind w:left="6480" w:hanging="480"/>
@@ -7338,6 +7959,15 @@
     <w:abstractNumId w:val="991"/>
   </w:num>
   <w:num w:numId="1011">
+    <w:abstractNumId w:val="991"/>
+  </w:num>
+  <w:num w:numId="1012">
+    <w:abstractNumId w:val="991"/>
+  </w:num>
+  <w:num w:numId="1013">
+    <w:abstractNumId w:val="991"/>
+  </w:num>
+  <w:num w:numId="1014">
     <w:abstractNumId w:val="99411"/>
     <w:lvlOverride w:ilvl="0">
       <w:startOverride w:val="1"/>
@@ -7366,15 +7996,6 @@
     <w:lvlOverride w:ilvl="8">
       <w:startOverride w:val="1"/>
     </w:lvlOverride>
-  </w:num>
-  <w:num w:numId="1012">
-    <w:abstractNumId w:val="991"/>
-  </w:num>
-  <w:num w:numId="1013">
-    <w:abstractNumId w:val="991"/>
-  </w:num>
-  <w:num w:numId="1014">
-    <w:abstractNumId w:val="991"/>
   </w:num>
   <w:num w:numId="1015">
     <w:abstractNumId w:val="991"/>
@@ -7443,6 +8064,18 @@
     <w:abstractNumId w:val="991"/>
   </w:num>
   <w:num w:numId="1037">
+    <w:abstractNumId w:val="991"/>
+  </w:num>
+  <w:num w:numId="1038">
+    <w:abstractNumId w:val="991"/>
+  </w:num>
+  <w:num w:numId="1039">
+    <w:abstractNumId w:val="991"/>
+  </w:num>
+  <w:num w:numId="1040">
+    <w:abstractNumId w:val="991"/>
+  </w:num>
+  <w:num w:numId="1041">
     <w:abstractNumId w:val="99411"/>
     <w:lvlOverride w:ilvl="0">
       <w:startOverride w:val="1"/>
@@ -7472,45 +8105,6 @@
       <w:startOverride w:val="1"/>
     </w:lvlOverride>
   </w:num>
-  <w:num w:numId="1038">
-    <w:abstractNumId w:val="99413"/>
-    <w:lvlOverride w:ilvl="0">
-      <w:startOverride w:val="3"/>
-    </w:lvlOverride>
-    <w:lvlOverride w:ilvl="1">
-      <w:startOverride w:val="3"/>
-    </w:lvlOverride>
-    <w:lvlOverride w:ilvl="2">
-      <w:startOverride w:val="3"/>
-    </w:lvlOverride>
-    <w:lvlOverride w:ilvl="3">
-      <w:startOverride w:val="3"/>
-    </w:lvlOverride>
-    <w:lvlOverride w:ilvl="4">
-      <w:startOverride w:val="3"/>
-    </w:lvlOverride>
-    <w:lvlOverride w:ilvl="5">
-      <w:startOverride w:val="3"/>
-    </w:lvlOverride>
-    <w:lvlOverride w:ilvl="6">
-      <w:startOverride w:val="3"/>
-    </w:lvlOverride>
-    <w:lvlOverride w:ilvl="7">
-      <w:startOverride w:val="3"/>
-    </w:lvlOverride>
-    <w:lvlOverride w:ilvl="8">
-      <w:startOverride w:val="3"/>
-    </w:lvlOverride>
-  </w:num>
-  <w:num w:numId="1039">
-    <w:abstractNumId w:val="991"/>
-  </w:num>
-  <w:num w:numId="1040">
-    <w:abstractNumId w:val="991"/>
-  </w:num>
-  <w:num w:numId="1041">
-    <w:abstractNumId w:val="991"/>
-  </w:num>
   <w:num w:numId="1042">
     <w:abstractNumId w:val="991"/>
   </w:num>
@@ -7518,6 +8112,21 @@
     <w:abstractNumId w:val="991"/>
   </w:num>
   <w:num w:numId="1044">
+    <w:abstractNumId w:val="991"/>
+  </w:num>
+  <w:num w:numId="1045">
+    <w:abstractNumId w:val="991"/>
+  </w:num>
+  <w:num w:numId="1046">
+    <w:abstractNumId w:val="991"/>
+  </w:num>
+  <w:num w:numId="1047">
+    <w:abstractNumId w:val="991"/>
+  </w:num>
+  <w:num w:numId="1048">
+    <w:abstractNumId w:val="991"/>
+  </w:num>
+  <w:num w:numId="1049">
     <w:abstractNumId w:val="99411"/>
     <w:lvlOverride w:ilvl="0">
       <w:startOverride w:val="1"/>
@@ -7547,19 +8156,19 @@
       <w:startOverride w:val="1"/>
     </w:lvlOverride>
   </w:num>
-  <w:num w:numId="1045">
+  <w:num w:numId="1050">
     <w:abstractNumId w:val="991"/>
   </w:num>
-  <w:num w:numId="1046">
+  <w:num w:numId="1051">
     <w:abstractNumId w:val="991"/>
   </w:num>
-  <w:num w:numId="1047">
+  <w:num w:numId="1052">
     <w:abstractNumId w:val="991"/>
   </w:num>
-  <w:num w:numId="1048">
+  <w:num w:numId="1053">
     <w:abstractNumId w:val="991"/>
   </w:num>
-  <w:num w:numId="1049">
+  <w:num w:numId="1054">
     <w:abstractNumId w:val="991"/>
   </w:num>
 </w:numbering>

</xml_diff>

<commit_message>
feat: make web holistic lite the default challenge flow
</commit_message>
<xml_diff>
--- a/docs/reports/recent_frontend_backend_modelscope_report_20260612.docx
+++ b/docs/reports/recent_frontend_backend_modelscope_report_20260612.docx
@@ -36,7 +36,7 @@
         </w:p>
       </w:sdtContent>
     </w:sdt>
-    <w:bookmarkStart w:id="65" w:name="手语学习宇宙近期前后端更新与-modelscope-部署报告"/>
+    <w:bookmarkStart w:id="67" w:name="手语学习宇宙近期前后端更新与-modelscope-部署报告"/>
     <w:p>
       <w:pPr>
         <w:pStyle w:val="Heading1"/>
@@ -181,7 +181,37 @@
         <w:t xml:space="preserve"> </w:t>
       </w:r>
       <w:r>
-        <w:t xml:space="preserve">帧。</w:t>
+        <w:t xml:space="preserve">帧。本次补充后，挑战模式覆盖全部</w:t>
+      </w:r>
+      <w:r>
+        <w:t xml:space="preserve"> </w:t>
+      </w:r>
+      <w:r>
+        <w:rPr>
+          <w:rStyle w:val="VerbatimChar"/>
+        </w:rPr>
+        <w:t xml:space="preserve">47</w:t>
+      </w:r>
+      <w:r>
+        <w:t xml:space="preserve"> </w:t>
+      </w:r>
+      <w:r>
+        <w:t xml:space="preserve">个学习词汇，但仅对模板数据库已覆盖的</w:t>
+      </w:r>
+      <w:r>
+        <w:t xml:space="preserve"> </w:t>
+      </w:r>
+      <w:r>
+        <w:rPr>
+          <w:rStyle w:val="VerbatimChar"/>
+        </w:rPr>
+        <w:t xml:space="preserve">10</w:t>
+      </w:r>
+      <w:r>
+        <w:t xml:space="preserve"> </w:t>
+      </w:r>
+      <w:r>
+        <w:t xml:space="preserve">个词开放录制评分，其他词明确提示“评分模板待上线”。</w:t>
       </w:r>
     </w:p>
     <w:p>
@@ -294,6 +324,27 @@
     </w:p>
     <w:p>
       <w:pPr>
+        <w:numPr>
+          <w:ilvl w:val="0"/>
+          <w:numId w:val="1001"/>
+        </w:numPr>
+      </w:pPr>
+      <w:r>
+        <w:rPr>
+          <w:bCs/>
+          <w:b/>
+        </w:rPr>
+        <w:t xml:space="preserve">前端体验补充优化</w:t>
+      </w:r>
+      <w:r>
+        <w:t xml:space="preserve"> </w:t>
+      </w:r>
+      <w:r>
+        <w:t xml:space="preserve">新增日间/夜间模式切换、可关闭音效、无专属动画词汇的明确占位提示，并修复学习页/挑战页动画播放器共用全局实例导致的潜在 canvas 指向问题。</w:t>
+      </w:r>
+    </w:p>
+    <w:p>
+      <w:pPr>
         <w:pStyle w:val="FirstParagraph"/>
       </w:pPr>
       <w:r>
@@ -358,6 +409,72 @@
       </w:pPr>
       <w:r>
         <w:t xml:space="preserve">Web Holistic 加载失败时，页面会显示“重新加载 Web Holistic”按钮，允许用户在当前页面生命周期内手动重试。</w:t>
+      </w:r>
+    </w:p>
+    <w:p>
+      <w:pPr>
+        <w:numPr>
+          <w:ilvl w:val="0"/>
+          <w:numId w:val="1002"/>
+        </w:numPr>
+        <w:pStyle w:val="Compact"/>
+      </w:pPr>
+      <w:r>
+        <w:t xml:space="preserve">当前挑战词表已从学习词库自动派生，覆盖</w:t>
+      </w:r>
+      <w:r>
+        <w:t xml:space="preserve"> </w:t>
+      </w:r>
+      <w:r>
+        <w:rPr>
+          <w:rStyle w:val="VerbatimChar"/>
+        </w:rPr>
+        <w:t xml:space="preserve">47</w:t>
+      </w:r>
+      <w:r>
+        <w:t xml:space="preserve"> </w:t>
+      </w:r>
+      <w:r>
+        <w:t xml:space="preserve">个学习词；其中</w:t>
+      </w:r>
+      <w:r>
+        <w:t xml:space="preserve"> </w:t>
+      </w:r>
+      <w:r>
+        <w:rPr>
+          <w:rStyle w:val="VerbatimChar"/>
+        </w:rPr>
+        <w:t xml:space="preserve">10</w:t>
+      </w:r>
+      <w:r>
+        <w:t xml:space="preserve"> </w:t>
+      </w:r>
+      <w:r>
+        <w:t xml:space="preserve">个词有模板可评分，</w:t>
+      </w:r>
+      <w:r>
+        <w:rPr>
+          <w:rStyle w:val="VerbatimChar"/>
+        </w:rPr>
+        <w:t xml:space="preserve">37</w:t>
+      </w:r>
+      <w:r>
+        <w:t xml:space="preserve"> </w:t>
+      </w:r>
+      <w:r>
+        <w:t xml:space="preserve">个词等待评分数据库上线。</w:t>
+      </w:r>
+    </w:p>
+    <w:p>
+      <w:pPr>
+        <w:numPr>
+          <w:ilvl w:val="0"/>
+          <w:numId w:val="1002"/>
+        </w:numPr>
+        <w:pStyle w:val="Compact"/>
+      </w:pPr>
+      <w:r>
+        <w:t xml:space="preserve">当前项目说明、部署说明和 API 契约已统一把“GitHub Pages + Web Holistic + ModelScope lite Docker 后端”作为默认模式。</w:t>
       </w:r>
     </w:p>
     <w:p>
@@ -1270,7 +1387,7 @@
         <w:pStyle w:val="BodyText"/>
       </w:pPr>
       <w:r>
-        <w:t xml:space="preserve">截至本报告本次更新覆盖的最新实现提交：</w:t>
+        <w:t xml:space="preserve">截至本报告上一次 main 合并验证的最新实现提交：</w:t>
       </w:r>
     </w:p>
     <w:p>
@@ -1282,6 +1399,26 @@
           <w:rStyle w:val="VerbatimChar"/>
         </w:rPr>
         <w:t xml:space="preserve">b758340 Merge pull request #23 from sign-language-universe/feat/web-holistic-retry</w:t>
+      </w:r>
+    </w:p>
+    <w:p>
+      <w:pPr>
+        <w:pStyle w:val="FirstParagraph"/>
+      </w:pPr>
+      <w:r>
+        <w:t xml:space="preserve">本次报告还覆盖当前工作分支新增的挑战词表全覆盖、模板待上线提示、日间/夜间模式、音效、OpenAPI 契约和默认方案文档更新；这些内容会在本分支 PR 合并后进入</w:t>
+      </w:r>
+      <w:r>
+        <w:t xml:space="preserve"> </w:t>
+      </w:r>
+      <w:r>
+        <w:rPr>
+          <w:rStyle w:val="VerbatimChar"/>
+        </w:rPr>
+        <w:t xml:space="preserve">main</w:t>
+      </w:r>
+      <w:r>
+        <w:t xml:space="preserve">。</w:t>
       </w:r>
     </w:p>
     <w:bookmarkEnd w:id="24"/>
@@ -1693,7 +1830,7 @@
       </w:r>
     </w:p>
     <w:bookmarkEnd w:id="25"/>
-    <w:bookmarkStart w:id="33" w:name="前端更新详情"/>
+    <w:bookmarkStart w:id="35" w:name="前端更新详情"/>
     <w:p>
       <w:pPr>
         <w:pStyle w:val="Heading2"/>
@@ -3082,8 +3219,444 @@
       </w:r>
     </w:p>
     <w:bookmarkEnd w:id="32"/>
+    <w:bookmarkStart w:id="33" w:name="挑战模式词汇覆盖与评分覆盖分离"/>
+    <w:p>
+      <w:pPr>
+        <w:pStyle w:val="Heading3"/>
+      </w:pPr>
+      <w:r>
+        <w:t xml:space="preserve">4.8 挑战模式词汇覆盖与评分覆盖分离</w:t>
+      </w:r>
+    </w:p>
+    <w:p>
+      <w:pPr>
+        <w:pStyle w:val="FirstParagraph"/>
+      </w:pPr>
+      <w:r>
+        <w:t xml:space="preserve">问题：</w:t>
+      </w:r>
+    </w:p>
+    <w:p>
+      <w:pPr>
+        <w:numPr>
+          <w:ilvl w:val="0"/>
+          <w:numId w:val="1024"/>
+        </w:numPr>
+        <w:pStyle w:val="Compact"/>
+      </w:pPr>
+      <w:r>
+        <w:t xml:space="preserve">早期</w:t>
+      </w:r>
+      <w:r>
+        <w:t xml:space="preserve"> </w:t>
+      </w:r>
+      <w:r>
+        <w:rPr>
+          <w:rStyle w:val="VerbatimChar"/>
+        </w:rPr>
+        <w:t xml:space="preserve">CHALLENGE_WORDS</w:t>
+      </w:r>
+      <w:r>
+        <w:t xml:space="preserve"> </w:t>
+      </w:r>
+      <w:r>
+        <w:t xml:space="preserve">是单独写死的 10 个词。</w:t>
+      </w:r>
+    </w:p>
+    <w:p>
+      <w:pPr>
+        <w:numPr>
+          <w:ilvl w:val="0"/>
+          <w:numId w:val="1024"/>
+        </w:numPr>
+        <w:pStyle w:val="Compact"/>
+      </w:pPr>
+      <w:r>
+        <w:t xml:space="preserve">学习页词库实际已有 47 个词，挑战模式没有完整覆盖学习内容。</w:t>
+      </w:r>
+    </w:p>
+    <w:p>
+      <w:pPr>
+        <w:numPr>
+          <w:ilvl w:val="0"/>
+          <w:numId w:val="1024"/>
+        </w:numPr>
+        <w:pStyle w:val="Compact"/>
+      </w:pPr>
+      <w:r>
+        <w:t xml:space="preserve">如果直接把无模板词也送入评分，会让用户误以为 fallback 分就是正式评分。</w:t>
+      </w:r>
+    </w:p>
+    <w:p>
+      <w:pPr>
+        <w:pStyle w:val="FirstParagraph"/>
+      </w:pPr>
+      <w:r>
+        <w:t xml:space="preserve">本次处理：</w:t>
+      </w:r>
+    </w:p>
+    <w:p>
+      <w:pPr>
+        <w:numPr>
+          <w:ilvl w:val="0"/>
+          <w:numId w:val="1025"/>
+        </w:numPr>
+        <w:pStyle w:val="Compact"/>
+      </w:pPr>
+      <w:r>
+        <w:rPr>
+          <w:rStyle w:val="VerbatimChar"/>
+        </w:rPr>
+        <w:t xml:space="preserve">CHALLENGE_WORDS</w:t>
+      </w:r>
+      <w:r>
+        <w:t xml:space="preserve"> </w:t>
+      </w:r>
+      <w:r>
+        <w:t xml:space="preserve">改为从</w:t>
+      </w:r>
+      <w:r>
+        <w:t xml:space="preserve"> </w:t>
+      </w:r>
+      <w:r>
+        <w:rPr>
+          <w:rStyle w:val="VerbatimChar"/>
+        </w:rPr>
+        <w:t xml:space="preserve">VOCABULARY_DATA</w:t>
+      </w:r>
+      <w:r>
+        <w:t xml:space="preserve"> </w:t>
+      </w:r>
+      <w:r>
+        <w:t xml:space="preserve">自动生成。</w:t>
+      </w:r>
+    </w:p>
+    <w:p>
+      <w:pPr>
+        <w:numPr>
+          <w:ilvl w:val="0"/>
+          <w:numId w:val="1025"/>
+        </w:numPr>
+        <w:pStyle w:val="Compact"/>
+      </w:pPr>
+      <w:r>
+        <w:t xml:space="preserve">挑战导航覆盖全部 47 个学习词，并将当前可评分的 10 个模板词排在前面。</w:t>
+      </w:r>
+    </w:p>
+    <w:p>
+      <w:pPr>
+        <w:numPr>
+          <w:ilvl w:val="0"/>
+          <w:numId w:val="1025"/>
+        </w:numPr>
+        <w:pStyle w:val="Compact"/>
+      </w:pPr>
+      <w:r>
+        <w:t xml:space="preserve">新增</w:t>
+      </w:r>
+      <w:r>
+        <w:t xml:space="preserve"> </w:t>
+      </w:r>
+      <w:r>
+        <w:rPr>
+          <w:rStyle w:val="VerbatimChar"/>
+        </w:rPr>
+        <w:t xml:space="preserve">SCORING_READY_WORDS</w:t>
+      </w:r>
+      <w:r>
+        <w:t xml:space="preserve">，只标记当前模板数据库已覆盖的 10 个可评分词：</w:t>
+      </w:r>
+    </w:p>
+    <w:p>
+      <w:pPr>
+        <w:pStyle w:val="SourceCode"/>
+      </w:pPr>
+      <w:r>
+        <w:rPr>
+          <w:rStyle w:val="VerbatimChar"/>
+        </w:rPr>
+        <w:t xml:space="preserve">香蕉、花、汽车、虎、月亮、跳、朋友、指示、唱歌、馋</w:t>
+      </w:r>
+    </w:p>
+    <w:p>
+      <w:pPr>
+        <w:numPr>
+          <w:ilvl w:val="0"/>
+          <w:numId w:val="1026"/>
+        </w:numPr>
+        <w:pStyle w:val="Compact"/>
+      </w:pPr>
+      <w:r>
+        <w:t xml:space="preserve">其他 37 个词在挑战页显示：</w:t>
+      </w:r>
+    </w:p>
+    <w:p>
+      <w:pPr>
+        <w:pStyle w:val="SourceCode"/>
+      </w:pPr>
+      <w:r>
+        <w:rPr>
+          <w:rStyle w:val="VerbatimChar"/>
+        </w:rPr>
+        <w:t xml:space="preserve">评分模板待上线 · 暂不能录制评分，等待数据库上线</w:t>
+      </w:r>
+    </w:p>
+    <w:p>
+      <w:pPr>
+        <w:numPr>
+          <w:ilvl w:val="0"/>
+          <w:numId w:val="1027"/>
+        </w:numPr>
+        <w:pStyle w:val="Compact"/>
+      </w:pPr>
+      <w:r>
+        <w:t xml:space="preserve">待上线词的“进入挑战 / 开始录制 / 自动评分”入口会被禁用或拦截，不提交到后端，也不返回本地预览分。</w:t>
+      </w:r>
+    </w:p>
+    <w:p>
+      <w:pPr>
+        <w:numPr>
+          <w:ilvl w:val="0"/>
+          <w:numId w:val="1027"/>
+        </w:numPr>
+        <w:pStyle w:val="Compact"/>
+      </w:pPr>
+      <w:r>
+        <w:t xml:space="preserve">无专属 Canvas 示范动画的词显示“暂无专属动画”，不再错误 fallback 到“香蕉”动画。</w:t>
+      </w:r>
+    </w:p>
+    <w:p>
+      <w:pPr>
+        <w:pStyle w:val="FirstParagraph"/>
+      </w:pPr>
+      <w:r>
+        <w:t xml:space="preserve">设计原因：</w:t>
+      </w:r>
+    </w:p>
+    <w:p>
+      <w:pPr>
+        <w:numPr>
+          <w:ilvl w:val="0"/>
+          <w:numId w:val="1028"/>
+        </w:numPr>
+        <w:pStyle w:val="Compact"/>
+      </w:pPr>
+      <w:r>
+        <w:t xml:space="preserve">学习覆盖和评分覆盖必须区分。</w:t>
+      </w:r>
+    </w:p>
+    <w:p>
+      <w:pPr>
+        <w:numPr>
+          <w:ilvl w:val="0"/>
+          <w:numId w:val="1028"/>
+        </w:numPr>
+        <w:pStyle w:val="Compact"/>
+      </w:pPr>
+      <w:r>
+        <w:t xml:space="preserve">对学习产品来说，用户可以浏览全部词汇。</w:t>
+      </w:r>
+    </w:p>
+    <w:p>
+      <w:pPr>
+        <w:numPr>
+          <w:ilvl w:val="0"/>
+          <w:numId w:val="1028"/>
+        </w:numPr>
+        <w:pStyle w:val="Compact"/>
+      </w:pPr>
+      <w:r>
+        <w:t xml:space="preserve">对评分产品来说，只有有标准动作模板的词才能给出可信模板评分。</w:t>
+      </w:r>
+    </w:p>
     <w:bookmarkEnd w:id="33"/>
-    <w:bookmarkStart w:id="37" w:name="后端更新详情"/>
+    <w:bookmarkStart w:id="34" w:name="日间模式音效与动画播放器修复"/>
+    <w:p>
+      <w:pPr>
+        <w:pStyle w:val="Heading3"/>
+      </w:pPr>
+      <w:r>
+        <w:t xml:space="preserve">4.9 日间模式、音效与动画播放器修复</w:t>
+      </w:r>
+    </w:p>
+    <w:p>
+      <w:pPr>
+        <w:pStyle w:val="FirstParagraph"/>
+      </w:pPr>
+      <w:r>
+        <w:t xml:space="preserve">新增前端体验：</w:t>
+      </w:r>
+    </w:p>
+    <w:p>
+      <w:pPr>
+        <w:numPr>
+          <w:ilvl w:val="0"/>
+          <w:numId w:val="1029"/>
+        </w:numPr>
+        <w:pStyle w:val="Compact"/>
+      </w:pPr>
+      <w:r>
+        <w:t xml:space="preserve">右下角新增日间/夜间模式切换。</w:t>
+      </w:r>
+    </w:p>
+    <w:p>
+      <w:pPr>
+        <w:numPr>
+          <w:ilvl w:val="0"/>
+          <w:numId w:val="1029"/>
+        </w:numPr>
+        <w:pStyle w:val="Compact"/>
+      </w:pPr>
+      <w:r>
+        <w:t xml:space="preserve">用户主题偏好保存到</w:t>
+      </w:r>
+      <w:r>
+        <w:t xml:space="preserve"> </w:t>
+      </w:r>
+      <w:r>
+        <w:rPr>
+          <w:rStyle w:val="VerbatimChar"/>
+        </w:rPr>
+        <w:t xml:space="preserve">localStorage</w:t>
+      </w:r>
+      <w:r>
+        <w:t xml:space="preserve">。</w:t>
+      </w:r>
+    </w:p>
+    <w:p>
+      <w:pPr>
+        <w:numPr>
+          <w:ilvl w:val="0"/>
+          <w:numId w:val="1029"/>
+        </w:numPr>
+        <w:pStyle w:val="Compact"/>
+      </w:pPr>
+      <w:r>
+        <w:t xml:space="preserve">星空背景会随主题变浅或变深。</w:t>
+      </w:r>
+    </w:p>
+    <w:p>
+      <w:pPr>
+        <w:numPr>
+          <w:ilvl w:val="0"/>
+          <w:numId w:val="1029"/>
+        </w:numPr>
+        <w:pStyle w:val="Compact"/>
+      </w:pPr>
+      <w:r>
+        <w:t xml:space="preserve">新增可关闭音效，默认开启，用户偏好保存到</w:t>
+      </w:r>
+      <w:r>
+        <w:t xml:space="preserve"> </w:t>
+      </w:r>
+      <w:r>
+        <w:rPr>
+          <w:rStyle w:val="VerbatimChar"/>
+        </w:rPr>
+        <w:t xml:space="preserve">localStorage</w:t>
+      </w:r>
+      <w:r>
+        <w:t xml:space="preserve">。</w:t>
+      </w:r>
+    </w:p>
+    <w:p>
+      <w:pPr>
+        <w:numPr>
+          <w:ilvl w:val="0"/>
+          <w:numId w:val="1029"/>
+        </w:numPr>
+        <w:pStyle w:val="Compact"/>
+      </w:pPr>
+      <w:r>
+        <w:t xml:space="preserve">音效使用 Web Audio 生成，不新增音频资源文件。</w:t>
+      </w:r>
+    </w:p>
+    <w:p>
+      <w:pPr>
+        <w:pStyle w:val="FirstParagraph"/>
+      </w:pPr>
+      <w:r>
+        <w:t xml:space="preserve">动画播放器修复：</w:t>
+      </w:r>
+    </w:p>
+    <w:p>
+      <w:pPr>
+        <w:numPr>
+          <w:ilvl w:val="0"/>
+          <w:numId w:val="1030"/>
+        </w:numPr>
+        <w:pStyle w:val="Compact"/>
+      </w:pPr>
+      <w:r>
+        <w:t xml:space="preserve">旧实现使用全局单个</w:t>
+      </w:r>
+      <w:r>
+        <w:t xml:space="preserve"> </w:t>
+      </w:r>
+      <w:r>
+        <w:rPr>
+          <w:rStyle w:val="VerbatimChar"/>
+        </w:rPr>
+        <w:t xml:space="preserve">animationPlayer</w:t>
+      </w:r>
+      <w:r>
+        <w:t xml:space="preserve">。</w:t>
+      </w:r>
+    </w:p>
+    <w:p>
+      <w:pPr>
+        <w:numPr>
+          <w:ilvl w:val="0"/>
+          <w:numId w:val="1030"/>
+        </w:numPr>
+        <w:pStyle w:val="Compact"/>
+      </w:pPr>
+      <w:r>
+        <w:t xml:space="preserve">学习页和挑战页都使用 Canvas 动画时，存在复用旧 canvas 的潜在问题。</w:t>
+      </w:r>
+    </w:p>
+    <w:p>
+      <w:pPr>
+        <w:numPr>
+          <w:ilvl w:val="0"/>
+          <w:numId w:val="1030"/>
+        </w:numPr>
+        <w:pStyle w:val="Compact"/>
+      </w:pPr>
+      <w:r>
+        <w:t xml:space="preserve">现改为每个 canvas 独立</w:t>
+      </w:r>
+      <w:r>
+        <w:t xml:space="preserve"> </w:t>
+      </w:r>
+      <w:r>
+        <w:rPr>
+          <w:rStyle w:val="VerbatimChar"/>
+        </w:rPr>
+        <w:t xml:space="preserve">AnimationPlayer</w:t>
+      </w:r>
+      <w:r>
+        <w:t xml:space="preserve"> </w:t>
+      </w:r>
+      <w:r>
+        <w:t xml:space="preserve">实例。</w:t>
+      </w:r>
+    </w:p>
+    <w:p>
+      <w:pPr>
+        <w:numPr>
+          <w:ilvl w:val="0"/>
+          <w:numId w:val="1030"/>
+        </w:numPr>
+        <w:pStyle w:val="Compact"/>
+      </w:pPr>
+      <w:r>
+        <w:t xml:space="preserve">无专属动画的词不再 fallback 到错误词汇动画。</w:t>
+      </w:r>
+    </w:p>
+    <w:bookmarkEnd w:id="34"/>
+    <w:bookmarkEnd w:id="35"/>
+    <w:bookmarkStart w:id="39" w:name="后端更新详情"/>
     <w:p>
       <w:pPr>
         <w:pStyle w:val="Heading2"/>
@@ -3092,7 +3665,7 @@
         <w:t xml:space="preserve">5. 后端更新详情</w:t>
       </w:r>
     </w:p>
-    <w:bookmarkStart w:id="34" w:name="fastapi-统一评分入口"/>
+    <w:bookmarkStart w:id="36" w:name="fastapi-统一评分入口"/>
     <w:p>
       <w:pPr>
         <w:pStyle w:val="Heading3"/>
@@ -3224,7 +3797,7 @@
       <w:pPr>
         <w:numPr>
           <w:ilvl w:val="0"/>
-          <w:numId w:val="1024"/>
+          <w:numId w:val="1031"/>
         </w:numPr>
         <w:pStyle w:val="Compact"/>
       </w:pPr>
@@ -3251,7 +3824,7 @@
       <w:pPr>
         <w:numPr>
           <w:ilvl w:val="0"/>
-          <w:numId w:val="1024"/>
+          <w:numId w:val="1031"/>
         </w:numPr>
         <w:pStyle w:val="Compact"/>
       </w:pPr>
@@ -3278,7 +3851,7 @@
       <w:pPr>
         <w:numPr>
           <w:ilvl w:val="0"/>
-          <w:numId w:val="1024"/>
+          <w:numId w:val="1031"/>
         </w:numPr>
         <w:pStyle w:val="Compact"/>
       </w:pPr>
@@ -3290,7 +3863,7 @@
       <w:pPr>
         <w:numPr>
           <w:ilvl w:val="0"/>
-          <w:numId w:val="1024"/>
+          <w:numId w:val="1031"/>
         </w:numPr>
         <w:pStyle w:val="Compact"/>
       </w:pPr>
@@ -3314,7 +3887,7 @@
       <w:pPr>
         <w:numPr>
           <w:ilvl w:val="0"/>
-          <w:numId w:val="1024"/>
+          <w:numId w:val="1031"/>
         </w:numPr>
         <w:pStyle w:val="Compact"/>
       </w:pPr>
@@ -3338,7 +3911,7 @@
       <w:pPr>
         <w:numPr>
           <w:ilvl w:val="0"/>
-          <w:numId w:val="1024"/>
+          <w:numId w:val="1031"/>
         </w:numPr>
         <w:pStyle w:val="Compact"/>
       </w:pPr>
@@ -3385,8 +3958,8 @@
         <w:t xml:space="preserve">。</w:t>
       </w:r>
     </w:p>
-    <w:bookmarkEnd w:id="34"/>
-    <w:bookmarkStart w:id="35" w:name="旧算法接入"/>
+    <w:bookmarkEnd w:id="36"/>
+    <w:bookmarkStart w:id="37" w:name="旧算法接入"/>
     <w:p>
       <w:pPr>
         <w:pStyle w:val="Heading3"/>
@@ -3445,7 +4018,7 @@
       <w:pPr>
         <w:numPr>
           <w:ilvl w:val="0"/>
-          <w:numId w:val="1025"/>
+          <w:numId w:val="1032"/>
         </w:numPr>
         <w:pStyle w:val="Compact"/>
       </w:pPr>
@@ -3468,7 +4041,7 @@
       <w:pPr>
         <w:numPr>
           <w:ilvl w:val="0"/>
-          <w:numId w:val="1026"/>
+          <w:numId w:val="1033"/>
         </w:numPr>
         <w:pStyle w:val="Compact"/>
       </w:pPr>
@@ -3491,7 +4064,7 @@
       <w:pPr>
         <w:numPr>
           <w:ilvl w:val="0"/>
-          <w:numId w:val="1027"/>
+          <w:numId w:val="1034"/>
         </w:numPr>
         <w:pStyle w:val="Compact"/>
       </w:pPr>
@@ -3523,7 +4096,7 @@
       <w:pPr>
         <w:numPr>
           <w:ilvl w:val="0"/>
-          <w:numId w:val="1028"/>
+          <w:numId w:val="1035"/>
         </w:numPr>
         <w:pStyle w:val="Compact"/>
       </w:pPr>
@@ -3551,8 +4124,8 @@
         <w:t xml:space="preserve">browser_local_fallback</w:t>
       </w:r>
     </w:p>
-    <w:bookmarkEnd w:id="35"/>
-    <w:bookmarkStart w:id="36" w:name="模板与语义权重"/>
+    <w:bookmarkEnd w:id="37"/>
+    <w:bookmarkStart w:id="38" w:name="模板与语义权重"/>
     <w:p>
       <w:pPr>
         <w:pStyle w:val="Heading3"/>
@@ -3639,7 +4212,7 @@
       <w:pPr>
         <w:numPr>
           <w:ilvl w:val="0"/>
-          <w:numId w:val="1029"/>
+          <w:numId w:val="1036"/>
         </w:numPr>
         <w:pStyle w:val="Compact"/>
       </w:pPr>
@@ -3651,7 +4224,7 @@
       <w:pPr>
         <w:numPr>
           <w:ilvl w:val="0"/>
-          <w:numId w:val="1029"/>
+          <w:numId w:val="1036"/>
         </w:numPr>
         <w:pStyle w:val="Compact"/>
       </w:pPr>
@@ -3663,7 +4236,7 @@
       <w:pPr>
         <w:numPr>
           <w:ilvl w:val="0"/>
-          <w:numId w:val="1029"/>
+          <w:numId w:val="1036"/>
         </w:numPr>
         <w:pStyle w:val="Compact"/>
       </w:pPr>
@@ -3671,9 +4244,9 @@
         <w:t xml:space="preserve">真实用户视频、隐私数据和大型生成缓存不应进入公开仓库。</w:t>
       </w:r>
     </w:p>
-    <w:bookmarkEnd w:id="36"/>
-    <w:bookmarkEnd w:id="37"/>
-    <w:bookmarkStart w:id="41" w:name="modelscope-部署详情"/>
+    <w:bookmarkEnd w:id="38"/>
+    <w:bookmarkEnd w:id="39"/>
+    <w:bookmarkStart w:id="43" w:name="modelscope-部署详情"/>
     <w:p>
       <w:pPr>
         <w:pStyle w:val="Heading2"/>
@@ -3682,7 +4255,7 @@
         <w:t xml:space="preserve">6. ModelScope 部署详情</w:t>
       </w:r>
     </w:p>
-    <w:bookmarkStart w:id="38" w:name="full-docker-创空间"/>
+    <w:bookmarkStart w:id="40" w:name="full-docker-创空间"/>
     <w:p>
       <w:pPr>
         <w:pStyle w:val="Heading3"/>
@@ -3741,7 +4314,7 @@
       <w:pPr>
         <w:numPr>
           <w:ilvl w:val="0"/>
-          <w:numId w:val="1030"/>
+          <w:numId w:val="1037"/>
         </w:numPr>
         <w:pStyle w:val="Compact"/>
       </w:pPr>
@@ -3753,7 +4326,7 @@
       <w:pPr>
         <w:numPr>
           <w:ilvl w:val="0"/>
-          <w:numId w:val="1030"/>
+          <w:numId w:val="1037"/>
         </w:numPr>
         <w:pStyle w:val="Compact"/>
       </w:pPr>
@@ -3765,7 +4338,7 @@
       <w:pPr>
         <w:numPr>
           <w:ilvl w:val="0"/>
-          <w:numId w:val="1030"/>
+          <w:numId w:val="1037"/>
         </w:numPr>
         <w:pStyle w:val="Compact"/>
       </w:pPr>
@@ -3777,7 +4350,7 @@
       <w:pPr>
         <w:numPr>
           <w:ilvl w:val="0"/>
-          <w:numId w:val="1030"/>
+          <w:numId w:val="1037"/>
         </w:numPr>
         <w:pStyle w:val="Compact"/>
       </w:pPr>
@@ -3797,7 +4370,7 @@
       <w:pPr>
         <w:numPr>
           <w:ilvl w:val="0"/>
-          <w:numId w:val="1031"/>
+          <w:numId w:val="1038"/>
         </w:numPr>
         <w:pStyle w:val="Compact"/>
       </w:pPr>
@@ -3815,7 +4388,7 @@
       <w:pPr>
         <w:numPr>
           <w:ilvl w:val="0"/>
-          <w:numId w:val="1031"/>
+          <w:numId w:val="1038"/>
         </w:numPr>
         <w:pStyle w:val="Compact"/>
       </w:pPr>
@@ -3833,7 +4406,7 @@
       <w:pPr>
         <w:numPr>
           <w:ilvl w:val="0"/>
-          <w:numId w:val="1031"/>
+          <w:numId w:val="1038"/>
         </w:numPr>
         <w:pStyle w:val="Compact"/>
       </w:pPr>
@@ -4172,7 +4745,7 @@
       <w:pPr>
         <w:numPr>
           <w:ilvl w:val="0"/>
-          <w:numId w:val="1032"/>
+          <w:numId w:val="1039"/>
         </w:numPr>
         <w:pStyle w:val="Compact"/>
       </w:pPr>
@@ -4184,7 +4757,7 @@
       <w:pPr>
         <w:numPr>
           <w:ilvl w:val="0"/>
-          <w:numId w:val="1032"/>
+          <w:numId w:val="1039"/>
         </w:numPr>
         <w:pStyle w:val="Compact"/>
       </w:pPr>
@@ -4196,7 +4769,7 @@
       <w:pPr>
         <w:numPr>
           <w:ilvl w:val="0"/>
-          <w:numId w:val="1032"/>
+          <w:numId w:val="1039"/>
         </w:numPr>
         <w:pStyle w:val="Compact"/>
       </w:pPr>
@@ -4208,7 +4781,7 @@
       <w:pPr>
         <w:numPr>
           <w:ilvl w:val="0"/>
-          <w:numId w:val="1032"/>
+          <w:numId w:val="1039"/>
         </w:numPr>
         <w:pStyle w:val="Compact"/>
       </w:pPr>
@@ -4216,8 +4789,8 @@
         <w:t xml:space="preserve">full 路线仍受 ModelScope 免费 CPU 容器、MediaPipe 初始化和冷启动影响，实际评分可能较慢。</w:t>
       </w:r>
     </w:p>
-    <w:bookmarkEnd w:id="38"/>
-    <w:bookmarkStart w:id="39" w:name="lite-docker-创空间"/>
+    <w:bookmarkEnd w:id="40"/>
+    <w:bookmarkStart w:id="41" w:name="lite-docker-创空间"/>
     <w:p>
       <w:pPr>
         <w:pStyle w:val="Heading3"/>
@@ -4276,7 +4849,7 @@
       <w:pPr>
         <w:numPr>
           <w:ilvl w:val="0"/>
-          <w:numId w:val="1033"/>
+          <w:numId w:val="1040"/>
         </w:numPr>
         <w:pStyle w:val="Compact"/>
       </w:pPr>
@@ -4288,7 +4861,7 @@
       <w:pPr>
         <w:numPr>
           <w:ilvl w:val="0"/>
-          <w:numId w:val="1033"/>
+          <w:numId w:val="1040"/>
         </w:numPr>
         <w:pStyle w:val="Compact"/>
       </w:pPr>
@@ -4300,7 +4873,7 @@
       <w:pPr>
         <w:numPr>
           <w:ilvl w:val="0"/>
-          <w:numId w:val="1033"/>
+          <w:numId w:val="1040"/>
         </w:numPr>
         <w:pStyle w:val="Compact"/>
       </w:pPr>
@@ -4312,7 +4885,7 @@
       <w:pPr>
         <w:numPr>
           <w:ilvl w:val="0"/>
-          <w:numId w:val="1033"/>
+          <w:numId w:val="1040"/>
         </w:numPr>
         <w:pStyle w:val="Compact"/>
       </w:pPr>
@@ -4332,7 +4905,7 @@
       <w:pPr>
         <w:numPr>
           <w:ilvl w:val="0"/>
-          <w:numId w:val="1034"/>
+          <w:numId w:val="1041"/>
         </w:numPr>
         <w:pStyle w:val="Compact"/>
       </w:pPr>
@@ -4350,7 +4923,7 @@
       <w:pPr>
         <w:numPr>
           <w:ilvl w:val="0"/>
-          <w:numId w:val="1034"/>
+          <w:numId w:val="1041"/>
         </w:numPr>
         <w:pStyle w:val="Compact"/>
       </w:pPr>
@@ -4368,7 +4941,7 @@
       <w:pPr>
         <w:numPr>
           <w:ilvl w:val="0"/>
-          <w:numId w:val="1034"/>
+          <w:numId w:val="1041"/>
         </w:numPr>
         <w:pStyle w:val="Compact"/>
       </w:pPr>
@@ -4776,8 +5349,8 @@
         <w:t xml:space="preserve">你好、谢谢、爸爸、学习、文化</w:t>
       </w:r>
     </w:p>
-    <w:bookmarkEnd w:id="39"/>
-    <w:bookmarkStart w:id="40" w:name="full-与-lite-对比"/>
+    <w:bookmarkEnd w:id="41"/>
+    <w:bookmarkStart w:id="42" w:name="full-与-lite-对比"/>
     <w:p>
       <w:pPr>
         <w:pStyle w:val="Heading3"/>
@@ -5207,9 +5780,9 @@
         <w:t xml:space="preserve">GitHub Pages 前端 + Web Holistic + ModelScope lite API</w:t>
       </w:r>
     </w:p>
-    <w:bookmarkEnd w:id="40"/>
-    <w:bookmarkEnd w:id="41"/>
-    <w:bookmarkStart w:id="45" w:name="github-pages-与-cicd"/>
+    <w:bookmarkEnd w:id="42"/>
+    <w:bookmarkEnd w:id="43"/>
+    <w:bookmarkStart w:id="47" w:name="github-pages-与-cicd"/>
     <w:p>
       <w:pPr>
         <w:pStyle w:val="Heading2"/>
@@ -5218,7 +5791,7 @@
         <w:t xml:space="preserve">7. GitHub Pages 与 CI/CD</w:t>
       </w:r>
     </w:p>
-    <w:bookmarkStart w:id="42" w:name="前端部署-workflow"/>
+    <w:bookmarkStart w:id="44" w:name="前端部署-workflow"/>
     <w:p>
       <w:pPr>
         <w:pStyle w:val="Heading3"/>
@@ -5258,7 +5831,7 @@
       <w:pPr>
         <w:numPr>
           <w:ilvl w:val="0"/>
-          <w:numId w:val="1035"/>
+          <w:numId w:val="1042"/>
         </w:numPr>
         <w:pStyle w:val="Compact"/>
       </w:pPr>
@@ -5279,7 +5852,7 @@
       <w:pPr>
         <w:numPr>
           <w:ilvl w:val="0"/>
-          <w:numId w:val="1035"/>
+          <w:numId w:val="1042"/>
         </w:numPr>
         <w:pStyle w:val="Compact"/>
       </w:pPr>
@@ -5345,8 +5918,8 @@
         <w:t xml:space="preserve">https://sign-language-universe.github.io/sign-language-universe/</w:t>
       </w:r>
     </w:p>
-    <w:bookmarkEnd w:id="42"/>
-    <w:bookmarkStart w:id="43" w:name="ci-workflow"/>
+    <w:bookmarkEnd w:id="44"/>
+    <w:bookmarkStart w:id="45" w:name="ci-workflow"/>
     <w:p>
       <w:pPr>
         <w:pStyle w:val="Heading3"/>
@@ -5386,7 +5959,7 @@
       <w:pPr>
         <w:numPr>
           <w:ilvl w:val="0"/>
-          <w:numId w:val="1036"/>
+          <w:numId w:val="1043"/>
         </w:numPr>
         <w:pStyle w:val="Compact"/>
       </w:pPr>
@@ -5398,7 +5971,7 @@
       <w:pPr>
         <w:numPr>
           <w:ilvl w:val="0"/>
-          <w:numId w:val="1036"/>
+          <w:numId w:val="1043"/>
         </w:numPr>
         <w:pStyle w:val="Compact"/>
       </w:pPr>
@@ -5439,7 +6012,7 @@
       <w:pPr>
         <w:numPr>
           <w:ilvl w:val="0"/>
-          <w:numId w:val="1037"/>
+          <w:numId w:val="1044"/>
         </w:numPr>
         <w:pStyle w:val="Compact"/>
       </w:pPr>
@@ -5458,8 +6031,8 @@
         <w:t xml:space="preserve">apps/web/index.html</w:t>
       </w:r>
     </w:p>
-    <w:bookmarkEnd w:id="43"/>
-    <w:bookmarkStart w:id="44" w:name="最近部署验证"/>
+    <w:bookmarkEnd w:id="45"/>
+    <w:bookmarkStart w:id="46" w:name="最近部署验证"/>
     <w:p>
       <w:pPr>
         <w:pStyle w:val="Heading3"/>
@@ -5480,7 +6053,7 @@
       <w:pPr>
         <w:numPr>
           <w:ilvl w:val="0"/>
-          <w:numId w:val="1038"/>
+          <w:numId w:val="1045"/>
         </w:numPr>
         <w:pStyle w:val="Compact"/>
       </w:pPr>
@@ -5492,7 +6065,7 @@
       <w:pPr>
         <w:numPr>
           <w:ilvl w:val="0"/>
-          <w:numId w:val="1038"/>
+          <w:numId w:val="1045"/>
         </w:numPr>
         <w:pStyle w:val="Compact"/>
       </w:pPr>
@@ -5504,7 +6077,7 @@
       <w:pPr>
         <w:numPr>
           <w:ilvl w:val="0"/>
-          <w:numId w:val="1038"/>
+          <w:numId w:val="1045"/>
         </w:numPr>
         <w:pStyle w:val="Compact"/>
       </w:pPr>
@@ -5551,7 +6124,7 @@
       <w:pPr>
         <w:numPr>
           <w:ilvl w:val="0"/>
-          <w:numId w:val="1039"/>
+          <w:numId w:val="1046"/>
         </w:numPr>
         <w:pStyle w:val="Compact"/>
       </w:pPr>
@@ -5625,7 +6198,7 @@
       <w:pPr>
         <w:numPr>
           <w:ilvl w:val="0"/>
-          <w:numId w:val="1040"/>
+          <w:numId w:val="1047"/>
         </w:numPr>
         <w:pStyle w:val="Compact"/>
       </w:pPr>
@@ -5668,9 +6241,120 @@
         <w:t xml:space="preserve">重新加载 Web Holistic</w:t>
       </w:r>
     </w:p>
-    <w:bookmarkEnd w:id="44"/>
-    <w:bookmarkEnd w:id="45"/>
-    <w:bookmarkStart w:id="48" w:name="当前推荐使用方式"/>
+    <w:p>
+      <w:pPr>
+        <w:pStyle w:val="FirstParagraph"/>
+      </w:pPr>
+      <w:r>
+        <w:t xml:space="preserve">本次仓库补充更新后，前端源码还新增：</w:t>
+      </w:r>
+    </w:p>
+    <w:p>
+      <w:pPr>
+        <w:pStyle w:val="SourceCode"/>
+      </w:pPr>
+      <w:r>
+        <w:rPr>
+          <w:rStyle w:val="VerbatimChar"/>
+        </w:rPr>
+        <w:t xml:space="preserve">SCORING_READY_WORDS</w:t>
+      </w:r>
+      <w:r>
+        <w:br/>
+      </w:r>
+      <w:r>
+        <w:rPr>
+          <w:rStyle w:val="VerbatimChar"/>
+        </w:rPr>
+        <w:t xml:space="preserve">buildChallengeWords()</w:t>
+      </w:r>
+      <w:r>
+        <w:br/>
+      </w:r>
+      <w:r>
+        <w:rPr>
+          <w:rStyle w:val="VerbatimChar"/>
+        </w:rPr>
+        <w:t xml:space="preserve">theme-toggle-btn</w:t>
+      </w:r>
+      <w:r>
+        <w:br/>
+      </w:r>
+      <w:r>
+        <w:rPr>
+          <w:rStyle w:val="VerbatimChar"/>
+        </w:rPr>
+        <w:t xml:space="preserve">sound-toggle-btn</w:t>
+      </w:r>
+      <w:r>
+        <w:br/>
+      </w:r>
+      <w:r>
+        <w:rPr>
+          <w:rStyle w:val="VerbatimChar"/>
+        </w:rPr>
+        <w:t xml:space="preserve">hasSignAnimation()</w:t>
+      </w:r>
+    </w:p>
+    <w:p>
+      <w:pPr>
+        <w:pStyle w:val="FirstParagraph"/>
+      </w:pPr>
+      <w:r>
+        <w:t xml:space="preserve">对应含义：</w:t>
+      </w:r>
+    </w:p>
+    <w:p>
+      <w:pPr>
+        <w:numPr>
+          <w:ilvl w:val="0"/>
+          <w:numId w:val="1048"/>
+        </w:numPr>
+        <w:pStyle w:val="Compact"/>
+      </w:pPr>
+      <w:r>
+        <w:t xml:space="preserve">挑战词表从学习词库自动生成。</w:t>
+      </w:r>
+    </w:p>
+    <w:p>
+      <w:pPr>
+        <w:numPr>
+          <w:ilvl w:val="0"/>
+          <w:numId w:val="1048"/>
+        </w:numPr>
+        <w:pStyle w:val="Compact"/>
+      </w:pPr>
+      <w:r>
+        <w:t xml:space="preserve">只有模板库覆盖词允许录制评分。</w:t>
+      </w:r>
+    </w:p>
+    <w:p>
+      <w:pPr>
+        <w:numPr>
+          <w:ilvl w:val="0"/>
+          <w:numId w:val="1048"/>
+        </w:numPr>
+        <w:pStyle w:val="Compact"/>
+      </w:pPr>
+      <w:r>
+        <w:t xml:space="preserve">用户可切换日间/夜间模式和音效开关。</w:t>
+      </w:r>
+    </w:p>
+    <w:p>
+      <w:pPr>
+        <w:numPr>
+          <w:ilvl w:val="0"/>
+          <w:numId w:val="1048"/>
+        </w:numPr>
+        <w:pStyle w:val="Compact"/>
+      </w:pPr>
+      <w:r>
+        <w:t xml:space="preserve">无专属动画词不再错误播放其他词动画。</w:t>
+      </w:r>
+    </w:p>
+    <w:bookmarkEnd w:id="46"/>
+    <w:bookmarkEnd w:id="47"/>
+    <w:bookmarkStart w:id="50" w:name="当前推荐使用方式"/>
     <w:p>
       <w:pPr>
         <w:pStyle w:val="Heading2"/>
@@ -5679,7 +6363,7 @@
         <w:t xml:space="preserve">8. 当前推荐使用方式</w:t>
       </w:r>
     </w:p>
-    <w:bookmarkStart w:id="46" w:name="普通用户演示"/>
+    <w:bookmarkStart w:id="48" w:name="普通用户演示"/>
     <w:p>
       <w:pPr>
         <w:pStyle w:val="Heading3"/>
@@ -5719,7 +6403,7 @@
       <w:pPr>
         <w:numPr>
           <w:ilvl w:val="0"/>
-          <w:numId w:val="1041"/>
+          <w:numId w:val="1049"/>
         </w:numPr>
         <w:pStyle w:val="Compact"/>
       </w:pPr>
@@ -5731,7 +6415,7 @@
       <w:pPr>
         <w:numPr>
           <w:ilvl w:val="0"/>
-          <w:numId w:val="1041"/>
+          <w:numId w:val="1049"/>
         </w:numPr>
         <w:pStyle w:val="Compact"/>
       </w:pPr>
@@ -5743,36 +6427,36 @@
       <w:pPr>
         <w:numPr>
           <w:ilvl w:val="0"/>
-          <w:numId w:val="1041"/>
-        </w:numPr>
-        <w:pStyle w:val="Compact"/>
-      </w:pPr>
-      <w:r>
-        <w:t xml:space="preserve">点击“开始”。</w:t>
-      </w:r>
-    </w:p>
-    <w:p>
-      <w:pPr>
-        <w:numPr>
-          <w:ilvl w:val="0"/>
-          <w:numId w:val="1041"/>
-        </w:numPr>
-        <w:pStyle w:val="Compact"/>
-      </w:pPr>
-      <w:r>
-        <w:t xml:space="preserve">按示范完成手语动作。</w:t>
-      </w:r>
-    </w:p>
-    <w:p>
-      <w:pPr>
-        <w:numPr>
-          <w:ilvl w:val="0"/>
-          <w:numId w:val="1041"/>
-        </w:numPr>
-        <w:pStyle w:val="Compact"/>
-      </w:pPr>
-      <w:r>
-        <w:t xml:space="preserve">录制结束后自动评分。</w:t>
+          <w:numId w:val="1049"/>
+        </w:numPr>
+        <w:pStyle w:val="Compact"/>
+      </w:pPr>
+      <w:r>
+        <w:t xml:space="preserve">切换到想练习的词汇。</w:t>
+      </w:r>
+    </w:p>
+    <w:p>
+      <w:pPr>
+        <w:numPr>
+          <w:ilvl w:val="0"/>
+          <w:numId w:val="1049"/>
+        </w:numPr>
+        <w:pStyle w:val="Compact"/>
+      </w:pPr>
+      <w:r>
+        <w:t xml:space="preserve">如果词汇显示“评分模板已上线”，点击“开始”并按示范完成手语动作，录制结束后自动评分。</w:t>
+      </w:r>
+    </w:p>
+    <w:p>
+      <w:pPr>
+        <w:numPr>
+          <w:ilvl w:val="0"/>
+          <w:numId w:val="1049"/>
+        </w:numPr>
+        <w:pStyle w:val="Compact"/>
+      </w:pPr>
+      <w:r>
+        <w:t xml:space="preserve">如果词汇显示“评分模板待上线”，当前只能查看学习说明，暂不能录制评分。</w:t>
       </w:r>
     </w:p>
     <w:p>
@@ -5794,8 +6478,8 @@
         <w:t xml:space="preserve">https://sign-language-universe.github.io/sign-language-universe/?api=https://api.example.com</w:t>
       </w:r>
     </w:p>
-    <w:bookmarkEnd w:id="46"/>
-    <w:bookmarkStart w:id="47" w:name="开发者本地联调"/>
+    <w:bookmarkEnd w:id="48"/>
+    <w:bookmarkStart w:id="49" w:name="开发者本地联调"/>
     <w:p>
       <w:pPr>
         <w:pStyle w:val="Heading3"/>
@@ -6029,7 +6713,7 @@
       <w:pPr>
         <w:numPr>
           <w:ilvl w:val="0"/>
-          <w:numId w:val="1042"/>
+          <w:numId w:val="1050"/>
         </w:numPr>
         <w:pStyle w:val="Compact"/>
       </w:pPr>
@@ -6041,7 +6725,7 @@
       <w:pPr>
         <w:numPr>
           <w:ilvl w:val="0"/>
-          <w:numId w:val="1042"/>
+          <w:numId w:val="1050"/>
         </w:numPr>
         <w:pStyle w:val="Compact"/>
       </w:pPr>
@@ -6049,9 +6733,9 @@
         <w:t xml:space="preserve">本地 HTTP API 只适合本机联调。</w:t>
       </w:r>
     </w:p>
-    <w:bookmarkEnd w:id="47"/>
-    <w:bookmarkEnd w:id="48"/>
-    <w:bookmarkStart w:id="52" w:name="关键问题解释"/>
+    <w:bookmarkEnd w:id="49"/>
+    <w:bookmarkEnd w:id="50"/>
+    <w:bookmarkStart w:id="54" w:name="关键问题解释"/>
     <w:p>
       <w:pPr>
         <w:pStyle w:val="Heading2"/>
@@ -6060,7 +6744,7 @@
         <w:t xml:space="preserve">9. 关键问题解释</w:t>
       </w:r>
     </w:p>
-    <w:bookmarkStart w:id="49" w:name="为什么-web-holistic-比服务端-holistic-快很多"/>
+    <w:bookmarkStart w:id="51" w:name="为什么-web-holistic-比服务端-holistic-快很多"/>
     <w:p>
       <w:pPr>
         <w:pStyle w:val="Heading3"/>
@@ -6081,7 +6765,7 @@
       <w:pPr>
         <w:numPr>
           <w:ilvl w:val="0"/>
-          <w:numId w:val="1043"/>
+          <w:numId w:val="1051"/>
         </w:numPr>
         <w:pStyle w:val="Compact"/>
       </w:pPr>
@@ -6093,7 +6777,7 @@
       <w:pPr>
         <w:numPr>
           <w:ilvl w:val="0"/>
-          <w:numId w:val="1043"/>
+          <w:numId w:val="1051"/>
         </w:numPr>
         <w:pStyle w:val="Compact"/>
       </w:pPr>
@@ -6105,7 +6789,7 @@
       <w:pPr>
         <w:numPr>
           <w:ilvl w:val="0"/>
-          <w:numId w:val="1043"/>
+          <w:numId w:val="1051"/>
         </w:numPr>
         <w:pStyle w:val="Compact"/>
       </w:pPr>
@@ -6117,7 +6801,7 @@
       <w:pPr>
         <w:numPr>
           <w:ilvl w:val="0"/>
-          <w:numId w:val="1043"/>
+          <w:numId w:val="1051"/>
         </w:numPr>
         <w:pStyle w:val="Compact"/>
       </w:pPr>
@@ -6129,7 +6813,7 @@
       <w:pPr>
         <w:numPr>
           <w:ilvl w:val="0"/>
-          <w:numId w:val="1043"/>
+          <w:numId w:val="1051"/>
         </w:numPr>
         <w:pStyle w:val="Compact"/>
       </w:pPr>
@@ -6149,7 +6833,7 @@
       <w:pPr>
         <w:numPr>
           <w:ilvl w:val="0"/>
-          <w:numId w:val="1044"/>
+          <w:numId w:val="1052"/>
         </w:numPr>
         <w:pStyle w:val="Compact"/>
       </w:pPr>
@@ -6161,7 +6845,7 @@
       <w:pPr>
         <w:numPr>
           <w:ilvl w:val="0"/>
-          <w:numId w:val="1044"/>
+          <w:numId w:val="1052"/>
         </w:numPr>
         <w:pStyle w:val="Compact"/>
       </w:pPr>
@@ -6188,7 +6872,7 @@
       <w:pPr>
         <w:numPr>
           <w:ilvl w:val="0"/>
-          <w:numId w:val="1044"/>
+          <w:numId w:val="1052"/>
         </w:numPr>
         <w:pStyle w:val="Compact"/>
       </w:pPr>
@@ -6200,7 +6884,7 @@
       <w:pPr>
         <w:numPr>
           <w:ilvl w:val="0"/>
-          <w:numId w:val="1044"/>
+          <w:numId w:val="1052"/>
         </w:numPr>
         <w:pStyle w:val="Compact"/>
       </w:pPr>
@@ -6216,8 +6900,8 @@
         <w:t xml:space="preserve">因此当前路线把“关键点提取”移到浏览器是合理的。</w:t>
       </w:r>
     </w:p>
-    <w:bookmarkEnd w:id="49"/>
-    <w:bookmarkStart w:id="50" w:name="是否应该把完整打分算法也移入前端"/>
+    <w:bookmarkEnd w:id="51"/>
+    <w:bookmarkStart w:id="52" w:name="是否应该把完整打分算法也移入前端"/>
     <w:p>
       <w:pPr>
         <w:pStyle w:val="Heading3"/>
@@ -6246,7 +6930,7 @@
       <w:pPr>
         <w:numPr>
           <w:ilvl w:val="0"/>
-          <w:numId w:val="1045"/>
+          <w:numId w:val="1053"/>
         </w:numPr>
         <w:pStyle w:val="Compact"/>
       </w:pPr>
@@ -6258,7 +6942,7 @@
       <w:pPr>
         <w:numPr>
           <w:ilvl w:val="0"/>
-          <w:numId w:val="1045"/>
+          <w:numId w:val="1053"/>
         </w:numPr>
         <w:pStyle w:val="Compact"/>
       </w:pPr>
@@ -6270,7 +6954,7 @@
       <w:pPr>
         <w:numPr>
           <w:ilvl w:val="0"/>
-          <w:numId w:val="1045"/>
+          <w:numId w:val="1053"/>
         </w:numPr>
         <w:pStyle w:val="Compact"/>
       </w:pPr>
@@ -6282,7 +6966,7 @@
       <w:pPr>
         <w:numPr>
           <w:ilvl w:val="0"/>
-          <w:numId w:val="1045"/>
+          <w:numId w:val="1053"/>
         </w:numPr>
         <w:pStyle w:val="Compact"/>
       </w:pPr>
@@ -6302,7 +6986,7 @@
       <w:pPr>
         <w:numPr>
           <w:ilvl w:val="0"/>
-          <w:numId w:val="1046"/>
+          <w:numId w:val="1054"/>
         </w:numPr>
         <w:pStyle w:val="Compact"/>
       </w:pPr>
@@ -6314,7 +6998,7 @@
       <w:pPr>
         <w:numPr>
           <w:ilvl w:val="0"/>
-          <w:numId w:val="1046"/>
+          <w:numId w:val="1054"/>
         </w:numPr>
         <w:pStyle w:val="Compact"/>
       </w:pPr>
@@ -6326,7 +7010,7 @@
       <w:pPr>
         <w:numPr>
           <w:ilvl w:val="0"/>
-          <w:numId w:val="1046"/>
+          <w:numId w:val="1054"/>
         </w:numPr>
         <w:pStyle w:val="Compact"/>
       </w:pPr>
@@ -6338,7 +7022,7 @@
       <w:pPr>
         <w:numPr>
           <w:ilvl w:val="0"/>
-          <w:numId w:val="1046"/>
+          <w:numId w:val="1054"/>
         </w:numPr>
         <w:pStyle w:val="Compact"/>
       </w:pPr>
@@ -6350,7 +7034,7 @@
       <w:pPr>
         <w:numPr>
           <w:ilvl w:val="0"/>
-          <w:numId w:val="1046"/>
+          <w:numId w:val="1054"/>
         </w:numPr>
         <w:pStyle w:val="Compact"/>
       </w:pPr>
@@ -6395,8 +7079,8 @@
         <w:t xml:space="preserve">阶段 3：后端保留权威评分、日志和数据闭环</w:t>
       </w:r>
     </w:p>
-    <w:bookmarkEnd w:id="50"/>
-    <w:bookmarkStart w:id="51" w:name="web-holistic-不可用与重试策略"/>
+    <w:bookmarkEnd w:id="52"/>
+    <w:bookmarkStart w:id="53" w:name="web-holistic-不可用与重试策略"/>
     <w:p>
       <w:pPr>
         <w:pStyle w:val="Heading3"/>
@@ -6417,7 +7101,7 @@
       <w:pPr>
         <w:numPr>
           <w:ilvl w:val="0"/>
-          <w:numId w:val="1047"/>
+          <w:numId w:val="1055"/>
         </w:numPr>
         <w:pStyle w:val="Compact"/>
       </w:pPr>
@@ -6450,7 +7134,7 @@
       <w:pPr>
         <w:numPr>
           <w:ilvl w:val="0"/>
-          <w:numId w:val="1047"/>
+          <w:numId w:val="1055"/>
         </w:numPr>
         <w:pStyle w:val="Compact"/>
       </w:pPr>
@@ -6474,7 +7158,7 @@
       <w:pPr>
         <w:numPr>
           <w:ilvl w:val="0"/>
-          <w:numId w:val="1047"/>
+          <w:numId w:val="1055"/>
         </w:numPr>
         <w:pStyle w:val="Compact"/>
       </w:pPr>
@@ -6486,7 +7170,7 @@
       <w:pPr>
         <w:numPr>
           <w:ilvl w:val="0"/>
-          <w:numId w:val="1047"/>
+          <w:numId w:val="1055"/>
         </w:numPr>
         <w:pStyle w:val="Compact"/>
       </w:pPr>
@@ -6510,7 +7194,7 @@
       <w:pPr>
         <w:numPr>
           <w:ilvl w:val="0"/>
-          <w:numId w:val="1047"/>
+          <w:numId w:val="1055"/>
         </w:numPr>
         <w:pStyle w:val="Compact"/>
       </w:pPr>
@@ -6522,7 +7206,7 @@
       <w:pPr>
         <w:numPr>
           <w:ilvl w:val="0"/>
-          <w:numId w:val="1047"/>
+          <w:numId w:val="1055"/>
         </w:numPr>
         <w:pStyle w:val="Compact"/>
       </w:pPr>
@@ -6542,7 +7226,7 @@
       <w:pPr>
         <w:numPr>
           <w:ilvl w:val="0"/>
-          <w:numId w:val="1048"/>
+          <w:numId w:val="1056"/>
         </w:numPr>
         <w:pStyle w:val="Compact"/>
       </w:pPr>
@@ -6554,7 +7238,7 @@
       <w:pPr>
         <w:numPr>
           <w:ilvl w:val="0"/>
-          <w:numId w:val="1048"/>
+          <w:numId w:val="1056"/>
         </w:numPr>
         <w:pStyle w:val="Compact"/>
       </w:pPr>
@@ -6578,7 +7262,7 @@
       <w:pPr>
         <w:numPr>
           <w:ilvl w:val="0"/>
-          <w:numId w:val="1048"/>
+          <w:numId w:val="1056"/>
         </w:numPr>
         <w:pStyle w:val="Compact"/>
       </w:pPr>
@@ -6605,7 +7289,7 @@
       <w:pPr>
         <w:numPr>
           <w:ilvl w:val="0"/>
-          <w:numId w:val="1048"/>
+          <w:numId w:val="1056"/>
         </w:numPr>
         <w:pStyle w:val="Compact"/>
       </w:pPr>
@@ -6617,7 +7301,7 @@
       <w:pPr>
         <w:numPr>
           <w:ilvl w:val="0"/>
-          <w:numId w:val="1048"/>
+          <w:numId w:val="1056"/>
         </w:numPr>
         <w:pStyle w:val="Compact"/>
       </w:pPr>
@@ -6625,9 +7309,9 @@
         <w:t xml:space="preserve">重试仍失败时，前端继续保留压缩帧或本地 fallback 评分路径。</w:t>
       </w:r>
     </w:p>
-    <w:bookmarkEnd w:id="51"/>
-    <w:bookmarkEnd w:id="52"/>
-    <w:bookmarkStart w:id="53" w:name="当前限制"/>
+    <w:bookmarkEnd w:id="53"/>
+    <w:bookmarkEnd w:id="54"/>
+    <w:bookmarkStart w:id="55" w:name="当前限制"/>
     <w:p>
       <w:pPr>
         <w:pStyle w:val="Heading2"/>
@@ -6640,7 +7324,7 @@
       <w:pPr>
         <w:numPr>
           <w:ilvl w:val="0"/>
-          <w:numId w:val="1049"/>
+          <w:numId w:val="1057"/>
         </w:numPr>
       </w:pPr>
       <w:r>
@@ -6654,14 +7338,14 @@
         <w:br/>
       </w:r>
       <w:r>
-        <w:t xml:space="preserve">当前已配置旧模板的词条为 10 个，其他词条还没有模板 JSON。</w:t>
-      </w:r>
-    </w:p>
-    <w:p>
-      <w:pPr>
-        <w:numPr>
-          <w:ilvl w:val="0"/>
-          <w:numId w:val="1049"/>
+        <w:t xml:space="preserve">挑战模式现在覆盖全部 47 个学习词，但当前已配置旧模板的词条仍为 10 个。其他 37 个词会显示“评分模板待上线”，暂不允许录制评分。</w:t>
+      </w:r>
+    </w:p>
+    <w:p>
+      <w:pPr>
+        <w:numPr>
+          <w:ilvl w:val="0"/>
+          <w:numId w:val="1057"/>
         </w:numPr>
       </w:pPr>
       <w:r>
@@ -6682,7 +7366,7 @@
       <w:pPr>
         <w:numPr>
           <w:ilvl w:val="0"/>
-          <w:numId w:val="1049"/>
+          <w:numId w:val="1057"/>
         </w:numPr>
       </w:pPr>
       <w:r>
@@ -6703,7 +7387,7 @@
       <w:pPr>
         <w:numPr>
           <w:ilvl w:val="0"/>
-          <w:numId w:val="1049"/>
+          <w:numId w:val="1057"/>
         </w:numPr>
       </w:pPr>
       <w:r>
@@ -6724,7 +7408,7 @@
       <w:pPr>
         <w:numPr>
           <w:ilvl w:val="0"/>
-          <w:numId w:val="1049"/>
+          <w:numId w:val="1057"/>
         </w:numPr>
       </w:pPr>
       <w:r>
@@ -6745,7 +7429,7 @@
       <w:pPr>
         <w:numPr>
           <w:ilvl w:val="0"/>
-          <w:numId w:val="1049"/>
+          <w:numId w:val="1057"/>
         </w:numPr>
       </w:pPr>
       <w:r>
@@ -6762,8 +7446,8 @@
         <w:t xml:space="preserve">full 空间保留用于验证，不是当前推荐主路径。</w:t>
       </w:r>
     </w:p>
-    <w:bookmarkEnd w:id="53"/>
-    <w:bookmarkStart w:id="57" w:name="下一步建议"/>
+    <w:bookmarkEnd w:id="55"/>
+    <w:bookmarkStart w:id="59" w:name="下一步建议"/>
     <w:p>
       <w:pPr>
         <w:pStyle w:val="Heading2"/>
@@ -6772,7 +7456,7 @@
         <w:t xml:space="preserve">11. 下一步建议</w:t>
       </w:r>
     </w:p>
-    <w:bookmarkStart w:id="54" w:name="短期"/>
+    <w:bookmarkStart w:id="56" w:name="短期"/>
     <w:p>
       <w:pPr>
         <w:pStyle w:val="Heading3"/>
@@ -6785,7 +7469,7 @@
       <w:pPr>
         <w:numPr>
           <w:ilvl w:val="0"/>
-          <w:numId w:val="1050"/>
+          <w:numId w:val="1058"/>
         </w:numPr>
         <w:pStyle w:val="Compact"/>
       </w:pPr>
@@ -6797,7 +7481,7 @@
       <w:pPr>
         <w:numPr>
           <w:ilvl w:val="1"/>
-          <w:numId w:val="1051"/>
+          <w:numId w:val="1059"/>
         </w:numPr>
         <w:pStyle w:val="Compact"/>
       </w:pPr>
@@ -6809,7 +7493,7 @@
       <w:pPr>
         <w:numPr>
           <w:ilvl w:val="1"/>
-          <w:numId w:val="1051"/>
+          <w:numId w:val="1059"/>
         </w:numPr>
         <w:pStyle w:val="Compact"/>
       </w:pPr>
@@ -6821,7 +7505,7 @@
       <w:pPr>
         <w:numPr>
           <w:ilvl w:val="1"/>
-          <w:numId w:val="1051"/>
+          <w:numId w:val="1059"/>
         </w:numPr>
         <w:pStyle w:val="Compact"/>
       </w:pPr>
@@ -6833,7 +7517,7 @@
       <w:pPr>
         <w:numPr>
           <w:ilvl w:val="0"/>
-          <w:numId w:val="1050"/>
+          <w:numId w:val="1058"/>
         </w:numPr>
         <w:pStyle w:val="Compact"/>
       </w:pPr>
@@ -6845,16 +7529,28 @@
       <w:pPr>
         <w:numPr>
           <w:ilvl w:val="0"/>
-          <w:numId w:val="1050"/>
-        </w:numPr>
-        <w:pStyle w:val="Compact"/>
-      </w:pPr>
-      <w:r>
-        <w:t xml:space="preserve">把当前 10 个模板词条与前端挑战词表做明确映射，避免用户选择无模板词后误解评分结果。</w:t>
-      </w:r>
-    </w:p>
-    <w:bookmarkEnd w:id="54"/>
-    <w:bookmarkStart w:id="55" w:name="中期"/>
+          <w:numId w:val="1058"/>
+        </w:numPr>
+        <w:pStyle w:val="Compact"/>
+      </w:pPr>
+      <w:r>
+        <w:t xml:space="preserve">扩展模板数据库，让更多学习词从“待上线”转为可评分。</w:t>
+      </w:r>
+    </w:p>
+    <w:p>
+      <w:pPr>
+        <w:numPr>
+          <w:ilvl w:val="0"/>
+          <w:numId w:val="1058"/>
+        </w:numPr>
+        <w:pStyle w:val="Compact"/>
+      </w:pPr>
+      <w:r>
+        <w:t xml:space="preserve">给暂无专属动画的词逐步补充 Canvas 示范动画或视频示范素材。</w:t>
+      </w:r>
+    </w:p>
+    <w:bookmarkEnd w:id="56"/>
+    <w:bookmarkStart w:id="57" w:name="中期"/>
     <w:p>
       <w:pPr>
         <w:pStyle w:val="Heading3"/>
@@ -6867,7 +7563,7 @@
       <w:pPr>
         <w:numPr>
           <w:ilvl w:val="0"/>
-          <w:numId w:val="1052"/>
+          <w:numId w:val="1060"/>
         </w:numPr>
         <w:pStyle w:val="Compact"/>
       </w:pPr>
@@ -6894,7 +7590,7 @@
       <w:pPr>
         <w:numPr>
           <w:ilvl w:val="1"/>
-          <w:numId w:val="1053"/>
+          <w:numId w:val="1061"/>
         </w:numPr>
         <w:pStyle w:val="Compact"/>
       </w:pPr>
@@ -6909,7 +7605,7 @@
       <w:pPr>
         <w:numPr>
           <w:ilvl w:val="1"/>
-          <w:numId w:val="1053"/>
+          <w:numId w:val="1061"/>
         </w:numPr>
         <w:pStyle w:val="Compact"/>
       </w:pPr>
@@ -6921,7 +7617,7 @@
       <w:pPr>
         <w:numPr>
           <w:ilvl w:val="1"/>
-          <w:numId w:val="1053"/>
+          <w:numId w:val="1061"/>
         </w:numPr>
         <w:pStyle w:val="Compact"/>
       </w:pPr>
@@ -6933,7 +7629,7 @@
       <w:pPr>
         <w:numPr>
           <w:ilvl w:val="1"/>
-          <w:numId w:val="1053"/>
+          <w:numId w:val="1061"/>
         </w:numPr>
         <w:pStyle w:val="Compact"/>
       </w:pPr>
@@ -6945,7 +7641,7 @@
       <w:pPr>
         <w:numPr>
           <w:ilvl w:val="1"/>
-          <w:numId w:val="1053"/>
+          <w:numId w:val="1061"/>
         </w:numPr>
         <w:pStyle w:val="Compact"/>
       </w:pPr>
@@ -6957,7 +7653,7 @@
       <w:pPr>
         <w:numPr>
           <w:ilvl w:val="0"/>
-          <w:numId w:val="1052"/>
+          <w:numId w:val="1060"/>
         </w:numPr>
         <w:pStyle w:val="Compact"/>
       </w:pPr>
@@ -6969,7 +7665,7 @@
       <w:pPr>
         <w:numPr>
           <w:ilvl w:val="0"/>
-          <w:numId w:val="1052"/>
+          <w:numId w:val="1060"/>
         </w:numPr>
         <w:pStyle w:val="Compact"/>
       </w:pPr>
@@ -6981,7 +7677,7 @@
       <w:pPr>
         <w:numPr>
           <w:ilvl w:val="0"/>
-          <w:numId w:val="1052"/>
+          <w:numId w:val="1060"/>
         </w:numPr>
         <w:pStyle w:val="Compact"/>
       </w:pPr>
@@ -6989,8 +7685,8 @@
         <w:t xml:space="preserve">建立标准动作模板版本号，报告中显示当前模板版本。</w:t>
       </w:r>
     </w:p>
-    <w:bookmarkEnd w:id="55"/>
-    <w:bookmarkStart w:id="56" w:name="长期"/>
+    <w:bookmarkEnd w:id="57"/>
+    <w:bookmarkStart w:id="58" w:name="长期"/>
     <w:p>
       <w:pPr>
         <w:pStyle w:val="Heading3"/>
@@ -7003,7 +7699,7 @@
       <w:pPr>
         <w:numPr>
           <w:ilvl w:val="0"/>
-          <w:numId w:val="1054"/>
+          <w:numId w:val="1062"/>
         </w:numPr>
         <w:pStyle w:val="Compact"/>
       </w:pPr>
@@ -7015,7 +7711,7 @@
       <w:pPr>
         <w:numPr>
           <w:ilvl w:val="0"/>
-          <w:numId w:val="1054"/>
+          <w:numId w:val="1062"/>
         </w:numPr>
         <w:pStyle w:val="Compact"/>
       </w:pPr>
@@ -7027,7 +7723,7 @@
       <w:pPr>
         <w:numPr>
           <w:ilvl w:val="0"/>
-          <w:numId w:val="1054"/>
+          <w:numId w:val="1062"/>
         </w:numPr>
         <w:pStyle w:val="Compact"/>
       </w:pPr>
@@ -7039,7 +7735,7 @@
       <w:pPr>
         <w:numPr>
           <w:ilvl w:val="0"/>
-          <w:numId w:val="1054"/>
+          <w:numId w:val="1062"/>
         </w:numPr>
         <w:pStyle w:val="Compact"/>
       </w:pPr>
@@ -7047,9 +7743,9 @@
         <w:t xml:space="preserve">如果后续有正式测评/排行榜需求，保留后端权威评分与日志审计。</w:t>
       </w:r>
     </w:p>
-    <w:bookmarkEnd w:id="56"/>
-    <w:bookmarkEnd w:id="57"/>
-    <w:bookmarkStart w:id="64" w:name="附录常用验证命令"/>
+    <w:bookmarkEnd w:id="58"/>
+    <w:bookmarkEnd w:id="59"/>
+    <w:bookmarkStart w:id="66" w:name="附录常用验证命令"/>
     <w:p>
       <w:pPr>
         <w:pStyle w:val="Heading2"/>
@@ -7058,7 +7754,7 @@
         <w:t xml:space="preserve">12. 附录：常用验证命令</w:t>
       </w:r>
     </w:p>
-    <w:bookmarkStart w:id="58" w:name="github-pages"/>
+    <w:bookmarkStart w:id="60" w:name="github-pages"/>
     <w:p>
       <w:pPr>
         <w:pStyle w:val="Heading3"/>
@@ -7141,8 +7837,8 @@
         <w:t xml:space="preserve">'scoring-capture-fps|scoring-frame-width'</w:t>
       </w:r>
     </w:p>
-    <w:bookmarkEnd w:id="58"/>
-    <w:bookmarkStart w:id="59" w:name="full-api-health"/>
+    <w:bookmarkEnd w:id="60"/>
+    <w:bookmarkStart w:id="61" w:name="full-api-health"/>
     <w:p>
       <w:pPr>
         <w:pStyle w:val="Heading3"/>
@@ -7180,8 +7876,8 @@
         <w:t xml:space="preserve"> https://scottwyc-sign-language-universe.ms.show/api/scoring/health</w:t>
       </w:r>
     </w:p>
-    <w:bookmarkEnd w:id="59"/>
-    <w:bookmarkStart w:id="60" w:name="lite-api-health"/>
+    <w:bookmarkEnd w:id="61"/>
+    <w:bookmarkStart w:id="62" w:name="lite-api-health"/>
     <w:p>
       <w:pPr>
         <w:pStyle w:val="Heading3"/>
@@ -7219,8 +7915,8 @@
         <w:t xml:space="preserve"> https://scottwyc-sign-language-universe-lite.ms.show/api/scoring/health</w:t>
       </w:r>
     </w:p>
-    <w:bookmarkEnd w:id="60"/>
-    <w:bookmarkStart w:id="61" w:name="lite-api-templates"/>
+    <w:bookmarkEnd w:id="62"/>
+    <w:bookmarkStart w:id="63" w:name="lite-api-templates"/>
     <w:p>
       <w:pPr>
         <w:pStyle w:val="Heading3"/>
@@ -7258,8 +7954,8 @@
         <w:t xml:space="preserve"> https://scottwyc-sign-language-universe-lite.ms.show/api/scoring/templates</w:t>
       </w:r>
     </w:p>
-    <w:bookmarkEnd w:id="61"/>
-    <w:bookmarkStart w:id="62" w:name="github-actions"/>
+    <w:bookmarkEnd w:id="63"/>
+    <w:bookmarkStart w:id="64" w:name="github-actions"/>
     <w:p>
       <w:pPr>
         <w:pStyle w:val="Heading3"/>
@@ -7297,8 +7993,8 @@
         <w:t xml:space="preserve"> 5</w:t>
       </w:r>
     </w:p>
-    <w:bookmarkEnd w:id="62"/>
-    <w:bookmarkStart w:id="63" w:name="modelscope-日志"/>
+    <w:bookmarkEnd w:id="64"/>
+    <w:bookmarkStart w:id="65" w:name="modelscope-日志"/>
     <w:p>
       <w:pPr>
         <w:pStyle w:val="Heading3"/>
@@ -7628,9 +8324,9 @@
         <w:t xml:space="preserve">，当前 CLI 路径下该参数不可用。</w:t>
       </w:r>
     </w:p>
-    <w:bookmarkEnd w:id="63"/>
-    <w:bookmarkEnd w:id="64"/>
     <w:bookmarkEnd w:id="65"/>
+    <w:bookmarkEnd w:id="66"/>
+    <w:bookmarkEnd w:id="67"/>
     <w:sectPr/>
   </w:body>
 </w:document>
@@ -8076,34 +8772,7 @@
     <w:abstractNumId w:val="991"/>
   </w:num>
   <w:num w:numId="1041">
-    <w:abstractNumId w:val="99411"/>
-    <w:lvlOverride w:ilvl="0">
-      <w:startOverride w:val="1"/>
-    </w:lvlOverride>
-    <w:lvlOverride w:ilvl="1">
-      <w:startOverride w:val="1"/>
-    </w:lvlOverride>
-    <w:lvlOverride w:ilvl="2">
-      <w:startOverride w:val="1"/>
-    </w:lvlOverride>
-    <w:lvlOverride w:ilvl="3">
-      <w:startOverride w:val="1"/>
-    </w:lvlOverride>
-    <w:lvlOverride w:ilvl="4">
-      <w:startOverride w:val="1"/>
-    </w:lvlOverride>
-    <w:lvlOverride w:ilvl="5">
-      <w:startOverride w:val="1"/>
-    </w:lvlOverride>
-    <w:lvlOverride w:ilvl="6">
-      <w:startOverride w:val="1"/>
-    </w:lvlOverride>
-    <w:lvlOverride w:ilvl="7">
-      <w:startOverride w:val="1"/>
-    </w:lvlOverride>
-    <w:lvlOverride w:ilvl="8">
-      <w:startOverride w:val="1"/>
-    </w:lvlOverride>
+    <w:abstractNumId w:val="991"/>
   </w:num>
   <w:num w:numId="1042">
     <w:abstractNumId w:val="991"/>
@@ -8169,6 +8838,57 @@
     <w:abstractNumId w:val="991"/>
   </w:num>
   <w:num w:numId="1054">
+    <w:abstractNumId w:val="991"/>
+  </w:num>
+  <w:num w:numId="1055">
+    <w:abstractNumId w:val="991"/>
+  </w:num>
+  <w:num w:numId="1056">
+    <w:abstractNumId w:val="991"/>
+  </w:num>
+  <w:num w:numId="1057">
+    <w:abstractNumId w:val="99411"/>
+    <w:lvlOverride w:ilvl="0">
+      <w:startOverride w:val="1"/>
+    </w:lvlOverride>
+    <w:lvlOverride w:ilvl="1">
+      <w:startOverride w:val="1"/>
+    </w:lvlOverride>
+    <w:lvlOverride w:ilvl="2">
+      <w:startOverride w:val="1"/>
+    </w:lvlOverride>
+    <w:lvlOverride w:ilvl="3">
+      <w:startOverride w:val="1"/>
+    </w:lvlOverride>
+    <w:lvlOverride w:ilvl="4">
+      <w:startOverride w:val="1"/>
+    </w:lvlOverride>
+    <w:lvlOverride w:ilvl="5">
+      <w:startOverride w:val="1"/>
+    </w:lvlOverride>
+    <w:lvlOverride w:ilvl="6">
+      <w:startOverride w:val="1"/>
+    </w:lvlOverride>
+    <w:lvlOverride w:ilvl="7">
+      <w:startOverride w:val="1"/>
+    </w:lvlOverride>
+    <w:lvlOverride w:ilvl="8">
+      <w:startOverride w:val="1"/>
+    </w:lvlOverride>
+  </w:num>
+  <w:num w:numId="1058">
+    <w:abstractNumId w:val="991"/>
+  </w:num>
+  <w:num w:numId="1059">
+    <w:abstractNumId w:val="991"/>
+  </w:num>
+  <w:num w:numId="1060">
+    <w:abstractNumId w:val="991"/>
+  </w:num>
+  <w:num w:numId="1061">
+    <w:abstractNumId w:val="991"/>
+  </w:num>
+  <w:num w:numId="1062">
     <w:abstractNumId w:val="991"/>
   </w:num>
 </w:numbering>

</xml_diff>

<commit_message>
docs: finalize report for challenge flow update
</commit_message>
<xml_diff>
--- a/docs/reports/recent_frontend_backend_modelscope_report_20260612.docx
+++ b/docs/reports/recent_frontend_backend_modelscope_report_20260612.docx
@@ -1381,13 +1381,66 @@
           </w:p>
         </w:tc>
       </w:tr>
+      <w:tr>
+        <w:tc>
+          <w:tcPr/>
+          <w:p>
+            <w:pPr>
+              <w:pStyle w:val="Compact"/>
+              <w:jc w:val="right"/>
+            </w:pPr>
+            <w:r>
+              <w:t xml:space="preserve">#25</w:t>
+            </w:r>
+          </w:p>
+        </w:tc>
+        <w:tc>
+          <w:tcPr/>
+          <w:p>
+            <w:pPr>
+              <w:pStyle w:val="Compact"/>
+              <w:jc w:val="left"/>
+            </w:pPr>
+            <w:r>
+              <w:rPr>
+                <w:rStyle w:val="VerbatimChar"/>
+              </w:rPr>
+              <w:t xml:space="preserve">cb18fdc</w:t>
+            </w:r>
+          </w:p>
+        </w:tc>
+        <w:tc>
+          <w:tcPr/>
+          <w:p>
+            <w:pPr>
+              <w:pStyle w:val="Compact"/>
+              <w:jc w:val="left"/>
+            </w:pPr>
+            <w:r>
+              <w:t xml:space="preserve">默认 Web Holistic lite 打分流程并优化挑战前端</w:t>
+            </w:r>
+          </w:p>
+        </w:tc>
+        <w:tc>
+          <w:tcPr/>
+          <w:p>
+            <w:pPr>
+              <w:pStyle w:val="Compact"/>
+              <w:jc w:val="left"/>
+            </w:pPr>
+            <w:r>
+              <w:t xml:space="preserve">统一默认方案、挑战词表覆盖 47 个学习词、日间模式、音效、OpenAPI 和文档同步</w:t>
+            </w:r>
+          </w:p>
+        </w:tc>
+      </w:tr>
     </w:tbl>
     <w:p>
       <w:pPr>
         <w:pStyle w:val="BodyText"/>
       </w:pPr>
       <w:r>
-        <w:t xml:space="preserve">截至本报告上一次 main 合并验证的最新实现提交：</w:t>
+        <w:t xml:space="preserve">截至本报告本次更新覆盖的最新 main 实现提交：</w:t>
       </w:r>
     </w:p>
     <w:p>
@@ -1398,7 +1451,7 @@
         <w:rPr>
           <w:rStyle w:val="VerbatimChar"/>
         </w:rPr>
-        <w:t xml:space="preserve">b758340 Merge pull request #23 from sign-language-universe/feat/web-holistic-retry</w:t>
+        <w:t xml:space="preserve">cb18fdc 默认 Web Holistic lite 打分流程并优化挑战前端</w:t>
       </w:r>
     </w:p>
     <w:p>
@@ -1406,7 +1459,7 @@
         <w:pStyle w:val="FirstParagraph"/>
       </w:pPr>
       <w:r>
-        <w:t xml:space="preserve">本次报告还覆盖当前工作分支新增的挑战词表全覆盖、模板待上线提示、日间/夜间模式、音效、OpenAPI 契约和默认方案文档更新；这些内容会在本分支 PR 合并后进入</w:t>
+        <w:t xml:space="preserve">PR #25 已将挑战词表全覆盖、模板待上线提示、日间/夜间模式、音效、OpenAPI 契约和默认方案文档更新合并进入</w:t>
       </w:r>
       <w:r>
         <w:t xml:space="preserve"> </w:t>

</xml_diff>